<commit_message>
Paper: add the guide as first author, fill in emails, drop ordinals
Co-Authored-By: Claude Sonnet 5.5 <noreply@anthropic.com>
</commit_message>
<xml_diff>
--- a/paper/paper.docx
+++ b/paper/paper.docx
@@ -25,9 +25,12 @@
         <w:tblLook w:firstColumn="1" w:firstRow="1" w:lastColumn="0" w:lastRow="0" w:noHBand="0" w:noVBand="1" w:val="04A0"/>
       </w:tblPr>
       <w:tblGrid>
-        <w:gridCol w:w="3381"/>
-        <w:gridCol w:w="3381"/>
-        <w:gridCol w:w="3381"/>
+        <w:gridCol w:w="1690"/>
+        <w:gridCol w:w="1690"/>
+        <w:gridCol w:w="1690"/>
+        <w:gridCol w:w="1690"/>
+        <w:gridCol w:w="1690"/>
+        <w:gridCol w:w="1690"/>
       </w:tblGrid>
       <w:tr>
         <w:trPr>
@@ -36,6 +39,7 @@
         <w:tc>
           <w:tcPr>
             <w:tcW w:type="dxa" w:w="3360"/>
+            <w:gridSpan w:val="2"/>
           </w:tcPr>
           <w:p>
             <w:pPr>
@@ -47,22 +51,7 @@
                 <w:rFonts w:ascii="Times New Roman" w:hAnsi="Times New Roman"/>
                 <w:sz w:val="18"/>
               </w:rPr>
-              <w:t>1</w:t>
-            </w:r>
-            <w:r>
-              <w:rPr>
-                <w:rFonts w:ascii="Times New Roman" w:hAnsi="Times New Roman"/>
-                <w:sz w:val="18"/>
-                <w:vertAlign w:val="superscript"/>
-              </w:rPr>
-              <w:t>st</w:t>
-            </w:r>
-            <w:r>
-              <w:rPr>
-                <w:rFonts w:ascii="Times New Roman" w:hAnsi="Times New Roman"/>
-                <w:sz w:val="18"/>
-              </w:rPr>
-              <w:t xml:space="preserve"> Divyanshu Gajbhiye</w:t>
+              <w:t>Prof. Dr. Premanand P. Ghadekar</w:t>
             </w:r>
           </w:p>
           <w:p>
@@ -114,13 +103,14 @@
                 <w:rFonts w:ascii="Times New Roman" w:hAnsi="Times New Roman"/>
                 <w:sz w:val="18"/>
               </w:rPr>
-              <w:t>[email to add]</w:t>
+              <w:t>premanand.ghadekar@vit.edu</w:t>
             </w:r>
           </w:p>
         </w:tc>
         <w:tc>
           <w:tcPr>
             <w:tcW w:type="dxa" w:w="3360"/>
+            <w:gridSpan w:val="2"/>
           </w:tcPr>
           <w:p>
             <w:pPr>
@@ -132,22 +122,7 @@
                 <w:rFonts w:ascii="Times New Roman" w:hAnsi="Times New Roman"/>
                 <w:sz w:val="18"/>
               </w:rPr>
-              <w:t>2</w:t>
-            </w:r>
-            <w:r>
-              <w:rPr>
-                <w:rFonts w:ascii="Times New Roman" w:hAnsi="Times New Roman"/>
-                <w:sz w:val="18"/>
-                <w:vertAlign w:val="superscript"/>
-              </w:rPr>
-              <w:t>nd</w:t>
-            </w:r>
-            <w:r>
-              <w:rPr>
-                <w:rFonts w:ascii="Times New Roman" w:hAnsi="Times New Roman"/>
-                <w:sz w:val="18"/>
-              </w:rPr>
-              <w:t xml:space="preserve"> Vidhi Hadoltikar</w:t>
+              <w:t>Divyanshu Gajbhiye</w:t>
             </w:r>
           </w:p>
           <w:p>
@@ -199,13 +174,14 @@
                 <w:rFonts w:ascii="Times New Roman" w:hAnsi="Times New Roman"/>
                 <w:sz w:val="18"/>
               </w:rPr>
-              <w:t>[email to add]</w:t>
+              <w:t>divyanshu.gajbhiye24@vit.edu</w:t>
             </w:r>
           </w:p>
         </w:tc>
         <w:tc>
           <w:tcPr>
             <w:tcW w:type="dxa" w:w="3360"/>
+            <w:gridSpan w:val="2"/>
           </w:tcPr>
           <w:p>
             <w:pPr>
@@ -217,22 +193,86 @@
                 <w:rFonts w:ascii="Times New Roman" w:hAnsi="Times New Roman"/>
                 <w:sz w:val="18"/>
               </w:rPr>
-              <w:t>3</w:t>
+              <w:t>Vidhi Hadoltikar</w:t>
             </w:r>
-            <w:r>
-              <w:rPr>
-                <w:rFonts w:ascii="Times New Roman" w:hAnsi="Times New Roman"/>
-                <w:sz w:val="18"/>
-                <w:vertAlign w:val="superscript"/>
-              </w:rPr>
-              <w:t>rd</w:t>
-            </w:r>
+          </w:p>
+          <w:p>
+            <w:pPr>
+              <w:spacing w:before="0" w:after="0"/>
+              <w:jc w:val="center"/>
+            </w:pPr>
             <w:r>
               <w:rPr>
                 <w:rFonts w:ascii="Times New Roman" w:hAnsi="Times New Roman"/>
                 <w:sz w:val="18"/>
               </w:rPr>
-              <w:t xml:space="preserve"> Harshvardhan Rawat</w:t>
+              <w:t>CSE (AI&amp;ML)</w:t>
+            </w:r>
+          </w:p>
+          <w:p>
+            <w:pPr>
+              <w:spacing w:before="0" w:after="0"/>
+              <w:jc w:val="center"/>
+            </w:pPr>
+            <w:r>
+              <w:rPr>
+                <w:rFonts w:ascii="Times New Roman" w:hAnsi="Times New Roman"/>
+                <w:sz w:val="18"/>
+              </w:rPr>
+              <w:t>Vishwakarma Institute of Technology</w:t>
+            </w:r>
+          </w:p>
+          <w:p>
+            <w:pPr>
+              <w:spacing w:before="0" w:after="0"/>
+              <w:jc w:val="center"/>
+            </w:pPr>
+            <w:r>
+              <w:rPr>
+                <w:rFonts w:ascii="Times New Roman" w:hAnsi="Times New Roman"/>
+                <w:sz w:val="18"/>
+              </w:rPr>
+              <w:t>Pune, India</w:t>
+            </w:r>
+          </w:p>
+          <w:p>
+            <w:pPr>
+              <w:spacing w:before="0" w:after="0"/>
+              <w:jc w:val="center"/>
+            </w:pPr>
+            <w:r>
+              <w:rPr>
+                <w:rFonts w:ascii="Times New Roman" w:hAnsi="Times New Roman"/>
+                <w:sz w:val="18"/>
+              </w:rPr>
+              <w:t>vidhi.hadoltikar24@vit.edu</w:t>
+            </w:r>
+          </w:p>
+        </w:tc>
+      </w:tr>
+      <w:tr>
+        <w:tc>
+          <w:tcPr>
+            <w:tcW w:type="dxa" w:w="1680"/>
+          </w:tcPr>
+          <w:p/>
+        </w:tc>
+        <w:tc>
+          <w:tcPr>
+            <w:tcW w:type="dxa" w:w="3360"/>
+            <w:gridSpan w:val="2"/>
+          </w:tcPr>
+          <w:p>
+            <w:pPr>
+              <w:spacing w:after="0"/>
+              <w:jc w:val="center"/>
+            </w:pPr>
+            <w:r>
+              <w:rPr>
+                <w:rFonts w:ascii="Times New Roman" w:hAnsi="Times New Roman"/>
+                <w:sz w:val="18"/>
+              </w:rPr>
+              <w:t>Harshvardhan Rawat</w:t>
             </w:r>
           </w:p>
           <w:p>
@@ -288,21 +328,10 @@
             </w:r>
           </w:p>
         </w:tc>
-      </w:tr>
-      <w:tr>
-        <w:tc>
-          <w:tcPr>
-            <w:tcW w:type="dxa" w:w="3381"/>
-          </w:tcPr>
-          <w:p>
-            <w:pPr>
-              <w:spacing w:after="0"/>
-            </w:pPr>
-          </w:p>
-        </w:tc>
         <w:tc>
           <w:tcPr>
             <w:tcW w:type="dxa" w:w="3360"/>
+            <w:gridSpan w:val="2"/>
           </w:tcPr>
           <w:p>
             <w:pPr>
@@ -314,22 +343,7 @@
                 <w:rFonts w:ascii="Times New Roman" w:hAnsi="Times New Roman"/>
                 <w:sz w:val="18"/>
               </w:rPr>
-              <w:t>4</w:t>
-            </w:r>
-            <w:r>
-              <w:rPr>
-                <w:rFonts w:ascii="Times New Roman" w:hAnsi="Times New Roman"/>
-                <w:sz w:val="18"/>
-                <w:vertAlign w:val="superscript"/>
-              </w:rPr>
-              <w:t>th</w:t>
-            </w:r>
-            <w:r>
-              <w:rPr>
-                <w:rFonts w:ascii="Times New Roman" w:hAnsi="Times New Roman"/>
-                <w:sz w:val="18"/>
-              </w:rPr>
-              <w:t xml:space="preserve"> Nirmit Hatti</w:t>
+              <w:t>Nirmit Hatti</w:t>
             </w:r>
           </w:p>
           <w:p>
@@ -387,13 +401,9 @@
         </w:tc>
         <w:tc>
           <w:tcPr>
-            <w:tcW w:type="dxa" w:w="3381"/>
+            <w:tcW w:type="dxa" w:w="1680"/>
           </w:tcPr>
-          <w:p>
-            <w:pPr>
-              <w:spacing w:after="0"/>
-            </w:pPr>
-          </w:p>
+          <w:p/>
         </w:tc>
       </w:tr>
     </w:tbl>

</xml_diff>

<commit_message>
Paper: slimmer fixed-width tables that stay inside the column
Co-Authored-By: Claude Sonnet 5.5 <noreply@anthropic.com>
</commit_message>
<xml_diff>
--- a/paper/paper.docx
+++ b/paper/paper.docx
@@ -1199,7 +1199,6 @@
     </w:p>
     <w:tbl>
       <w:tblPr>
-        <w:tblW w:type="auto" w:w="0"/>
         <w:jc w:val="center"/>
         <w:tblLayout w:type="fixed"/>
         <w:tblLook w:firstColumn="1" w:firstRow="1" w:lastColumn="0" w:lastRow="0" w:noHBand="0" w:noVBand="1" w:val="04A0"/>
@@ -1207,16 +1206,17 @@
           <w:left w:w="60" w:type="dxa"/>
           <w:right w:w="60" w:type="dxa"/>
         </w:tblCellMar>
+        <w:tblW w:w="4640" w:type="dxa"/>
       </w:tblPr>
       <w:tblGrid>
-        <w:gridCol w:w="3381"/>
-        <w:gridCol w:w="3381"/>
-        <w:gridCol w:w="3381"/>
+        <w:gridCol w:w="3167"/>
+        <w:gridCol w:w="737"/>
+        <w:gridCol w:w="737"/>
       </w:tblGrid>
       <w:tr>
         <w:tc>
           <w:tcPr>
-            <w:tcW w:type="dxa" w:w="3344"/>
+            <w:tcW w:type="dxa" w:w="3167"/>
             <w:tcBorders>
               <w:top w:val="single" w:sz="4" w:color="000000"/>
               <w:left w:val="single" w:sz="4" w:color="000000"/>
@@ -1242,7 +1242,7 @@
         </w:tc>
         <w:tc>
           <w:tcPr>
-            <w:tcW w:type="dxa" w:w="778"/>
+            <w:tcW w:type="dxa" w:w="737"/>
             <w:tcBorders>
               <w:top w:val="single" w:sz="4" w:color="000000"/>
               <w:left w:val="single" w:sz="4" w:color="000000"/>
@@ -1268,7 +1268,7 @@
         </w:tc>
         <w:tc>
           <w:tcPr>
-            <w:tcW w:type="dxa" w:w="778"/>
+            <w:tcW w:type="dxa" w:w="737"/>
             <w:tcBorders>
               <w:top w:val="single" w:sz="4" w:color="000000"/>
               <w:left w:val="single" w:sz="4" w:color="000000"/>
@@ -1296,7 +1296,7 @@
       <w:tr>
         <w:tc>
           <w:tcPr>
-            <w:tcW w:type="dxa" w:w="3344"/>
+            <w:tcW w:type="dxa" w:w="3167"/>
             <w:tcBorders>
               <w:top w:val="single" w:sz="4" w:color="000000"/>
               <w:left w:val="single" w:sz="4" w:color="000000"/>
@@ -1321,7 +1321,7 @@
         </w:tc>
         <w:tc>
           <w:tcPr>
-            <w:tcW w:type="dxa" w:w="778"/>
+            <w:tcW w:type="dxa" w:w="737"/>
             <w:tcBorders>
               <w:top w:val="single" w:sz="4" w:color="000000"/>
               <w:left w:val="single" w:sz="4" w:color="000000"/>
@@ -1346,7 +1346,7 @@
         </w:tc>
         <w:tc>
           <w:tcPr>
-            <w:tcW w:type="dxa" w:w="778"/>
+            <w:tcW w:type="dxa" w:w="737"/>
             <w:tcBorders>
               <w:top w:val="single" w:sz="4" w:color="000000"/>
               <w:left w:val="single" w:sz="4" w:color="000000"/>
@@ -1373,7 +1373,7 @@
       <w:tr>
         <w:tc>
           <w:tcPr>
-            <w:tcW w:type="dxa" w:w="3344"/>
+            <w:tcW w:type="dxa" w:w="3167"/>
             <w:tcBorders>
               <w:top w:val="single" w:sz="4" w:color="000000"/>
               <w:left w:val="single" w:sz="4" w:color="000000"/>
@@ -1398,7 +1398,7 @@
         </w:tc>
         <w:tc>
           <w:tcPr>
-            <w:tcW w:type="dxa" w:w="778"/>
+            <w:tcW w:type="dxa" w:w="737"/>
             <w:tcBorders>
               <w:top w:val="single" w:sz="4" w:color="000000"/>
               <w:left w:val="single" w:sz="4" w:color="000000"/>
@@ -1423,7 +1423,7 @@
         </w:tc>
         <w:tc>
           <w:tcPr>
-            <w:tcW w:type="dxa" w:w="778"/>
+            <w:tcW w:type="dxa" w:w="737"/>
             <w:tcBorders>
               <w:top w:val="single" w:sz="4" w:color="000000"/>
               <w:left w:val="single" w:sz="4" w:color="000000"/>
@@ -1450,7 +1450,7 @@
       <w:tr>
         <w:tc>
           <w:tcPr>
-            <w:tcW w:type="dxa" w:w="3344"/>
+            <w:tcW w:type="dxa" w:w="3167"/>
             <w:tcBorders>
               <w:top w:val="single" w:sz="4" w:color="000000"/>
               <w:left w:val="single" w:sz="4" w:color="000000"/>
@@ -1475,7 +1475,7 @@
         </w:tc>
         <w:tc>
           <w:tcPr>
-            <w:tcW w:type="dxa" w:w="778"/>
+            <w:tcW w:type="dxa" w:w="737"/>
             <w:tcBorders>
               <w:top w:val="single" w:sz="4" w:color="000000"/>
               <w:left w:val="single" w:sz="4" w:color="000000"/>
@@ -1500,7 +1500,7 @@
         </w:tc>
         <w:tc>
           <w:tcPr>
-            <w:tcW w:type="dxa" w:w="778"/>
+            <w:tcW w:type="dxa" w:w="737"/>
             <w:tcBorders>
               <w:top w:val="single" w:sz="4" w:color="000000"/>
               <w:left w:val="single" w:sz="4" w:color="000000"/>
@@ -1527,7 +1527,7 @@
       <w:tr>
         <w:tc>
           <w:tcPr>
-            <w:tcW w:type="dxa" w:w="3344"/>
+            <w:tcW w:type="dxa" w:w="3167"/>
             <w:tcBorders>
               <w:top w:val="single" w:sz="4" w:color="000000"/>
               <w:left w:val="single" w:sz="4" w:color="000000"/>
@@ -1552,7 +1552,7 @@
         </w:tc>
         <w:tc>
           <w:tcPr>
-            <w:tcW w:type="dxa" w:w="778"/>
+            <w:tcW w:type="dxa" w:w="737"/>
             <w:tcBorders>
               <w:top w:val="single" w:sz="4" w:color="000000"/>
               <w:left w:val="single" w:sz="4" w:color="000000"/>
@@ -1577,7 +1577,7 @@
         </w:tc>
         <w:tc>
           <w:tcPr>
-            <w:tcW w:type="dxa" w:w="778"/>
+            <w:tcW w:type="dxa" w:w="737"/>
             <w:tcBorders>
               <w:top w:val="single" w:sz="4" w:color="000000"/>
               <w:left w:val="single" w:sz="4" w:color="000000"/>
@@ -1604,7 +1604,7 @@
       <w:tr>
         <w:tc>
           <w:tcPr>
-            <w:tcW w:type="dxa" w:w="3344"/>
+            <w:tcW w:type="dxa" w:w="3167"/>
             <w:tcBorders>
               <w:top w:val="single" w:sz="4" w:color="000000"/>
               <w:left w:val="single" w:sz="4" w:color="000000"/>
@@ -1629,7 +1629,7 @@
         </w:tc>
         <w:tc>
           <w:tcPr>
-            <w:tcW w:type="dxa" w:w="778"/>
+            <w:tcW w:type="dxa" w:w="737"/>
             <w:tcBorders>
               <w:top w:val="single" w:sz="4" w:color="000000"/>
               <w:left w:val="single" w:sz="4" w:color="000000"/>
@@ -1654,7 +1654,7 @@
         </w:tc>
         <w:tc>
           <w:tcPr>
-            <w:tcW w:type="dxa" w:w="778"/>
+            <w:tcW w:type="dxa" w:w="737"/>
             <w:tcBorders>
               <w:top w:val="single" w:sz="4" w:color="000000"/>
               <w:left w:val="single" w:sz="4" w:color="000000"/>
@@ -1681,7 +1681,7 @@
       <w:tr>
         <w:tc>
           <w:tcPr>
-            <w:tcW w:type="dxa" w:w="3344"/>
+            <w:tcW w:type="dxa" w:w="3167"/>
             <w:tcBorders>
               <w:top w:val="single" w:sz="4" w:color="000000"/>
               <w:left w:val="single" w:sz="4" w:color="000000"/>
@@ -1706,7 +1706,7 @@
         </w:tc>
         <w:tc>
           <w:tcPr>
-            <w:tcW w:type="dxa" w:w="778"/>
+            <w:tcW w:type="dxa" w:w="737"/>
             <w:tcBorders>
               <w:top w:val="single" w:sz="4" w:color="000000"/>
               <w:left w:val="single" w:sz="4" w:color="000000"/>
@@ -1731,7 +1731,7 @@
         </w:tc>
         <w:tc>
           <w:tcPr>
-            <w:tcW w:type="dxa" w:w="778"/>
+            <w:tcW w:type="dxa" w:w="737"/>
             <w:tcBorders>
               <w:top w:val="single" w:sz="4" w:color="000000"/>
               <w:left w:val="single" w:sz="4" w:color="000000"/>
@@ -1820,7 +1820,6 @@
     </w:p>
     <w:tbl>
       <w:tblPr>
-        <w:tblW w:type="auto" w:w="0"/>
         <w:jc w:val="center"/>
         <w:tblLayout w:type="fixed"/>
         <w:tblLook w:firstColumn="1" w:firstRow="1" w:lastColumn="0" w:lastRow="0" w:noHBand="0" w:noVBand="1" w:val="04A0"/>
@@ -1828,16 +1827,17 @@
           <w:left w:w="60" w:type="dxa"/>
           <w:right w:w="60" w:type="dxa"/>
         </w:tblCellMar>
+        <w:tblW w:w="4640" w:type="dxa"/>
       </w:tblPr>
       <w:tblGrid>
-        <w:gridCol w:w="3381"/>
-        <w:gridCol w:w="3381"/>
-        <w:gridCol w:w="3381"/>
+        <w:gridCol w:w="2037"/>
+        <w:gridCol w:w="1471"/>
+        <w:gridCol w:w="1132"/>
       </w:tblGrid>
       <w:tr>
         <w:tc>
           <w:tcPr>
-            <w:tcW w:type="dxa" w:w="2151"/>
+            <w:tcW w:type="dxa" w:w="2037"/>
             <w:tcBorders>
               <w:top w:val="single" w:sz="4" w:color="000000"/>
               <w:left w:val="single" w:sz="4" w:color="000000"/>
@@ -1863,7 +1863,7 @@
         </w:tc>
         <w:tc>
           <w:tcPr>
-            <w:tcW w:type="dxa" w:w="1554"/>
+            <w:tcW w:type="dxa" w:w="1471"/>
             <w:tcBorders>
               <w:top w:val="single" w:sz="4" w:color="000000"/>
               <w:left w:val="single" w:sz="4" w:color="000000"/>
@@ -1889,7 +1889,7 @@
         </w:tc>
         <w:tc>
           <w:tcPr>
-            <w:tcW w:type="dxa" w:w="1195"/>
+            <w:tcW w:type="dxa" w:w="1132"/>
             <w:tcBorders>
               <w:top w:val="single" w:sz="4" w:color="000000"/>
               <w:left w:val="single" w:sz="4" w:color="000000"/>
@@ -1917,7 +1917,7 @@
       <w:tr>
         <w:tc>
           <w:tcPr>
-            <w:tcW w:type="dxa" w:w="2151"/>
+            <w:tcW w:type="dxa" w:w="2037"/>
             <w:tcBorders>
               <w:top w:val="single" w:sz="4" w:color="000000"/>
               <w:left w:val="single" w:sz="4" w:color="000000"/>
@@ -1942,7 +1942,7 @@
         </w:tc>
         <w:tc>
           <w:tcPr>
-            <w:tcW w:type="dxa" w:w="1554"/>
+            <w:tcW w:type="dxa" w:w="1471"/>
             <w:tcBorders>
               <w:top w:val="single" w:sz="4" w:color="000000"/>
               <w:left w:val="single" w:sz="4" w:color="000000"/>
@@ -1967,7 +1967,7 @@
         </w:tc>
         <w:tc>
           <w:tcPr>
-            <w:tcW w:type="dxa" w:w="1195"/>
+            <w:tcW w:type="dxa" w:w="1132"/>
             <w:tcBorders>
               <w:top w:val="single" w:sz="4" w:color="000000"/>
               <w:left w:val="single" w:sz="4" w:color="000000"/>
@@ -1994,7 +1994,7 @@
       <w:tr>
         <w:tc>
           <w:tcPr>
-            <w:tcW w:type="dxa" w:w="2151"/>
+            <w:tcW w:type="dxa" w:w="2037"/>
             <w:tcBorders>
               <w:top w:val="single" w:sz="4" w:color="000000"/>
               <w:left w:val="single" w:sz="4" w:color="000000"/>
@@ -2019,7 +2019,7 @@
         </w:tc>
         <w:tc>
           <w:tcPr>
-            <w:tcW w:type="dxa" w:w="1554"/>
+            <w:tcW w:type="dxa" w:w="1471"/>
             <w:tcBorders>
               <w:top w:val="single" w:sz="4" w:color="000000"/>
               <w:left w:val="single" w:sz="4" w:color="000000"/>
@@ -2044,7 +2044,7 @@
         </w:tc>
         <w:tc>
           <w:tcPr>
-            <w:tcW w:type="dxa" w:w="1195"/>
+            <w:tcW w:type="dxa" w:w="1132"/>
             <w:tcBorders>
               <w:top w:val="single" w:sz="4" w:color="000000"/>
               <w:left w:val="single" w:sz="4" w:color="000000"/>
@@ -2071,7 +2071,7 @@
       <w:tr>
         <w:tc>
           <w:tcPr>
-            <w:tcW w:type="dxa" w:w="2151"/>
+            <w:tcW w:type="dxa" w:w="2037"/>
             <w:tcBorders>
               <w:top w:val="single" w:sz="4" w:color="000000"/>
               <w:left w:val="single" w:sz="4" w:color="000000"/>
@@ -2096,7 +2096,7 @@
         </w:tc>
         <w:tc>
           <w:tcPr>
-            <w:tcW w:type="dxa" w:w="1554"/>
+            <w:tcW w:type="dxa" w:w="1471"/>
             <w:tcBorders>
               <w:top w:val="single" w:sz="4" w:color="000000"/>
               <w:left w:val="single" w:sz="4" w:color="000000"/>
@@ -2121,7 +2121,7 @@
         </w:tc>
         <w:tc>
           <w:tcPr>
-            <w:tcW w:type="dxa" w:w="1195"/>
+            <w:tcW w:type="dxa" w:w="1132"/>
             <w:tcBorders>
               <w:top w:val="single" w:sz="4" w:color="000000"/>
               <w:left w:val="single" w:sz="4" w:color="000000"/>
@@ -2148,7 +2148,7 @@
       <w:tr>
         <w:tc>
           <w:tcPr>
-            <w:tcW w:type="dxa" w:w="2151"/>
+            <w:tcW w:type="dxa" w:w="2037"/>
             <w:tcBorders>
               <w:top w:val="single" w:sz="4" w:color="000000"/>
               <w:left w:val="single" w:sz="4" w:color="000000"/>
@@ -2173,7 +2173,7 @@
         </w:tc>
         <w:tc>
           <w:tcPr>
-            <w:tcW w:type="dxa" w:w="1554"/>
+            <w:tcW w:type="dxa" w:w="1471"/>
             <w:tcBorders>
               <w:top w:val="single" w:sz="4" w:color="000000"/>
               <w:left w:val="single" w:sz="4" w:color="000000"/>
@@ -2198,7 +2198,7 @@
         </w:tc>
         <w:tc>
           <w:tcPr>
-            <w:tcW w:type="dxa" w:w="1195"/>
+            <w:tcW w:type="dxa" w:w="1132"/>
             <w:tcBorders>
               <w:top w:val="single" w:sz="4" w:color="000000"/>
               <w:left w:val="single" w:sz="4" w:color="000000"/>
@@ -2287,7 +2287,6 @@
     </w:p>
     <w:tbl>
       <w:tblPr>
-        <w:tblW w:type="auto" w:w="0"/>
         <w:jc w:val="center"/>
         <w:tblLayout w:type="fixed"/>
         <w:tblLook w:firstColumn="1" w:firstRow="1" w:lastColumn="0" w:lastRow="0" w:noHBand="0" w:noVBand="1" w:val="04A0"/>
@@ -2295,16 +2294,17 @@
           <w:left w:w="60" w:type="dxa"/>
           <w:right w:w="60" w:type="dxa"/>
         </w:tblCellMar>
+        <w:tblW w:w="4640" w:type="dxa"/>
       </w:tblPr>
       <w:tblGrid>
-        <w:gridCol w:w="3381"/>
-        <w:gridCol w:w="3381"/>
-        <w:gridCol w:w="3381"/>
+        <w:gridCol w:w="1989"/>
+        <w:gridCol w:w="1547"/>
+        <w:gridCol w:w="1105"/>
       </w:tblGrid>
       <w:tr>
         <w:tc>
           <w:tcPr>
-            <w:tcW w:type="dxa" w:w="2100"/>
+            <w:tcW w:type="dxa" w:w="1989"/>
             <w:tcBorders>
               <w:top w:val="single" w:sz="4" w:color="000000"/>
               <w:left w:val="single" w:sz="4" w:color="000000"/>
@@ -2330,7 +2330,7 @@
         </w:tc>
         <w:tc>
           <w:tcPr>
-            <w:tcW w:type="dxa" w:w="1633"/>
+            <w:tcW w:type="dxa" w:w="1547"/>
             <w:tcBorders>
               <w:top w:val="single" w:sz="4" w:color="000000"/>
               <w:left w:val="single" w:sz="4" w:color="000000"/>
@@ -2356,7 +2356,7 @@
         </w:tc>
         <w:tc>
           <w:tcPr>
-            <w:tcW w:type="dxa" w:w="1167"/>
+            <w:tcW w:type="dxa" w:w="1105"/>
             <w:tcBorders>
               <w:top w:val="single" w:sz="4" w:color="000000"/>
               <w:left w:val="single" w:sz="4" w:color="000000"/>
@@ -2384,7 +2384,7 @@
       <w:tr>
         <w:tc>
           <w:tcPr>
-            <w:tcW w:type="dxa" w:w="2100"/>
+            <w:tcW w:type="dxa" w:w="1989"/>
             <w:tcBorders>
               <w:top w:val="single" w:sz="4" w:color="000000"/>
               <w:left w:val="single" w:sz="4" w:color="000000"/>
@@ -2409,7 +2409,7 @@
         </w:tc>
         <w:tc>
           <w:tcPr>
-            <w:tcW w:type="dxa" w:w="1633"/>
+            <w:tcW w:type="dxa" w:w="1547"/>
             <w:tcBorders>
               <w:top w:val="single" w:sz="4" w:color="000000"/>
               <w:left w:val="single" w:sz="4" w:color="000000"/>
@@ -2434,7 +2434,7 @@
         </w:tc>
         <w:tc>
           <w:tcPr>
-            <w:tcW w:type="dxa" w:w="1167"/>
+            <w:tcW w:type="dxa" w:w="1105"/>
             <w:tcBorders>
               <w:top w:val="single" w:sz="4" w:color="000000"/>
               <w:left w:val="single" w:sz="4" w:color="000000"/>
@@ -2461,7 +2461,7 @@
       <w:tr>
         <w:tc>
           <w:tcPr>
-            <w:tcW w:type="dxa" w:w="2100"/>
+            <w:tcW w:type="dxa" w:w="1989"/>
             <w:tcBorders>
               <w:top w:val="single" w:sz="4" w:color="000000"/>
               <w:left w:val="single" w:sz="4" w:color="000000"/>
@@ -2486,7 +2486,7 @@
         </w:tc>
         <w:tc>
           <w:tcPr>
-            <w:tcW w:type="dxa" w:w="1633"/>
+            <w:tcW w:type="dxa" w:w="1547"/>
             <w:tcBorders>
               <w:top w:val="single" w:sz="4" w:color="000000"/>
               <w:left w:val="single" w:sz="4" w:color="000000"/>
@@ -2511,7 +2511,7 @@
         </w:tc>
         <w:tc>
           <w:tcPr>
-            <w:tcW w:type="dxa" w:w="1167"/>
+            <w:tcW w:type="dxa" w:w="1105"/>
             <w:tcBorders>
               <w:top w:val="single" w:sz="4" w:color="000000"/>
               <w:left w:val="single" w:sz="4" w:color="000000"/>
@@ -2538,7 +2538,7 @@
       <w:tr>
         <w:tc>
           <w:tcPr>
-            <w:tcW w:type="dxa" w:w="2100"/>
+            <w:tcW w:type="dxa" w:w="1989"/>
             <w:tcBorders>
               <w:top w:val="single" w:sz="4" w:color="000000"/>
               <w:left w:val="single" w:sz="4" w:color="000000"/>
@@ -2563,7 +2563,7 @@
         </w:tc>
         <w:tc>
           <w:tcPr>
-            <w:tcW w:type="dxa" w:w="1633"/>
+            <w:tcW w:type="dxa" w:w="1547"/>
             <w:tcBorders>
               <w:top w:val="single" w:sz="4" w:color="000000"/>
               <w:left w:val="single" w:sz="4" w:color="000000"/>
@@ -2588,7 +2588,7 @@
         </w:tc>
         <w:tc>
           <w:tcPr>
-            <w:tcW w:type="dxa" w:w="1167"/>
+            <w:tcW w:type="dxa" w:w="1105"/>
             <w:tcBorders>
               <w:top w:val="single" w:sz="4" w:color="000000"/>
               <w:left w:val="single" w:sz="4" w:color="000000"/>
@@ -2615,7 +2615,7 @@
       <w:tr>
         <w:tc>
           <w:tcPr>
-            <w:tcW w:type="dxa" w:w="2100"/>
+            <w:tcW w:type="dxa" w:w="1989"/>
             <w:tcBorders>
               <w:top w:val="single" w:sz="4" w:color="000000"/>
               <w:left w:val="single" w:sz="4" w:color="000000"/>
@@ -2640,7 +2640,7 @@
         </w:tc>
         <w:tc>
           <w:tcPr>
-            <w:tcW w:type="dxa" w:w="1633"/>
+            <w:tcW w:type="dxa" w:w="1547"/>
             <w:tcBorders>
               <w:top w:val="single" w:sz="4" w:color="000000"/>
               <w:left w:val="single" w:sz="4" w:color="000000"/>
@@ -2665,7 +2665,7 @@
         </w:tc>
         <w:tc>
           <w:tcPr>
-            <w:tcW w:type="dxa" w:w="1167"/>
+            <w:tcW w:type="dxa" w:w="1105"/>
             <w:tcBorders>
               <w:top w:val="single" w:sz="4" w:color="000000"/>
               <w:left w:val="single" w:sz="4" w:color="000000"/>
@@ -2867,7 +2867,6 @@
     </w:p>
     <w:tbl>
       <w:tblPr>
-        <w:tblW w:type="auto" w:w="0"/>
         <w:jc w:val="center"/>
         <w:tblLayout w:type="fixed"/>
         <w:tblLook w:firstColumn="1" w:firstRow="1" w:lastColumn="0" w:lastRow="0" w:noHBand="0" w:noVBand="1" w:val="04A0"/>
@@ -2875,17 +2874,18 @@
           <w:left w:w="60" w:type="dxa"/>
           <w:right w:w="60" w:type="dxa"/>
         </w:tblCellMar>
+        <w:tblW w:w="4640" w:type="dxa"/>
       </w:tblPr>
       <w:tblGrid>
-        <w:gridCol w:w="2535"/>
-        <w:gridCol w:w="2535"/>
-        <w:gridCol w:w="2535"/>
-        <w:gridCol w:w="2535"/>
+        <w:gridCol w:w="1160"/>
+        <w:gridCol w:w="1160"/>
+        <w:gridCol w:w="1160"/>
+        <w:gridCol w:w="1160"/>
       </w:tblGrid>
       <w:tr>
         <w:tc>
           <w:tcPr>
-            <w:tcW w:type="dxa" w:w="1225"/>
+            <w:tcW w:type="dxa" w:w="1160"/>
             <w:tcBorders>
               <w:top w:val="single" w:sz="4" w:color="000000"/>
               <w:left w:val="single" w:sz="4" w:color="000000"/>
@@ -2911,7 +2911,7 @@
         </w:tc>
         <w:tc>
           <w:tcPr>
-            <w:tcW w:type="dxa" w:w="1225"/>
+            <w:tcW w:type="dxa" w:w="1160"/>
             <w:tcBorders>
               <w:top w:val="single" w:sz="4" w:color="000000"/>
               <w:left w:val="single" w:sz="4" w:color="000000"/>
@@ -2937,7 +2937,7 @@
         </w:tc>
         <w:tc>
           <w:tcPr>
-            <w:tcW w:type="dxa" w:w="1225"/>
+            <w:tcW w:type="dxa" w:w="1160"/>
             <w:tcBorders>
               <w:top w:val="single" w:sz="4" w:color="000000"/>
               <w:left w:val="single" w:sz="4" w:color="000000"/>
@@ -2963,7 +2963,7 @@
         </w:tc>
         <w:tc>
           <w:tcPr>
-            <w:tcW w:type="dxa" w:w="1225"/>
+            <w:tcW w:type="dxa" w:w="1160"/>
             <w:tcBorders>
               <w:top w:val="single" w:sz="4" w:color="000000"/>
               <w:left w:val="single" w:sz="4" w:color="000000"/>
@@ -2991,7 +2991,7 @@
       <w:tr>
         <w:tc>
           <w:tcPr>
-            <w:tcW w:type="dxa" w:w="1225"/>
+            <w:tcW w:type="dxa" w:w="1160"/>
             <w:tcBorders>
               <w:top w:val="single" w:sz="4" w:color="000000"/>
               <w:left w:val="single" w:sz="4" w:color="000000"/>
@@ -3016,7 +3016,7 @@
         </w:tc>
         <w:tc>
           <w:tcPr>
-            <w:tcW w:type="dxa" w:w="1225"/>
+            <w:tcW w:type="dxa" w:w="1160"/>
             <w:tcBorders>
               <w:top w:val="single" w:sz="4" w:color="000000"/>
               <w:left w:val="single" w:sz="4" w:color="000000"/>
@@ -3041,7 +3041,7 @@
         </w:tc>
         <w:tc>
           <w:tcPr>
-            <w:tcW w:type="dxa" w:w="1225"/>
+            <w:tcW w:type="dxa" w:w="1160"/>
             <w:tcBorders>
               <w:top w:val="single" w:sz="4" w:color="000000"/>
               <w:left w:val="single" w:sz="4" w:color="000000"/>
@@ -3066,7 +3066,7 @@
         </w:tc>
         <w:tc>
           <w:tcPr>
-            <w:tcW w:type="dxa" w:w="1225"/>
+            <w:tcW w:type="dxa" w:w="1160"/>
             <w:tcBorders>
               <w:top w:val="single" w:sz="4" w:color="000000"/>
               <w:left w:val="single" w:sz="4" w:color="000000"/>
@@ -3093,7 +3093,7 @@
       <w:tr>
         <w:tc>
           <w:tcPr>
-            <w:tcW w:type="dxa" w:w="1225"/>
+            <w:tcW w:type="dxa" w:w="1160"/>
             <w:tcBorders>
               <w:top w:val="single" w:sz="4" w:color="000000"/>
               <w:left w:val="single" w:sz="4" w:color="000000"/>
@@ -3118,7 +3118,7 @@
         </w:tc>
         <w:tc>
           <w:tcPr>
-            <w:tcW w:type="dxa" w:w="1225"/>
+            <w:tcW w:type="dxa" w:w="1160"/>
             <w:tcBorders>
               <w:top w:val="single" w:sz="4" w:color="000000"/>
               <w:left w:val="single" w:sz="4" w:color="000000"/>
@@ -3143,7 +3143,7 @@
         </w:tc>
         <w:tc>
           <w:tcPr>
-            <w:tcW w:type="dxa" w:w="1225"/>
+            <w:tcW w:type="dxa" w:w="1160"/>
             <w:tcBorders>
               <w:top w:val="single" w:sz="4" w:color="000000"/>
               <w:left w:val="single" w:sz="4" w:color="000000"/>
@@ -3168,7 +3168,7 @@
         </w:tc>
         <w:tc>
           <w:tcPr>
-            <w:tcW w:type="dxa" w:w="1225"/>
+            <w:tcW w:type="dxa" w:w="1160"/>
             <w:tcBorders>
               <w:top w:val="single" w:sz="4" w:color="000000"/>
               <w:left w:val="single" w:sz="4" w:color="000000"/>
@@ -3195,7 +3195,7 @@
       <w:tr>
         <w:tc>
           <w:tcPr>
-            <w:tcW w:type="dxa" w:w="1225"/>
+            <w:tcW w:type="dxa" w:w="1160"/>
             <w:tcBorders>
               <w:top w:val="single" w:sz="4" w:color="000000"/>
               <w:left w:val="single" w:sz="4" w:color="000000"/>
@@ -3220,7 +3220,7 @@
         </w:tc>
         <w:tc>
           <w:tcPr>
-            <w:tcW w:type="dxa" w:w="1225"/>
+            <w:tcW w:type="dxa" w:w="1160"/>
             <w:tcBorders>
               <w:top w:val="single" w:sz="4" w:color="000000"/>
               <w:left w:val="single" w:sz="4" w:color="000000"/>
@@ -3245,7 +3245,7 @@
         </w:tc>
         <w:tc>
           <w:tcPr>
-            <w:tcW w:type="dxa" w:w="1225"/>
+            <w:tcW w:type="dxa" w:w="1160"/>
             <w:tcBorders>
               <w:top w:val="single" w:sz="4" w:color="000000"/>
               <w:left w:val="single" w:sz="4" w:color="000000"/>
@@ -3270,7 +3270,7 @@
         </w:tc>
         <w:tc>
           <w:tcPr>
-            <w:tcW w:type="dxa" w:w="1225"/>
+            <w:tcW w:type="dxa" w:w="1160"/>
             <w:tcBorders>
               <w:top w:val="single" w:sz="4" w:color="000000"/>
               <w:left w:val="single" w:sz="4" w:color="000000"/>
@@ -3297,7 +3297,7 @@
       <w:tr>
         <w:tc>
           <w:tcPr>
-            <w:tcW w:type="dxa" w:w="1225"/>
+            <w:tcW w:type="dxa" w:w="1160"/>
             <w:tcBorders>
               <w:top w:val="single" w:sz="4" w:color="000000"/>
               <w:left w:val="single" w:sz="4" w:color="000000"/>
@@ -3322,7 +3322,7 @@
         </w:tc>
         <w:tc>
           <w:tcPr>
-            <w:tcW w:type="dxa" w:w="1225"/>
+            <w:tcW w:type="dxa" w:w="1160"/>
             <w:tcBorders>
               <w:top w:val="single" w:sz="4" w:color="000000"/>
               <w:left w:val="single" w:sz="4" w:color="000000"/>
@@ -3347,7 +3347,7 @@
         </w:tc>
         <w:tc>
           <w:tcPr>
-            <w:tcW w:type="dxa" w:w="1225"/>
+            <w:tcW w:type="dxa" w:w="1160"/>
             <w:tcBorders>
               <w:top w:val="single" w:sz="4" w:color="000000"/>
               <w:left w:val="single" w:sz="4" w:color="000000"/>
@@ -3372,7 +3372,7 @@
         </w:tc>
         <w:tc>
           <w:tcPr>
-            <w:tcW w:type="dxa" w:w="1225"/>
+            <w:tcW w:type="dxa" w:w="1160"/>
             <w:tcBorders>
               <w:top w:val="single" w:sz="4" w:color="000000"/>
               <w:left w:val="single" w:sz="4" w:color="000000"/>
@@ -3399,7 +3399,7 @@
       <w:tr>
         <w:tc>
           <w:tcPr>
-            <w:tcW w:type="dxa" w:w="1225"/>
+            <w:tcW w:type="dxa" w:w="1160"/>
             <w:tcBorders>
               <w:top w:val="single" w:sz="4" w:color="000000"/>
               <w:left w:val="single" w:sz="4" w:color="000000"/>
@@ -3424,7 +3424,7 @@
         </w:tc>
         <w:tc>
           <w:tcPr>
-            <w:tcW w:type="dxa" w:w="1225"/>
+            <w:tcW w:type="dxa" w:w="1160"/>
             <w:tcBorders>
               <w:top w:val="single" w:sz="4" w:color="000000"/>
               <w:left w:val="single" w:sz="4" w:color="000000"/>
@@ -3449,7 +3449,7 @@
         </w:tc>
         <w:tc>
           <w:tcPr>
-            <w:tcW w:type="dxa" w:w="1225"/>
+            <w:tcW w:type="dxa" w:w="1160"/>
             <w:tcBorders>
               <w:top w:val="single" w:sz="4" w:color="000000"/>
               <w:left w:val="single" w:sz="4" w:color="000000"/>
@@ -3474,7 +3474,7 @@
         </w:tc>
         <w:tc>
           <w:tcPr>
-            <w:tcW w:type="dxa" w:w="1225"/>
+            <w:tcW w:type="dxa" w:w="1160"/>
             <w:tcBorders>
               <w:top w:val="single" w:sz="4" w:color="000000"/>
               <w:left w:val="single" w:sz="4" w:color="000000"/>
@@ -3618,7 +3618,6 @@
     </w:p>
     <w:tbl>
       <w:tblPr>
-        <w:tblW w:type="auto" w:w="0"/>
         <w:jc w:val="center"/>
         <w:tblLayout w:type="fixed"/>
         <w:tblLook w:firstColumn="1" w:firstRow="1" w:lastColumn="0" w:lastRow="0" w:noHBand="0" w:noVBand="1" w:val="04A0"/>
@@ -3626,17 +3625,18 @@
           <w:left w:w="60" w:type="dxa"/>
           <w:right w:w="60" w:type="dxa"/>
         </w:tblCellMar>
+        <w:tblW w:w="4640" w:type="dxa"/>
       </w:tblPr>
       <w:tblGrid>
-        <w:gridCol w:w="2535"/>
-        <w:gridCol w:w="2535"/>
-        <w:gridCol w:w="2535"/>
-        <w:gridCol w:w="2535"/>
+        <w:gridCol w:w="987"/>
+        <w:gridCol w:w="987"/>
+        <w:gridCol w:w="987"/>
+        <w:gridCol w:w="1678"/>
       </w:tblGrid>
       <w:tr>
         <w:tc>
           <w:tcPr>
-            <w:tcW w:type="dxa" w:w="1043"/>
+            <w:tcW w:type="dxa" w:w="987"/>
             <w:tcBorders>
               <w:top w:val="single" w:sz="4" w:color="000000"/>
               <w:left w:val="single" w:sz="4" w:color="000000"/>
@@ -3662,7 +3662,7 @@
         </w:tc>
         <w:tc>
           <w:tcPr>
-            <w:tcW w:type="dxa" w:w="1043"/>
+            <w:tcW w:type="dxa" w:w="987"/>
             <w:tcBorders>
               <w:top w:val="single" w:sz="4" w:color="000000"/>
               <w:left w:val="single" w:sz="4" w:color="000000"/>
@@ -3688,7 +3688,7 @@
         </w:tc>
         <w:tc>
           <w:tcPr>
-            <w:tcW w:type="dxa" w:w="1043"/>
+            <w:tcW w:type="dxa" w:w="987"/>
             <w:tcBorders>
               <w:top w:val="single" w:sz="4" w:color="000000"/>
               <w:left w:val="single" w:sz="4" w:color="000000"/>
@@ -3714,7 +3714,7 @@
         </w:tc>
         <w:tc>
           <w:tcPr>
-            <w:tcW w:type="dxa" w:w="1772"/>
+            <w:tcW w:type="dxa" w:w="1678"/>
             <w:tcBorders>
               <w:top w:val="single" w:sz="4" w:color="000000"/>
               <w:left w:val="single" w:sz="4" w:color="000000"/>
@@ -3742,7 +3742,7 @@
       <w:tr>
         <w:tc>
           <w:tcPr>
-            <w:tcW w:type="dxa" w:w="1043"/>
+            <w:tcW w:type="dxa" w:w="987"/>
             <w:tcBorders>
               <w:top w:val="single" w:sz="4" w:color="000000"/>
               <w:left w:val="single" w:sz="4" w:color="000000"/>
@@ -3767,7 +3767,7 @@
         </w:tc>
         <w:tc>
           <w:tcPr>
-            <w:tcW w:type="dxa" w:w="1043"/>
+            <w:tcW w:type="dxa" w:w="987"/>
             <w:tcBorders>
               <w:top w:val="single" w:sz="4" w:color="000000"/>
               <w:left w:val="single" w:sz="4" w:color="000000"/>
@@ -3792,7 +3792,7 @@
         </w:tc>
         <w:tc>
           <w:tcPr>
-            <w:tcW w:type="dxa" w:w="1043"/>
+            <w:tcW w:type="dxa" w:w="987"/>
             <w:tcBorders>
               <w:top w:val="single" w:sz="4" w:color="000000"/>
               <w:left w:val="single" w:sz="4" w:color="000000"/>
@@ -3817,7 +3817,7 @@
         </w:tc>
         <w:tc>
           <w:tcPr>
-            <w:tcW w:type="dxa" w:w="1772"/>
+            <w:tcW w:type="dxa" w:w="1678"/>
             <w:tcBorders>
               <w:top w:val="single" w:sz="4" w:color="000000"/>
               <w:left w:val="single" w:sz="4" w:color="000000"/>
@@ -3844,7 +3844,7 @@
       <w:tr>
         <w:tc>
           <w:tcPr>
-            <w:tcW w:type="dxa" w:w="1043"/>
+            <w:tcW w:type="dxa" w:w="987"/>
             <w:tcBorders>
               <w:top w:val="single" w:sz="4" w:color="000000"/>
               <w:left w:val="single" w:sz="4" w:color="000000"/>
@@ -3869,7 +3869,7 @@
         </w:tc>
         <w:tc>
           <w:tcPr>
-            <w:tcW w:type="dxa" w:w="1043"/>
+            <w:tcW w:type="dxa" w:w="987"/>
             <w:tcBorders>
               <w:top w:val="single" w:sz="4" w:color="000000"/>
               <w:left w:val="single" w:sz="4" w:color="000000"/>
@@ -3894,7 +3894,7 @@
         </w:tc>
         <w:tc>
           <w:tcPr>
-            <w:tcW w:type="dxa" w:w="1043"/>
+            <w:tcW w:type="dxa" w:w="987"/>
             <w:tcBorders>
               <w:top w:val="single" w:sz="4" w:color="000000"/>
               <w:left w:val="single" w:sz="4" w:color="000000"/>
@@ -3919,7 +3919,7 @@
         </w:tc>
         <w:tc>
           <w:tcPr>
-            <w:tcW w:type="dxa" w:w="1772"/>
+            <w:tcW w:type="dxa" w:w="1678"/>
             <w:tcBorders>
               <w:top w:val="single" w:sz="4" w:color="000000"/>
               <w:left w:val="single" w:sz="4" w:color="000000"/>
@@ -3946,7 +3946,7 @@
       <w:tr>
         <w:tc>
           <w:tcPr>
-            <w:tcW w:type="dxa" w:w="1043"/>
+            <w:tcW w:type="dxa" w:w="987"/>
             <w:tcBorders>
               <w:top w:val="single" w:sz="4" w:color="000000"/>
               <w:left w:val="single" w:sz="4" w:color="000000"/>
@@ -3971,7 +3971,7 @@
         </w:tc>
         <w:tc>
           <w:tcPr>
-            <w:tcW w:type="dxa" w:w="1043"/>
+            <w:tcW w:type="dxa" w:w="987"/>
             <w:tcBorders>
               <w:top w:val="single" w:sz="4" w:color="000000"/>
               <w:left w:val="single" w:sz="4" w:color="000000"/>
@@ -3996,7 +3996,7 @@
         </w:tc>
         <w:tc>
           <w:tcPr>
-            <w:tcW w:type="dxa" w:w="1043"/>
+            <w:tcW w:type="dxa" w:w="987"/>
             <w:tcBorders>
               <w:top w:val="single" w:sz="4" w:color="000000"/>
               <w:left w:val="single" w:sz="4" w:color="000000"/>
@@ -4021,7 +4021,7 @@
         </w:tc>
         <w:tc>
           <w:tcPr>
-            <w:tcW w:type="dxa" w:w="1772"/>
+            <w:tcW w:type="dxa" w:w="1678"/>
             <w:tcBorders>
               <w:top w:val="single" w:sz="4" w:color="000000"/>
               <w:left w:val="single" w:sz="4" w:color="000000"/>
@@ -4048,7 +4048,7 @@
       <w:tr>
         <w:tc>
           <w:tcPr>
-            <w:tcW w:type="dxa" w:w="1043"/>
+            <w:tcW w:type="dxa" w:w="987"/>
             <w:tcBorders>
               <w:top w:val="single" w:sz="4" w:color="000000"/>
               <w:left w:val="single" w:sz="4" w:color="000000"/>
@@ -4073,7 +4073,7 @@
         </w:tc>
         <w:tc>
           <w:tcPr>
-            <w:tcW w:type="dxa" w:w="1043"/>
+            <w:tcW w:type="dxa" w:w="987"/>
             <w:tcBorders>
               <w:top w:val="single" w:sz="4" w:color="000000"/>
               <w:left w:val="single" w:sz="4" w:color="000000"/>
@@ -4098,7 +4098,7 @@
         </w:tc>
         <w:tc>
           <w:tcPr>
-            <w:tcW w:type="dxa" w:w="1043"/>
+            <w:tcW w:type="dxa" w:w="987"/>
             <w:tcBorders>
               <w:top w:val="single" w:sz="4" w:color="000000"/>
               <w:left w:val="single" w:sz="4" w:color="000000"/>
@@ -4123,7 +4123,7 @@
         </w:tc>
         <w:tc>
           <w:tcPr>
-            <w:tcW w:type="dxa" w:w="1772"/>
+            <w:tcW w:type="dxa" w:w="1678"/>
             <w:tcBorders>
               <w:top w:val="single" w:sz="4" w:color="000000"/>
               <w:left w:val="single" w:sz="4" w:color="000000"/>
@@ -4226,7 +4226,6 @@
     </w:p>
     <w:tbl>
       <w:tblPr>
-        <w:tblW w:type="auto" w:w="0"/>
         <w:jc w:val="center"/>
         <w:tblLayout w:type="fixed"/>
         <w:tblLook w:firstColumn="1" w:firstRow="1" w:lastColumn="0" w:lastRow="0" w:noHBand="0" w:noVBand="1" w:val="04A0"/>
@@ -4234,18 +4233,19 @@
           <w:left w:w="60" w:type="dxa"/>
           <w:right w:w="60" w:type="dxa"/>
         </w:tblCellMar>
+        <w:tblW w:w="4640" w:type="dxa"/>
       </w:tblPr>
       <w:tblGrid>
-        <w:gridCol w:w="2028"/>
-        <w:gridCol w:w="2028"/>
-        <w:gridCol w:w="2028"/>
-        <w:gridCol w:w="2028"/>
-        <w:gridCol w:w="2028"/>
+        <w:gridCol w:w="1180"/>
+        <w:gridCol w:w="865"/>
+        <w:gridCol w:w="865"/>
+        <w:gridCol w:w="865"/>
+        <w:gridCol w:w="865"/>
       </w:tblGrid>
       <w:tr>
         <w:tc>
           <w:tcPr>
-            <w:tcW w:type="dxa" w:w="1246"/>
+            <w:tcW w:type="dxa" w:w="1180"/>
             <w:tcBorders>
               <w:top w:val="single" w:sz="4" w:color="000000"/>
               <w:left w:val="single" w:sz="4" w:color="000000"/>
@@ -4271,7 +4271,7 @@
         </w:tc>
         <w:tc>
           <w:tcPr>
-            <w:tcW w:type="dxa" w:w="914"/>
+            <w:tcW w:type="dxa" w:w="865"/>
             <w:tcBorders>
               <w:top w:val="single" w:sz="4" w:color="000000"/>
               <w:left w:val="single" w:sz="4" w:color="000000"/>
@@ -4297,7 +4297,7 @@
         </w:tc>
         <w:tc>
           <w:tcPr>
-            <w:tcW w:type="dxa" w:w="914"/>
+            <w:tcW w:type="dxa" w:w="865"/>
             <w:tcBorders>
               <w:top w:val="single" w:sz="4" w:color="000000"/>
               <w:left w:val="single" w:sz="4" w:color="000000"/>
@@ -4323,7 +4323,7 @@
         </w:tc>
         <w:tc>
           <w:tcPr>
-            <w:tcW w:type="dxa" w:w="914"/>
+            <w:tcW w:type="dxa" w:w="865"/>
             <w:tcBorders>
               <w:top w:val="single" w:sz="4" w:color="000000"/>
               <w:left w:val="single" w:sz="4" w:color="000000"/>
@@ -4349,7 +4349,7 @@
         </w:tc>
         <w:tc>
           <w:tcPr>
-            <w:tcW w:type="dxa" w:w="914"/>
+            <w:tcW w:type="dxa" w:w="865"/>
             <w:tcBorders>
               <w:top w:val="single" w:sz="4" w:color="000000"/>
               <w:left w:val="single" w:sz="4" w:color="000000"/>
@@ -4377,7 +4377,7 @@
       <w:tr>
         <w:tc>
           <w:tcPr>
-            <w:tcW w:type="dxa" w:w="1246"/>
+            <w:tcW w:type="dxa" w:w="1180"/>
             <w:tcBorders>
               <w:top w:val="single" w:sz="4" w:color="000000"/>
               <w:left w:val="single" w:sz="4" w:color="000000"/>
@@ -4402,7 +4402,7 @@
         </w:tc>
         <w:tc>
           <w:tcPr>
-            <w:tcW w:type="dxa" w:w="914"/>
+            <w:tcW w:type="dxa" w:w="865"/>
             <w:tcBorders>
               <w:top w:val="single" w:sz="4" w:color="000000"/>
               <w:left w:val="single" w:sz="4" w:color="000000"/>
@@ -4427,7 +4427,7 @@
         </w:tc>
         <w:tc>
           <w:tcPr>
-            <w:tcW w:type="dxa" w:w="914"/>
+            <w:tcW w:type="dxa" w:w="865"/>
             <w:tcBorders>
               <w:top w:val="single" w:sz="4" w:color="000000"/>
               <w:left w:val="single" w:sz="4" w:color="000000"/>
@@ -4452,7 +4452,7 @@
         </w:tc>
         <w:tc>
           <w:tcPr>
-            <w:tcW w:type="dxa" w:w="914"/>
+            <w:tcW w:type="dxa" w:w="865"/>
             <w:tcBorders>
               <w:top w:val="single" w:sz="4" w:color="000000"/>
               <w:left w:val="single" w:sz="4" w:color="000000"/>
@@ -4477,7 +4477,7 @@
         </w:tc>
         <w:tc>
           <w:tcPr>
-            <w:tcW w:type="dxa" w:w="914"/>
+            <w:tcW w:type="dxa" w:w="865"/>
             <w:tcBorders>
               <w:top w:val="single" w:sz="4" w:color="000000"/>
               <w:left w:val="single" w:sz="4" w:color="000000"/>
@@ -4504,7 +4504,7 @@
       <w:tr>
         <w:tc>
           <w:tcPr>
-            <w:tcW w:type="dxa" w:w="1246"/>
+            <w:tcW w:type="dxa" w:w="1180"/>
             <w:tcBorders>
               <w:top w:val="single" w:sz="4" w:color="000000"/>
               <w:left w:val="single" w:sz="4" w:color="000000"/>
@@ -4529,7 +4529,7 @@
         </w:tc>
         <w:tc>
           <w:tcPr>
-            <w:tcW w:type="dxa" w:w="914"/>
+            <w:tcW w:type="dxa" w:w="865"/>
             <w:tcBorders>
               <w:top w:val="single" w:sz="4" w:color="000000"/>
               <w:left w:val="single" w:sz="4" w:color="000000"/>
@@ -4554,7 +4554,7 @@
         </w:tc>
         <w:tc>
           <w:tcPr>
-            <w:tcW w:type="dxa" w:w="914"/>
+            <w:tcW w:type="dxa" w:w="865"/>
             <w:tcBorders>
               <w:top w:val="single" w:sz="4" w:color="000000"/>
               <w:left w:val="single" w:sz="4" w:color="000000"/>
@@ -4579,7 +4579,7 @@
         </w:tc>
         <w:tc>
           <w:tcPr>
-            <w:tcW w:type="dxa" w:w="914"/>
+            <w:tcW w:type="dxa" w:w="865"/>
             <w:tcBorders>
               <w:top w:val="single" w:sz="4" w:color="000000"/>
               <w:left w:val="single" w:sz="4" w:color="000000"/>
@@ -4604,7 +4604,7 @@
         </w:tc>
         <w:tc>
           <w:tcPr>
-            <w:tcW w:type="dxa" w:w="914"/>
+            <w:tcW w:type="dxa" w:w="865"/>
             <w:tcBorders>
               <w:top w:val="single" w:sz="4" w:color="000000"/>
               <w:left w:val="single" w:sz="4" w:color="000000"/>
@@ -4631,7 +4631,7 @@
       <w:tr>
         <w:tc>
           <w:tcPr>
-            <w:tcW w:type="dxa" w:w="1246"/>
+            <w:tcW w:type="dxa" w:w="1180"/>
             <w:tcBorders>
               <w:top w:val="single" w:sz="4" w:color="000000"/>
               <w:left w:val="single" w:sz="4" w:color="000000"/>
@@ -4656,7 +4656,7 @@
         </w:tc>
         <w:tc>
           <w:tcPr>
-            <w:tcW w:type="dxa" w:w="914"/>
+            <w:tcW w:type="dxa" w:w="865"/>
             <w:tcBorders>
               <w:top w:val="single" w:sz="4" w:color="000000"/>
               <w:left w:val="single" w:sz="4" w:color="000000"/>
@@ -4681,7 +4681,7 @@
         </w:tc>
         <w:tc>
           <w:tcPr>
-            <w:tcW w:type="dxa" w:w="914"/>
+            <w:tcW w:type="dxa" w:w="865"/>
             <w:tcBorders>
               <w:top w:val="single" w:sz="4" w:color="000000"/>
               <w:left w:val="single" w:sz="4" w:color="000000"/>
@@ -4706,7 +4706,7 @@
         </w:tc>
         <w:tc>
           <w:tcPr>
-            <w:tcW w:type="dxa" w:w="914"/>
+            <w:tcW w:type="dxa" w:w="865"/>
             <w:tcBorders>
               <w:top w:val="single" w:sz="4" w:color="000000"/>
               <w:left w:val="single" w:sz="4" w:color="000000"/>
@@ -4731,7 +4731,7 @@
         </w:tc>
         <w:tc>
           <w:tcPr>
-            <w:tcW w:type="dxa" w:w="914"/>
+            <w:tcW w:type="dxa" w:w="865"/>
             <w:tcBorders>
               <w:top w:val="single" w:sz="4" w:color="000000"/>
               <w:left w:val="single" w:sz="4" w:color="000000"/>
@@ -4758,7 +4758,7 @@
       <w:tr>
         <w:tc>
           <w:tcPr>
-            <w:tcW w:type="dxa" w:w="1246"/>
+            <w:tcW w:type="dxa" w:w="1180"/>
             <w:tcBorders>
               <w:top w:val="single" w:sz="4" w:color="000000"/>
               <w:left w:val="single" w:sz="4" w:color="000000"/>
@@ -4783,7 +4783,7 @@
         </w:tc>
         <w:tc>
           <w:tcPr>
-            <w:tcW w:type="dxa" w:w="914"/>
+            <w:tcW w:type="dxa" w:w="865"/>
             <w:tcBorders>
               <w:top w:val="single" w:sz="4" w:color="000000"/>
               <w:left w:val="single" w:sz="4" w:color="000000"/>
@@ -4808,7 +4808,7 @@
         </w:tc>
         <w:tc>
           <w:tcPr>
-            <w:tcW w:type="dxa" w:w="914"/>
+            <w:tcW w:type="dxa" w:w="865"/>
             <w:tcBorders>
               <w:top w:val="single" w:sz="4" w:color="000000"/>
               <w:left w:val="single" w:sz="4" w:color="000000"/>
@@ -4833,7 +4833,7 @@
         </w:tc>
         <w:tc>
           <w:tcPr>
-            <w:tcW w:type="dxa" w:w="914"/>
+            <w:tcW w:type="dxa" w:w="865"/>
             <w:tcBorders>
               <w:top w:val="single" w:sz="4" w:color="000000"/>
               <w:left w:val="single" w:sz="4" w:color="000000"/>
@@ -4858,7 +4858,7 @@
         </w:tc>
         <w:tc>
           <w:tcPr>
-            <w:tcW w:type="dxa" w:w="914"/>
+            <w:tcW w:type="dxa" w:w="865"/>
             <w:tcBorders>
               <w:top w:val="single" w:sz="4" w:color="000000"/>
               <w:left w:val="single" w:sz="4" w:color="000000"/>
@@ -4885,7 +4885,7 @@
       <w:tr>
         <w:tc>
           <w:tcPr>
-            <w:tcW w:type="dxa" w:w="1246"/>
+            <w:tcW w:type="dxa" w:w="1180"/>
             <w:tcBorders>
               <w:top w:val="single" w:sz="4" w:color="000000"/>
               <w:left w:val="single" w:sz="4" w:color="000000"/>
@@ -4910,7 +4910,7 @@
         </w:tc>
         <w:tc>
           <w:tcPr>
-            <w:tcW w:type="dxa" w:w="914"/>
+            <w:tcW w:type="dxa" w:w="865"/>
             <w:tcBorders>
               <w:top w:val="single" w:sz="4" w:color="000000"/>
               <w:left w:val="single" w:sz="4" w:color="000000"/>
@@ -4935,7 +4935,7 @@
         </w:tc>
         <w:tc>
           <w:tcPr>
-            <w:tcW w:type="dxa" w:w="914"/>
+            <w:tcW w:type="dxa" w:w="865"/>
             <w:tcBorders>
               <w:top w:val="single" w:sz="4" w:color="000000"/>
               <w:left w:val="single" w:sz="4" w:color="000000"/>
@@ -4960,7 +4960,7 @@
         </w:tc>
         <w:tc>
           <w:tcPr>
-            <w:tcW w:type="dxa" w:w="914"/>
+            <w:tcW w:type="dxa" w:w="865"/>
             <w:tcBorders>
               <w:top w:val="single" w:sz="4" w:color="000000"/>
               <w:left w:val="single" w:sz="4" w:color="000000"/>
@@ -4985,7 +4985,7 @@
         </w:tc>
         <w:tc>
           <w:tcPr>
-            <w:tcW w:type="dxa" w:w="914"/>
+            <w:tcW w:type="dxa" w:w="865"/>
             <w:tcBorders>
               <w:top w:val="single" w:sz="4" w:color="000000"/>
               <w:left w:val="single" w:sz="4" w:color="000000"/>
@@ -5012,7 +5012,7 @@
       <w:tr>
         <w:tc>
           <w:tcPr>
-            <w:tcW w:type="dxa" w:w="1246"/>
+            <w:tcW w:type="dxa" w:w="1180"/>
             <w:tcBorders>
               <w:top w:val="single" w:sz="4" w:color="000000"/>
               <w:left w:val="single" w:sz="4" w:color="000000"/>
@@ -5037,7 +5037,7 @@
         </w:tc>
         <w:tc>
           <w:tcPr>
-            <w:tcW w:type="dxa" w:w="914"/>
+            <w:tcW w:type="dxa" w:w="865"/>
             <w:tcBorders>
               <w:top w:val="single" w:sz="4" w:color="000000"/>
               <w:left w:val="single" w:sz="4" w:color="000000"/>
@@ -5062,7 +5062,7 @@
         </w:tc>
         <w:tc>
           <w:tcPr>
-            <w:tcW w:type="dxa" w:w="914"/>
+            <w:tcW w:type="dxa" w:w="865"/>
             <w:tcBorders>
               <w:top w:val="single" w:sz="4" w:color="000000"/>
               <w:left w:val="single" w:sz="4" w:color="000000"/>
@@ -5087,7 +5087,7 @@
         </w:tc>
         <w:tc>
           <w:tcPr>
-            <w:tcW w:type="dxa" w:w="914"/>
+            <w:tcW w:type="dxa" w:w="865"/>
             <w:tcBorders>
               <w:top w:val="single" w:sz="4" w:color="000000"/>
               <w:left w:val="single" w:sz="4" w:color="000000"/>
@@ -5112,7 +5112,7 @@
         </w:tc>
         <w:tc>
           <w:tcPr>
-            <w:tcW w:type="dxa" w:w="914"/>
+            <w:tcW w:type="dxa" w:w="865"/>
             <w:tcBorders>
               <w:top w:val="single" w:sz="4" w:color="000000"/>
               <w:left w:val="single" w:sz="4" w:color="000000"/>
@@ -5139,7 +5139,7 @@
       <w:tr>
         <w:tc>
           <w:tcPr>
-            <w:tcW w:type="dxa" w:w="1246"/>
+            <w:tcW w:type="dxa" w:w="1180"/>
             <w:tcBorders>
               <w:top w:val="single" w:sz="4" w:color="000000"/>
               <w:left w:val="single" w:sz="4" w:color="000000"/>
@@ -5164,7 +5164,7 @@
         </w:tc>
         <w:tc>
           <w:tcPr>
-            <w:tcW w:type="dxa" w:w="914"/>
+            <w:tcW w:type="dxa" w:w="865"/>
             <w:tcBorders>
               <w:top w:val="single" w:sz="4" w:color="000000"/>
               <w:left w:val="single" w:sz="4" w:color="000000"/>
@@ -5189,7 +5189,7 @@
         </w:tc>
         <w:tc>
           <w:tcPr>
-            <w:tcW w:type="dxa" w:w="914"/>
+            <w:tcW w:type="dxa" w:w="865"/>
             <w:tcBorders>
               <w:top w:val="single" w:sz="4" w:color="000000"/>
               <w:left w:val="single" w:sz="4" w:color="000000"/>
@@ -5214,7 +5214,7 @@
         </w:tc>
         <w:tc>
           <w:tcPr>
-            <w:tcW w:type="dxa" w:w="914"/>
+            <w:tcW w:type="dxa" w:w="865"/>
             <w:tcBorders>
               <w:top w:val="single" w:sz="4" w:color="000000"/>
               <w:left w:val="single" w:sz="4" w:color="000000"/>
@@ -5239,7 +5239,7 @@
         </w:tc>
         <w:tc>
           <w:tcPr>
-            <w:tcW w:type="dxa" w:w="914"/>
+            <w:tcW w:type="dxa" w:w="865"/>
             <w:tcBorders>
               <w:top w:val="single" w:sz="4" w:color="000000"/>
               <w:left w:val="single" w:sz="4" w:color="000000"/>
@@ -5266,7 +5266,7 @@
       <w:tr>
         <w:tc>
           <w:tcPr>
-            <w:tcW w:type="dxa" w:w="1246"/>
+            <w:tcW w:type="dxa" w:w="1180"/>
             <w:tcBorders>
               <w:top w:val="single" w:sz="4" w:color="000000"/>
               <w:left w:val="single" w:sz="4" w:color="000000"/>
@@ -5291,7 +5291,7 @@
         </w:tc>
         <w:tc>
           <w:tcPr>
-            <w:tcW w:type="dxa" w:w="914"/>
+            <w:tcW w:type="dxa" w:w="865"/>
             <w:tcBorders>
               <w:top w:val="single" w:sz="4" w:color="000000"/>
               <w:left w:val="single" w:sz="4" w:color="000000"/>
@@ -5316,7 +5316,7 @@
         </w:tc>
         <w:tc>
           <w:tcPr>
-            <w:tcW w:type="dxa" w:w="914"/>
+            <w:tcW w:type="dxa" w:w="865"/>
             <w:tcBorders>
               <w:top w:val="single" w:sz="4" w:color="000000"/>
               <w:left w:val="single" w:sz="4" w:color="000000"/>
@@ -5341,7 +5341,7 @@
         </w:tc>
         <w:tc>
           <w:tcPr>
-            <w:tcW w:type="dxa" w:w="914"/>
+            <w:tcW w:type="dxa" w:w="865"/>
             <w:tcBorders>
               <w:top w:val="single" w:sz="4" w:color="000000"/>
               <w:left w:val="single" w:sz="4" w:color="000000"/>
@@ -5366,7 +5366,7 @@
         </w:tc>
         <w:tc>
           <w:tcPr>
-            <w:tcW w:type="dxa" w:w="914"/>
+            <w:tcW w:type="dxa" w:w="865"/>
             <w:tcBorders>
               <w:top w:val="single" w:sz="4" w:color="000000"/>
               <w:left w:val="single" w:sz="4" w:color="000000"/>
@@ -5393,7 +5393,7 @@
       <w:tr>
         <w:tc>
           <w:tcPr>
-            <w:tcW w:type="dxa" w:w="1246"/>
+            <w:tcW w:type="dxa" w:w="1180"/>
             <w:tcBorders>
               <w:top w:val="single" w:sz="4" w:color="000000"/>
               <w:left w:val="single" w:sz="4" w:color="000000"/>
@@ -5418,7 +5418,7 @@
         </w:tc>
         <w:tc>
           <w:tcPr>
-            <w:tcW w:type="dxa" w:w="914"/>
+            <w:tcW w:type="dxa" w:w="865"/>
             <w:tcBorders>
               <w:top w:val="single" w:sz="4" w:color="000000"/>
               <w:left w:val="single" w:sz="4" w:color="000000"/>
@@ -5443,7 +5443,7 @@
         </w:tc>
         <w:tc>
           <w:tcPr>
-            <w:tcW w:type="dxa" w:w="914"/>
+            <w:tcW w:type="dxa" w:w="865"/>
             <w:tcBorders>
               <w:top w:val="single" w:sz="4" w:color="000000"/>
               <w:left w:val="single" w:sz="4" w:color="000000"/>
@@ -5468,7 +5468,7 @@
         </w:tc>
         <w:tc>
           <w:tcPr>
-            <w:tcW w:type="dxa" w:w="914"/>
+            <w:tcW w:type="dxa" w:w="865"/>
             <w:tcBorders>
               <w:top w:val="single" w:sz="4" w:color="000000"/>
               <w:left w:val="single" w:sz="4" w:color="000000"/>
@@ -5493,7 +5493,7 @@
         </w:tc>
         <w:tc>
           <w:tcPr>
-            <w:tcW w:type="dxa" w:w="914"/>
+            <w:tcW w:type="dxa" w:w="865"/>
             <w:tcBorders>
               <w:top w:val="single" w:sz="4" w:color="000000"/>
               <w:left w:val="single" w:sz="4" w:color="000000"/>
@@ -5520,7 +5520,7 @@
       <w:tr>
         <w:tc>
           <w:tcPr>
-            <w:tcW w:type="dxa" w:w="1246"/>
+            <w:tcW w:type="dxa" w:w="1180"/>
             <w:tcBorders>
               <w:top w:val="single" w:sz="4" w:color="000000"/>
               <w:left w:val="single" w:sz="4" w:color="000000"/>
@@ -5545,7 +5545,7 @@
         </w:tc>
         <w:tc>
           <w:tcPr>
-            <w:tcW w:type="dxa" w:w="914"/>
+            <w:tcW w:type="dxa" w:w="865"/>
             <w:tcBorders>
               <w:top w:val="single" w:sz="4" w:color="000000"/>
               <w:left w:val="single" w:sz="4" w:color="000000"/>
@@ -5570,7 +5570,7 @@
         </w:tc>
         <w:tc>
           <w:tcPr>
-            <w:tcW w:type="dxa" w:w="914"/>
+            <w:tcW w:type="dxa" w:w="865"/>
             <w:tcBorders>
               <w:top w:val="single" w:sz="4" w:color="000000"/>
               <w:left w:val="single" w:sz="4" w:color="000000"/>
@@ -5595,7 +5595,7 @@
         </w:tc>
         <w:tc>
           <w:tcPr>
-            <w:tcW w:type="dxa" w:w="914"/>
+            <w:tcW w:type="dxa" w:w="865"/>
             <w:tcBorders>
               <w:top w:val="single" w:sz="4" w:color="000000"/>
               <w:left w:val="single" w:sz="4" w:color="000000"/>
@@ -5620,7 +5620,7 @@
         </w:tc>
         <w:tc>
           <w:tcPr>
-            <w:tcW w:type="dxa" w:w="914"/>
+            <w:tcW w:type="dxa" w:w="865"/>
             <w:tcBorders>
               <w:top w:val="single" w:sz="4" w:color="000000"/>
               <w:left w:val="single" w:sz="4" w:color="000000"/>

</xml_diff>

<commit_message>
Paper: rewrite to follow the writing-pattern audit
Co-Authored-By: Claude Sonnet 5.5 <noreply@anthropic.com>
</commit_message>
<xml_diff>
--- a/paper/paper.docx
+++ b/paper/paper.docx
@@ -449,7 +449,7 @@
           <w:b/>
           <w:sz w:val="18"/>
         </w:rPr>
-        <w:t xml:space="preserve"> - Plan-graph planners such as TAPE merge several candidate plans into one graph and let an external solver choose a path. Two weaknesses remain: a move is trusted without being checked against the rules of the environment, and one solver is used for every task. This paper describes a checking and selection layer that validates every move with a per-game rule checker, scales trust by a persistent record of past failures, scores each move from goal progress, confidence and budget, and chooses between A* and a constraint solver according to how many pieces can move. No language model is used. The layer is evaluated on seven games: Sokoban, River Crossing, Rush Hour, Peg Solitaire, the 24-puzzle, the Rubik's cube, and 3,000 levels of the public Boxoban set. The checker raises River Crossing from 0% to 100% safe success and, used to prune search, solves more Boxoban levels at every node budget in every difficulty set (54% to 82% on the hard set at 30,000 nodes). Adaptive selection cuts planning time where one piece moves, and failure memory reduces replans when failures depend on the state. A comparison of search methods shows that depth-first search helps only on Peg Solitaire, and that AO* does not apply to deterministic games. Several expected effects did not appear and are reported: tuning the cost weights found nothing better than the defaults, and merging plans did not shorten paths.</w:t>
+        <w:t xml:space="preserve"> - TAPE plans by merging several candidate plans into one graph and letting a solver pick a path through it. It does not test a move against the rules of the task before trusting it, and it uses the same solver for every problem. We add a layer with three parts: a rule checker for each game that rejects or downweights moves, a store of past failures that adjusts how far each move is trusted, and a selection rule that picks A* or a constraint solver by the number of movable pieces. No language model is involved. We test the layer on seven games: Sokoban, River Crossing, Rush Hour, Peg Solitaire, the 24-puzzle, the Rubik's cube and 3,000 public Boxoban levels. On River Crossing the checker takes safe success from 0% to 100%. Used to prune a search, it raises the share of Boxoban levels solved at every node budget in all three difficulty sets, for example from 54% to 82% on the hard set at 30,000 nodes. Choosing A* for single-piece games cut planning time on one-box Sokoban from 52 ms to 8 ms, and remembering failures reduced replans on two of four games. Depth-first search needed thirteen times fewer nodes than weighted A* on Peg Solitaire, and AO* turned out not to apply to our deterministic games. Tuning the cost weights found nothing better than our defaults, and merging plans never produced a shorter path.</w:t>
       </w:r>
     </w:p>
     <w:p>
@@ -511,7 +511,7 @@
         <w:rPr>
           <w:rFonts w:ascii="Times New Roman" w:hAnsi="Times New Roman"/>
         </w:rPr>
-        <w:t>Long-horizon planning is hard because a single plan often fails midway. A recent framework, TAPE [1], responds by generating several candidate plans, merging the states they share into one plan graph, selecting a feasible path with an external solver, executing it under constrained decoding, and replanning when the observed state differs from the predicted one. The authors of TAPE name two open problems: the graph is only as reliable as the plans behind it, and the solver is fixed in advance.</w:t>
+        <w:t>A plan that looks fine on paper can fail at the first move that breaks a rule. TAPE [1] tries to avoid this by asking for several candidate plans, merging the states they share into one graph, and letting an integer-programming solver pick the cheapest feasible path. If the world then differs from the prediction, it plans again from the real state. Its authors name two limits: the graph is only as good as the plans that built it, and the solver is chosen in advance.</w:t>
       </w:r>
     </w:p>
     <w:p>
@@ -525,7 +525,7 @@
         <w:rPr>
           <w:rFonts w:ascii="Times New Roman" w:hAnsi="Times New Roman"/>
         </w:rPr>
-        <w:t>This work builds on TAPE and targets both problems. Nothing in the original pipeline checks a proposed move against the rules of the environment before the move is trusted, so an illegal or fatal move is found only when execution fails. Past failures are forgotten between episodes, and the same solver is used whether a task needs it or not. These weaknesses are easy to see in simple puzzles. In River Crossing a plan can reach the goal while breaking the safety rule on the way. In Sokoban a box pushed into a corner can never be recovered. In Rush Hour two blocked vehicles can seal a row.</w:t>
+        <w:t>We looked at what those limits mean in small puzzles where the rules are exact. In River Crossing a plan can reach the far bank after leaving the missionaries outnumbered on the way, and because the environment accepts every move, a pipeline that checks only legality reports success. In Sokoban one push into a corner ends the game, but the pipeline learns this only when the search comes back empty. In Rush Hour two stuck vehicles can seal a row. In each case a short rule check would have caught the problem before any search effort was spent.</w:t>
       </w:r>
     </w:p>
     <w:p>
@@ -539,7 +539,7 @@
         <w:rPr>
           <w:rFonts w:ascii="Times New Roman" w:hAnsi="Times New Roman"/>
         </w:rPr>
-        <w:t>The contributions of this paper are: (i) a per-game move validator that rejects moves the rules forbid and lowers confidence in risky ones before they enter the graph; (ii) an experience store that scales confidence by the history of each state and move; (iii) one move score combining goal progress, confidence and step budget; (iv) adaptive path selection, with A* when one piece can move and a constraint solver when several must be coordinated; and (v) an evaluation on seven games, including 3,000 externally defined levels and three harder puzzles, with an independent safety audit, held-out checks, a comparison of search methods, and negative results reported next to positive ones. The plan proposers in this work are programs, not language models, which makes every experiment reproducible and lets the quality of the proposer be controlled.</w:t>
+        <w:t>This paper adds four pieces to the pipeline and tests them on seven games. A rule checker for each game rejects forbidden moves and lowers confidence in suspicious ones. An experience store remembers which moves failed in earlier episodes. A cost function combines progress toward the goal, confidence and the remaining step budget into one number per move. A selection rule sends single-piece problems to A* and multi-piece problems to a constraint solver. We also compare plain search methods (BFS, DFS, weighted A* and meet in the middle) on the same games, to find out whether a different proposer would help more than any of the additions. The proposers are ordinary programs, not language models, so every run can be repeated from a seed and we can set how good the candidate plans are.</w:t>
       </w:r>
     </w:p>
     <w:p>
@@ -575,7 +575,7 @@
         <w:rPr>
           <w:rFonts w:ascii="Times New Roman" w:hAnsi="Times New Roman"/>
         </w:rPr>
-        <w:t>Several lines of work combine reasoning with action. ReAct [2] interleaves reasoning with actions and observations. Tree of Thoughts [3] searches a tree of reasoning steps with look-ahead and backtracking, and Graph of Thoughts [4] generalizes this to an arbitrary graph in which paths can merge. Reflexion [5] uses verbal feedback from past failures, Toolformer [6] teaches models to call tools, and chain-of-thought prompting [7] elicits step-by-step reasoning. Plan-and-Solve [8] and ReWOO [9] separate planning from execution. TAPE [1] combines a merged plan graph with an external solver and evaluates on Sokoban, ALFWorld [10], MuSiQue [11] and GSM8K-Hard, a harder variant of GSM8K [12].</w:t>
+        <w:t>Work on language-model agents falls into three groups. One group alternates reasoning with acting: ReAct [2] interleaves thoughts and tool calls, Reflexion [5] adds a written memory of earlier failures, and Toolformer [6] trains a model to decide when to call a tool. A second group searches over reasoning steps. Tree of Thoughts [3] and Graph of Thoughts [4] expand and score alternatives, with the graph version letting paths merge, while chain-of-thought prompting [7], Plan-and-Solve [8] and ReWOO [9] fix the plan before acting. The third is TAPE [1], which builds a merged plan graph and gives path selection to an external solver. It was evaluated on Sokoban, ALFWorld [10], MuSiQue [11] and GSM8K-Hard, which is built on GSM8K [12].</w:t>
       </w:r>
     </w:p>
     <w:p>
@@ -589,7 +589,7 @@
         <w:rPr>
           <w:rFonts w:ascii="Times New Roman" w:hAnsi="Times New Roman"/>
         </w:rPr>
-        <w:t>These systems check a plan mainly by acting on it. None validates a proposed move against known environment rules before trusting it, feedback from failures is textual rather than a per-move confidence, and the solver in TAPE is fixed per task. There is therefore little guidance on how to catch a fatal move early, and how to choose a solver per task.</w:t>
+        <w:t>These systems judge a plan by running it or by asking a model. None tests a proposed step against a rule that the task's designer wrote down. Reflexion's memory is text, so it cannot change the cost of one particular move. TAPE is closest to our setting, but it trusts every move it is shown and fixes the solver in advance.</w:t>
       </w:r>
     </w:p>
     <w:p>
@@ -603,7 +603,7 @@
         <w:rPr>
           <w:rFonts w:ascii="Times New Roman" w:hAnsi="Times New Roman"/>
         </w:rPr>
-        <w:t>Search and puzzle complexity provide the background for the evaluation. A* [13] is the standard heuristic shortest-path method, and weighted A* [18] trades plan quality for speed by inflating the heuristic. Iterative-deepening A* [19] made optimal sliding-tile solving practical, pattern databases did the same for the Rubik's cube [20], and the cube has diameter twenty [21]. Sokoban [14] and Rush Hour [15] are PSPACE-complete, which makes them hard, structured test beds. Pruning dead corners is a standard Sokoban solver technique, used here as a validator and measured, without claiming it as new. Peg Solitaire has a classical tool for proving a position lost, the pagoda function [22], [23]. AO* solves AND/OR graphs, where an action has several possible outcomes, and LAO* [24] extends it to graphs with loops. The public Boxoban level set [16] and the OR-Tools CP-SAT solver [17] are used in the experiments.</w:t>
+        <w:t>The search literature supplies the tools for testing this. Weighted A* [18] trades plan length for speed. Iterative deepening [19] made optimal sliding-tile solving practical, pattern databases did the same for the Rubik's cube [20], and the cube's diameter is twenty moves [21]. Sokoban [14] and Rush Hour [15] are PSPACE-complete. Dead-corner pruning is a standard Sokoban technique, so we treat it as a baseline to measure and not as a contribution. Peg Solitaire has a proof tool, the pagoda function [22], [23], which we use as a checker. AO* handles actions with several outcomes and LAO* [24] extends it to graphs with cycles; Section V-G explains why neither is needed here. We use the public Boxoban levels [16] and the CP-SAT solver in OR-Tools [17].</w:t>
       </w:r>
     </w:p>
     <w:p>
@@ -639,7 +639,7 @@
         <w:rPr>
           <w:rFonts w:ascii="Times New Roman" w:hAnsi="Times New Roman"/>
         </w:rPr>
-        <w:t>The methodology adds a checking and selection layer to the TAPE pipeline. All games implement one interface (actions, a step function, a goal test, a heuristic distance, and a count of independently movable pieces), so a new game plugs into the pipeline without changing it. The layer is proposer-agnostic: it takes candidate plans from any source.</w:t>
+        <w:t>Every game implements the same six-method interface: the list of actions, a step function that returns the next state and whether the move was legal, a goal test, a heuristic distance to the goal, a count of independently movable pieces, and a text renderer. Nothing downstream depends on a particular game, so adding one means writing that interface and a checker.</w:t>
       </w:r>
     </w:p>
     <w:p>
@@ -668,7 +668,7 @@
         <w:rPr>
           <w:rFonts w:ascii="Times New Roman" w:hAnsi="Times New Roman"/>
         </w:rPr>
-        <w:t>Given the current state, the pipeline proceeds in five stages, shown in Fig. 1. The proposer returns several candidate plans. Each plan is simulated move by move, and equal states merge into one node of a plan graph. The checker judges every move and the experience store adjusts its confidence. Each remaining move receives a cost, and a solver finds the cheapest path to the goal. The path is executed, and on a mismatch between the predicted and the real state the failure is recorded and planning restarts from the real state. The proposing, merging and executing stages reproduce TAPE, and the checking and choosing stages are the additions.</w:t>
+        <w:t>Fig. 1 shows one planning round. The proposer returns candidate plans from the current state. We replay each plan move by move and merge equal states into one node of a directed graph. The checker then judges every move and the experience store adjusts its confidence. Each surviving move gets a cost, and the solver finds the cheapest path from the current state to a goal state. That path is executed. If an executed move does not produce the predicted state, we record the failure and start a new round from the real state. Proposing, merging and executing follow TAPE. Checking and the cost-based choice of solver are ours.</w:t>
       </w:r>
     </w:p>
     <w:p>
@@ -752,7 +752,7 @@
         <w:rPr>
           <w:rFonts w:ascii="Times New Roman" w:hAnsi="Times New Roman"/>
         </w:rPr>
-        <w:t>A validator returns, for a move from state s to s', either reject, or accept with a confidence in (0, 1]. A rejected move is never added to the graph, so any candidate plan that uses it ends there. One validator was written for each game.</w:t>
+        <w:t>For a move from state s to state s', a validator returns either a rejection or an acceptance with a confidence between 0 and 1. A rejected move never becomes an edge, so every candidate plan that uses it ends there. We wrote one validator per game.</w:t>
       </w:r>
     </w:p>
     <w:p>
@@ -766,7 +766,7 @@
         <w:rPr>
           <w:rFonts w:ascii="Times New Roman" w:hAnsi="Times New Roman"/>
         </w:rPr>
-        <w:t>For Sokoban, pushing a box into a corner that is not a goal is rejected, since it can never be recovered, and a box resting against a wall off a goal is accepted at confidence 0.5. For River Crossing, a state in which cannibals outnumber missionaries on either bank is rejected. The step function deliberately does not enforce this rule, so it lives only in the validator. For Rush Hour, a row filled entirely by horizontal vehicles that block the target is rejected, and a blocker that is itself stuck is accepted at confidence 0.5.</w:t>
+        <w:t>In Sokoban we reject a push that puts a box in a corner that is not a goal, since the box can never move again, and we accept a box resting against a wall off a goal at confidence 0.5. In River Crossing we reject any state with more cannibals than missionaries on a bank that still has a missionary. The step function does not enforce this on purpose, so only the validator knows the rule. In Rush Hour we reject a row filled completely by horizontal vehicles that blocks the target, and accept a blocker that is itself stuck at confidence 0.5.</w:t>
       </w:r>
     </w:p>
     <w:p>
@@ -780,7 +780,7 @@
         <w:rPr>
           <w:rFonts w:ascii="Times New Roman" w:hAnsi="Times New Roman"/>
         </w:rPr>
-        <w:t>For Peg Solitaire the checker uses pagoda functions. A pagoda is a weight w(p) &gt;= 0 per hole with w(a) + w(b) &gt;= w(c) for every jump of a over b into c. A jump removes the pegs at a and b and adds one at c, so the total weight of the pegs never rises. A position whose total is below the weight of the goal, one peg in the centre, cannot win and is rejected. Twelve pagodas are obtained from a small linear programme and every inequality is re-checked after solving. For the 24-puzzle a move is rejected if the resulting arrangement is unsolvable by the inversion-parity rule. For the Rubik's cube a state is rejected if it breaks any of four cubie invariants: every slot holds a real cubie once, corner twists sum to 0 mod 3, edge flips sum to 0 mod 2, and corner and edge permutations have equal parity. The last two rules are never broken by a legal move, so they only fire on an unsolvable start.</w:t>
+        <w:t>Peg Solitaire uses pagoda functions. A pagoda assigns a weight w(p) &gt;= 0 to each hole so that w(a) + w(b) &gt;= w(c) for every jump of a peg from a over b into c. A jump removes the pegs at a and b and adds one at c, so the total weight of the pegs can never go up. If a position's total is already below the weight of the goal, which is one peg in the centre, the goal is unreachable. We get twelve pagodas from a small linear programme and recheck every inequality after solving. For the 24-puzzle we reject any move whose result is unsolvable under the inversion-parity rule. For the Rubik's cube we reject a state that breaks one of four cubie invariants: each slot holds a real cubie exactly once, corner twists sum to 0 mod 3, edge flips sum to 0 mod 2, and corner and edge permutations have the same parity. Legal moves never break the last two rules, so on those games the checker only matters when the start itself is unsolvable.</w:t>
       </w:r>
     </w:p>
     <w:p>
@@ -809,7 +809,7 @@
         <w:rPr>
           <w:rFonts w:ascii="Times New Roman" w:hAnsi="Times New Roman"/>
         </w:rPr>
-        <w:t>A SQLite table records successes and failures per level, state and move. Confidence is Laplace-smoothed, where s and f are the recorded successes and failures:</w:t>
+        <w:t>A SQLite table keeps the number of successes s and failures f for each level, state and move. Confidence is Laplace-smoothed, so that a single early failure does not set trust to zero:</w:t>
       </w:r>
     </w:p>
     <w:p>
@@ -850,7 +850,7 @@
         <w:rPr>
           <w:rFonts w:ascii="Times New Roman" w:hAnsi="Times New Roman"/>
         </w:rPr>
-        <w:t>With no history the confidence is one, and it multiplies the validator's confidence. One recorded failure lowers trust from 1.00 to 0.33.</w:t>
+        <w:t>A move with no history has confidence 1. The value multiplies the validator's confidence, and one recorded failure takes trust from 1.00 to 0.33.</w:t>
       </w:r>
     </w:p>
     <w:p>
@@ -879,7 +879,7 @@
         <w:rPr>
           <w:rFonts w:ascii="Times New Roman" w:hAnsi="Times New Roman"/>
         </w:rPr>
-        <w:t>Each accepted move receives an integer cost, scaled by ten for the integer solver:</w:t>
+        <w:t>CP-SAT needs integer coefficients, so each accepted move gets an integer cost, scaled by ten:</w:t>
       </w:r>
     </w:p>
     <w:p>
@@ -920,7 +920,7 @@
         <w:rPr>
           <w:rFonts w:ascii="Times New Roman" w:hAnsi="Times New Roman"/>
         </w:rPr>
-        <w:t>where r = max(0, h(s') - h(s)) is how much the move increases the heuristic distance to the goal, c is the confidence, and t / T is the share of the step budget used. The weights are defaults; Section V-C tests whether tuning improves them.</w:t>
+        <w:t>Here r = max(0, h(s') - h(s)) is how far the move increases the heuristic distance to the goal, c is the confidence, and t / T is the fraction of the step budget already used. The weights 1.5, 4.0 and 2.0 are our defaults. Section V-C reports whether tuning improved them.</w:t>
       </w:r>
     </w:p>
     <w:p>
@@ -935,7 +935,7 @@
           <w:i/>
           <w:sz w:val="20"/>
         </w:rPr>
-        <w:t>E. Adaptive Path Selection and Replanning</w:t>
+        <w:t>E. Path Selection and Replanning</w:t>
       </w:r>
     </w:p>
     <w:p>
@@ -949,7 +949,7 @@
         <w:rPr>
           <w:rFonts w:ascii="Times New Roman" w:hAnsi="Times New Roman"/>
         </w:rPr>
-        <w:t>Path selection is A* with the same cost when the state has one independently movable piece, such as a single Sokoban box or the River Crossing boat, and CP-SAT when it has several, such as several boxes or vehicles whose routes can conflict. The chosen path is executed move by move. On a mismatch the failure is recorded in the experience store and planning restarts from the real state, up to a replan limit.</w:t>
+        <w:t>The selection rule reads the number of independently movable pieces. With one piece, such as a single Sokoban box or the River Crossing boat, the problem is a shortest path and we run A* with the cost above. With several pieces, such as several boxes or vehicles whose routes can conflict, we formulate the path as a one-unit flow and solve it with CP-SAT. The chosen path is executed move by move. After a mismatch we write the failure to the store and plan again from the real state, up to a fixed number of replans.</w:t>
       </w:r>
     </w:p>
     <w:p>
@@ -985,7 +985,7 @@
         <w:rPr>
           <w:rFonts w:ascii="Times New Roman" w:hAnsi="Times New Roman"/>
         </w:rPr>
-        <w:t>The evaluation asks which of the additions change the outcome, on which games, and by how much. Every experiment is a controlled comparison in which only the studied component differs.</w:t>
+        <w:t>Each experiment changes one component and holds the rest fixed.</w:t>
       </w:r>
     </w:p>
     <w:p>
@@ -1014,7 +1014,7 @@
         <w:rPr>
           <w:rFonts w:ascii="Times New Roman" w:hAnsi="Times New Roman"/>
         </w:rPr>
-        <w:t>Seven games share the interface. Sokoban has four hand-made levels with one to three boxes, the hardest with a 29-move optimum. River Crossing has three missionary-cannibal pairs and a two-seat boat, with an 11-move optimum. Rush Hour is a six-move board. Boxoban [16] contributes one file from each difficulty set (unfiltered, medium and hard), 1,000 ten-by-ten levels with four boxes each, 3,000 levels in total. Three harder games are added: Peg Solitaire on the English board (about 3.6 million reachable positions), the 24-puzzle (about 7.8 x 10^24 states) and the 3x3x3 Rubik's cube (about 4.3 x 10^19 states).</w:t>
+        <w:t>Sokoban has four hand-made levels with one to three boxes, the hardest with a 29-move optimum. River Crossing has three missionary-cannibal pairs and a two-seat boat, with an 11-move optimum. Rush Hour is a six-by-six board solved in six moves. Boxoban [16] adds one file from each of its three difficulty sets (unfiltered, medium and hard), 1,000 ten-by-ten levels with four boxes each. Peg Solitaire is the English board, with about 3.6 million reachable positions. The 24-puzzle has about 7.8 x 10^24 states and the 3x3x3 Rubik's cube about 4.3 x 10^19.</w:t>
       </w:r>
     </w:p>
     <w:p>
@@ -1043,7 +1043,7 @@
         <w:rPr>
           <w:rFonts w:ascii="Times New Roman" w:hAnsi="Times New Roman"/>
         </w:rPr>
-        <w:t>No language model is used. A goal-biased proposer returns one breadth-first-search plan plus noisy walks, so its absolute success rates are optimistic. An adversarial proposer returns uniformly random moves. A quality proposer mixes guided and random walks, or takes an optimal plan and randomizes each step with probability one minus the quality. A weighted A* proposer runs under a per-search node budget and is used for Boxoban, Peg Solitaire and the 24-puzzle. A meet-in-the-middle proposer searches from the start and from the solved state at once and is used for the cube. Plain BFS and DFS proposers are used in Section V-G.</w:t>
+        <w:t>Our first proposer planted one shortest plan, found by BFS, among noisy walks. On River Crossing that plan is nine moves long and passes through unsafe states, because the step function accepts them. We therefore let the planted plan use the validator, which gives the textbook 11-move answer. An adversarial proposer returns uniformly random moves. A quality proposer either mixes guided and random walks or takes an optimal plan and randomizes each step with a set probability. For Boxoban, Peg Solitaire and the 24-puzzle we use weighted A* under a node budget, and for the cube a search that grows from the start and from the solved cube until the two meet. Section V-G also uses plain BFS and DFS.</w:t>
       </w:r>
     </w:p>
     <w:p>
@@ -1058,7 +1058,7 @@
           <w:i/>
           <w:sz w:val="20"/>
         </w:rPr>
-        <w:t>C. Metrics</w:t>
+        <w:t>C. Metrics and Statistics</w:t>
       </w:r>
     </w:p>
     <w:p>
@@ -1072,65 +1072,7 @@
         <w:rPr>
           <w:rFonts w:ascii="Times New Roman" w:hAnsi="Times New Roman"/>
         </w:rPr>
-        <w:t>Safe success means the goal is reached and no executed move is rejected by an independent domain auditor, whether or not the configuration used a validator. This matters because plain success hides rule-breaking in games such as River Crossing, whose step function does not enforce its rules. Replans per episode, planning time, and, for Boxoban, the share of levels solved within a node budget are also reported.</w:t>
-      </w:r>
-    </w:p>
-    <w:p>
-      <w:pPr>
-        <w:keepNext/>
-        <w:spacing w:before="160" w:after="80"/>
-        <w:jc w:val="left"/>
-      </w:pPr>
-      <w:r>
-        <w:rPr>
-          <w:rFonts w:ascii="Times New Roman" w:hAnsi="Times New Roman"/>
-          <w:i/>
-          <w:sz w:val="20"/>
-        </w:rPr>
-        <w:t>D. Statistical Treatment</w:t>
-      </w:r>
-    </w:p>
-    <w:p>
-      <w:pPr>
-        <w:keepNext w:val="0"/>
-        <w:spacing w:before="0" w:after="0"/>
-        <w:ind w:firstLine="288"/>
-        <w:jc w:val="both"/>
-      </w:pPr>
-      <w:r>
-        <w:rPr>
-          <w:rFonts w:ascii="Times New Roman" w:hAnsi="Times New Roman"/>
-        </w:rPr>
-        <w:t>Proportions carry 95% Wilson intervals. Paired comparisons report the mean difference and its standard error over seeds, with identical failures and seeds in both arms. The weight search is fitted on training seeds and checked on unseen seeds.</w:t>
-      </w:r>
-    </w:p>
-    <w:p>
-      <w:pPr>
-        <w:keepNext/>
-        <w:spacing w:before="160" w:after="80"/>
-        <w:jc w:val="left"/>
-      </w:pPr>
-      <w:r>
-        <w:rPr>
-          <w:rFonts w:ascii="Times New Roman" w:hAnsi="Times New Roman"/>
-          <w:i/>
-          <w:sz w:val="20"/>
-        </w:rPr>
-        <w:t>E. Evaluation Scope</w:t>
-      </w:r>
-    </w:p>
-    <w:p>
-      <w:pPr>
-        <w:keepNext w:val="0"/>
-        <w:spacing w:before="0" w:after="0"/>
-        <w:ind w:firstLine="288"/>
-        <w:jc w:val="both"/>
-      </w:pPr>
-      <w:r>
-        <w:rPr>
-          <w:rFonts w:ascii="Times New Roman" w:hAnsi="Times New Roman"/>
-        </w:rPr>
-        <w:t>The evaluation measures system-level behavior on synthetic proposers. It does not use a language model and cannot be compared with the numbers reported for TAPE, whose benchmarks ALFWorld, MuSiQue and GSM8K-Hard require one.</w:t>
+        <w:t>We call an episode a safe success when it reaches the goal and an independent auditor, which applies the game's rules whether or not the configuration under test used a validator, rejects none of its executed moves. Plain success would score River Crossing's baseline at 100% even though it breaks the rule every time. We also report replans per episode, planning time, and, for Boxoban, the share of levels solved within a node budget. Proportions carry 95% Wilson intervals. Paired comparisons use identical hazards and seeds in both arms and report the mean difference with its standard error. The weight search was fitted on training seeds and checked on seeds it had not seen.</w:t>
       </w:r>
     </w:p>
     <w:p>
@@ -1166,7 +1108,7 @@
         <w:rPr>
           <w:rFonts w:ascii="Times New Roman" w:hAnsi="Times New Roman"/>
         </w:rPr>
-        <w:t>A summary of the main measurements is presented in Table 1. The sections below give the experiments behind each row, including the ones where the extensions did not help.</w:t>
+        <w:t>Table 1 collects the headline measurements. The subsections below give the experiment behind each row, including the ones where an addition did nothing.</w:t>
       </w:r>
     </w:p>
     <w:p>
@@ -1194,7 +1136,7 @@
           <w:rFonts w:ascii="Times New Roman" w:hAnsi="Times New Roman"/>
           <w:sz w:val="20"/>
         </w:rPr>
-        <w:t>SUMMARY OF KEY RESULTS</w:t>
+        <w:t>SUMMARY OF RESULTS</w:t>
       </w:r>
     </w:p>
     <w:tbl>
@@ -1787,7 +1729,7 @@
         <w:rPr>
           <w:rFonts w:ascii="Times New Roman" w:hAnsi="Times New Roman"/>
         </w:rPr>
-        <w:t>Five configurations were compared: the baseline, with the validator, with the validator and the experience store, with adaptive selection, and with everything. They ran on six benchmarks, 30 episodes per cell, with a 15% slip probability and the goal-biased proposer. On River Crossing the baseline reaches the goal in every episode but never safely: safe success is 0%, and with the validator it is 100% while raw success is unchanged. The validator converts unsafe successes into safe ones. Adaptive selection saves time where one piece moves and ties elsewhere, with identical success and action counts, as Table 2 shows. Hard Sokoban stays near 53% in every configuration, so none of the extensions changes it.</w:t>
+        <w:t>We ran five configurations on six benchmarks, 30 episodes per cell, with a 15% slip probability and the goal-biased proposer: the baseline, validator only, validator plus store, adaptive selection only, and everything. The baseline reaches the River Crossing goal in every episode and never does so safely. With the validator, safe success is 100% and raw success does not change. Adaptive selection saves time where one piece moves and does nothing elsewhere (Table 2), with identical success and action counts. Hard Sokoban stayed near 53% in all five configurations.</w:t>
       </w:r>
     </w:p>
     <w:p>
@@ -2254,7 +2196,7 @@
         <w:rPr>
           <w:rFonts w:ascii="Times New Roman" w:hAnsi="Times New Roman"/>
         </w:rPr>
-        <w:t>With uniform random slips the store gave no benefit, since there is nothing state-dependent to learn. Therefore 25% of the state and move pairs were made to slip with probability 0.7, and validator-only was compared with validator plus store, paired over 20 hazard seeds of 30 episodes (Table 3). The store reduces replans by roughly 14% on two games and does nothing on the others. A possible reason, not tested here, is that with more routes the candidates rarely contain a detour around a learned hazard, and the store can only reweight edges already in the graph.</w:t>
+        <w:t>With uniform random slips the store had nothing to learn and changed nothing. We then made 25% of the state and move pairs slip with probability 0.7 and compared validator only with validator plus store, paired over 20 hazard seeds of 30 episodes (Table 3). The store cut late-episode replans by about 14% on one-box Sokoban and River Crossing, did not separate from zero on Rush Hour, and made no difference on two-box Sokoban. We have not tested why, but a plausible reason is that two-box levels offer more routes and the 30 candidates rarely include a detour around a learned hazard. The store can only reweight edges that are already in the graph.</w:t>
       </w:r>
     </w:p>
     <w:p>
@@ -2721,7 +2663,7 @@
         <w:rPr>
           <w:rFonts w:ascii="Times New Roman" w:hAnsi="Times New Roman"/>
         </w:rPr>
-        <w:t>Eighty combinations of the three penalty weights were searched on 8 training seeds, and the top three and the defaults were re-run on 16 unseen seeds. The objective was replans plus three times the failure rate, averaged over four benchmarks. The best training point had objective 3.906 against 4.219 for the defaults, which ranked 23rd of 80, but it was worse on held-out seeds (+0.122 +/- 0.111). No candidate beat the defaults by more than one standard error. The defaults are kept; this is a null result, not proof that they are optimal.</w:t>
+        <w:t>We searched 80 combinations of the three penalty weights on 8 training seeds, then reran the top three and our defaults on 16 unseen seeds. The objective was replans plus three times the failure rate, averaged over four benchmarks. The best training point scored 3.906 against 4.219 for the defaults, which ranked 23rd of 80, but on the unseen seeds it was worse by 0.122 +/- 0.111. No candidate beat the defaults by more than one standard error, so we kept them. This shows only that the search found nothing better, not that the defaults are optimal.</w:t>
       </w:r>
     </w:p>
     <w:p>
@@ -2750,7 +2692,7 @@
         <w:rPr>
           <w:rFonts w:ascii="Times New Roman" w:hAnsi="Times New Roman"/>
         </w:rPr>
-        <w:t>To see how much the layer helps as proposer quality changes, the baseline was compared with the full layer under the state-dependent failure model. A proposer built only from random and guided walks hit a floor (at most 17% success on the easiest non-trivial level) and was uninformative. With a proposer that corrupts an optimal plan, the extra layers barely change the goal-reach rate on Sokoban and Rush Hour: almost every paired difference is within two standard errors of zero. River Crossing stays at 0% safe success in both arms, because this proposer never learns the safety rule, so its optimal plan is the unsafe one and the validator correctly rejects it. The validator does cut replans by 2.7 to 3.4 per episode at quality 0.7 and above. A validator filters proposals; it does not create them.</w:t>
+        <w:t>We then asked how much the layer matters as the proposer gets better or worse. A proposer built only from random and guided walks barely solved the easiest non-trivial level (17% at best), so it told us little. With a proposer that corrupts an optimal plan, the full layer and the baseline differed by less than two standard errors on almost every Sokoban and Rush Hour comparison. River Crossing stayed at 0% safe success in both arms: this proposer never learns the safety rule, so its best plan is the unsafe one, and the validator correctly rejects it. What the validator did buy was 2.7 to 3.4 fewer replans per episode at quality 0.7 and above. It can remove bad plans, but it cannot supply a good one that the proposer never produced.</w:t>
       </w:r>
     </w:p>
     <w:p>
@@ -2779,7 +2721,7 @@
         <w:rPr>
           <w:rFonts w:ascii="Times New Roman" w:hAnsi="Times New Roman"/>
         </w:rPr>
-        <w:t>Solve rate is the share of 1,000 levels per set for which any of four searches finds a plan within the node budget. Without pruning the search is unaware of dead corners, and with the checker it prunes them (Fig. 2, Table 4). The checker wins in all 15 cells, the 95% intervals do not overlap in any of them, and pruning never missed a level that no-pruning solved. The gain grows with difficulty: at 10,000 nodes it is 8, 19 and 22 points, and at 30,000 nodes 3, 17 and 28 points. The checker also expands 20%, 25% and 23% fewer nodes per level at the full budget. Merging plans did not shorten paths: the merged path was shorter than the best single plan on one level in total and longer on 19, 9 and 5 levels across the three sets, because the solver minimizes the cost of Section III-D, not move count.</w:t>
+        <w:t>Here a level counts as solved if any of four searches finds a plan within the node budget. Without pruning the search does not know about dead corners, and with the checker it skips them (Fig. 2, Table 4). The checker did better in all 15 combinations of set and budget, with non-overlapping 95% intervals, and never missed a level that the unpruned search solved. The gain grows with difficulty: at 10,000 nodes it is 8, 19 and 22 points on the three sets, and at 30,000 nodes 3, 17 and 28 points. At the full budget the checker also expands 20%, 25% and 23% fewer nodes per level. Merging plans did not shorten any path in practice. It produced a shorter path than the best single plan on one level out of 2,680 solved, and a longer one on 33, because the solver minimizes the cost in Eq. (2) and not the number of moves.</w:t>
       </w:r>
     </w:p>
     <w:p>
@@ -3530,7 +3472,7 @@
         <w:rPr>
           <w:rFonts w:ascii="Times New Roman" w:hAnsi="Times New Roman"/>
         </w:rPr>
-        <w:t>Peg Solitaire is the one game where the checker helps during play. A test confirms by exhaustive search that every sampled position the pagoda checker rejects is truly unsolvable. From the real start the checker cuts the search from 139,048 to 82,009 nodes, 41% fewer. On positions built by playing jumps backwards from the goal, so each is solvable, within 60,000 nodes it solves 98% against 93% at 22 jumps and 75% against 58% at 26 jumps, using 19 to 31% fewer nodes, and it never lost a position the plain search solved (Fig. 3, Table 5).</w:t>
+        <w:t>Peg Solitaire is the only game where the checker helps during play. We tested its soundness by sampling positions that the pagoda checker rejects and proving each unsolvable by exhaustive search; none was solvable. From the real start position the checker cuts the search from 139,048 to 82,009 nodes, a 41% saving. Our first benchmark used positions reached by random play, but most of them could not be solved within the budget and the search could not tell whether they were lost, so it separated nothing. We rebuilt it by playing jumps backwards from the goal, which guarantees that every position is solvable. Within 60,000 nodes the checker solves 98% of positions 22 jumps from the goal against 93% without it, and 75% against 58% at 26 jumps, using 19 to 31% fewer nodes. It never lost a position that the plain search solved (Fig. 3, Table 5).</w:t>
       </w:r>
     </w:p>
     <w:p>
@@ -4164,7 +4106,7 @@
         <w:rPr>
           <w:rFonts w:ascii="Times New Roman" w:hAnsi="Times New Roman"/>
         </w:rPr>
-        <w:t>For the 24-puzzle and the Rubik's cube the parity rule and the cubie invariants change no result on a solvable start, which was verified. They guard the input: on an unsolvable start, with two tiles swapped or one corner twisted, the plain search spends its whole budget of 60,000 and 400,000 nodes, and the check stops it after at most one node. Weighted A* solves random-walk scrambles of the 24-puzzle 100%, 95%, 73% and 57% of the time at 20, 40, 60 and 80 moves, and the meet-in-the-middle search solves every cube scramble of 4 to 8 moves. For these two games the checker is a start gate, not a planning improvement.</w:t>
+        <w:t>The 24-puzzle and the cube behave differently. Legal moves never break the parity rule or the cubie invariants, and we confirmed that the checks change no result on a solvable start. They matter when the input itself is unsolvable. With two tiles swapped, or one cube corner twisted, the plain search burned its whole budget (60,000 and 400,000 nodes) and the check stopped it after at most one. Weighted A* solved random-walk scrambles of the 24-puzzle at rates of 100%, 95%, 73% and 57% for 20, 40, 60 and 80 moves, and the meet-in-the-middle search solved every cube scramble of 4 to 8 moves.</w:t>
       </w:r>
     </w:p>
     <w:p>
@@ -4193,7 +4135,7 @@
         <w:rPr>
           <w:rFonts w:ascii="Times New Roman" w:hAnsi="Times New Roman"/>
         </w:rPr>
-        <w:t>BFS, DFS, weighted A* and meet in the middle were compared on every game each can run on, with no checkers so that only the algorithm differs (budget 100,000 nodes; one instance for the small games, 20 for the rest). The result is summarized in Table 6 and Fig. 4; each cell is the percentage solved and the mean nodes, with k for thousands.</w:t>
+        <w:t>We ran BFS, DFS, weighted A* and meet in the middle on every game each can handle, without checkers, with a budget of 100,000 nodes. The small games had one instance and the others 20 (Table 6, Fig. 4).</w:t>
       </w:r>
     </w:p>
     <w:p>
@@ -5716,7 +5658,7 @@
         <w:rPr>
           <w:rFonts w:ascii="Times New Roman" w:hAnsi="Times New Roman"/>
         </w:rPr>
-        <w:t>Depth-first search helps in one game, by a wide margin. Every Peg Solitaire solution is exactly 31 jumps, so a depth-first search that never revisits a state loses nothing. From the real start it needs 10,845 nodes, against 139,048 for weighted A*, while BFS finds nothing in 400,000. With the pagoda checker pruning, DFS needs 6,455. On positions 22 jumps from the goal, weighted A* is slightly better (95% against 85%). BFS helps only where the state space is tiny, and is the only method that always returns a shortest plan. Weighted A* is the best general choice; DFS finds Boxoban plans about 2.5 times longer. Meet in the middle guarantees a shortest plan but used more nodes than A* on short cube scrambles and ran out on the 40-move 24-puzzle.</w:t>
+        <w:t>DFS won on one game and by a wide margin. Every Peg Solitaire solution has exactly 31 jumps, so a depth-first search that never revisits a state gives up nothing. From the real start it needed 10,845 nodes, or 6,455 with the pagoda checker, where weighted A* needed 139,048 and BFS found no plan in 400,000. On a position that weighted A* could not solve in 20,000 nodes, DFS needed about 10,800. On positions 22 jumps from the goal the order reversed slightly, with weighted A* at 95% and DFS at 85%. BFS was enough only on River Crossing and Rush Hour, where it also returns the shortest plan. Weighted A* was the best general choice, though DFS plans on Boxoban were about 2.5 times longer than its plans. Meet in the middle guarantees a shortest plan, but on short cube scrambles it used more nodes than A* with our sticker-count heuristic, and it ran out of budget on the 40-move 24-puzzle.</w:t>
       </w:r>
     </w:p>
     <w:p>
@@ -5730,7 +5672,7 @@
         <w:rPr>
           <w:rFonts w:ascii="Times New Roman" w:hAnsi="Times New Roman"/>
         </w:rPr>
-        <w:t>AO* does not help here. It plans over graphs where an action can have several outcomes. Every game in this work is deterministic, so its graph has no AND nodes and AO* reduces to A*. It could matter for the slip model, where a move sometimes does nothing, but the slip returns to the same state and creates a loop, for which the relevant algorithm is LAO* [24]. It was not implemented. Node counts are expansions for BFS, DFS and A* and generated states for meet in the middle, so they should be compared loosely.</w:t>
+        <w:t>We did not implement AO*. It plans over graphs where an action has several possible outcomes, and each of our games is deterministic, so its graph has no AND nodes and it reduces to A*. It could matter for the slip model, where a move sometimes leaves the state unchanged. That outcome loops back to the same state, which is the case LAO* [24] was designed for. Node counts mean expansions for BFS, DFS and A*, and generated states for meet in the middle, so the last column is only roughly comparable.</w:t>
       </w:r>
     </w:p>
     <w:p>
@@ -5745,7 +5687,7 @@
           <w:i/>
           <w:sz w:val="20"/>
         </w:rPr>
-        <w:t>H. Integrated Interpretation</w:t>
+        <w:t>H. Reading the Results Together</w:t>
       </w:r>
     </w:p>
     <w:p>
@@ -5759,7 +5701,7 @@
         <w:rPr>
           <w:rFonts w:ascii="Times New Roman" w:hAnsi="Times New Roman"/>
         </w:rPr>
-        <w:t>The value of the layer depends on the proposer. Where the environment allows moves that are legal but forbidden by a rule, checking is decisive: River Crossing goes from 0% to 100% safe. Used as a pruner inside a search, the same idea solves substantially more real Boxoban levels within a fixed budget, and more so on harder sets. Adaptive selection is a plain efficiency gain. Failure memory helps only when failures are state-dependent and the candidates contain an alternative. On the harder games the checker is a different tool: for Peg Solitaire it is a proof that prunes during play, and for the 24-puzzle and the cube it stops an unsolvable start from consuming the search budget. Among search methods no single one dominates. When the proposer is already competent, the layer does not raise the goal-reach rate; its contribution is safety and fewer wasted replans.</w:t>
+        <w:t>The checker earns its place in two situations: when the environment accepts moves that its rules forbid, as in River Crossing, and when it can prune a search that would otherwise explore dead branches, as in Boxoban and Peg Solitaire. It does little when the proposer already finds good plans, and it cannot create a plan the proposer lacks. Adaptive selection is a small saving that depends only on piece count. The experience store is worth running when failures depend on the state and the candidates offer a detour. Among search methods, use depth-first search when every solution has the same length, meet in the middle when only the shortest plan will do and the state space is reversible, and weighted A* otherwise.</w:t>
       </w:r>
     </w:p>
     <w:p>
@@ -5774,7 +5716,7 @@
           <w:i/>
           <w:sz w:val="20"/>
         </w:rPr>
-        <w:t>I. Limitations and Threats to Validity</w:t>
+        <w:t>I. Limitations</w:t>
       </w:r>
     </w:p>
     <w:p>
@@ -5788,7 +5730,7 @@
         <w:rPr>
           <w:rFonts w:ascii="Times New Roman" w:hAnsi="Times New Roman"/>
         </w:rPr>
-        <w:t>There are some limitations to consider. First, the proposers are synthetic and no language model was used, so the results say nothing about real model failures. The goal-biased proposer plants a breadth-first plan, which inflates absolute success rates in Sections V-A and V-B, although the paired comparisons are less affected. Second, corner pruning is standard in Sokoban solvers, so Section V-E shows that the validator works as that pruner on external levels, not that pruning is new. Third, coverage is limited: one file per Boxoban set, one checker rule, and hand-made levels elsewhere. The harder games use random-walk scrambles, easier than uniformly random instances, and the cube is tested only to 8-move scrambles. Fourth, the numbers cannot be compared with TAPE's, since its benchmarks need a language model. Fifth, the weight search used 8 training seeds, so its ranking is noisy, and the search comparison has small instance counts and non-optimal plans from weighted A*. Last, merged paths were not shorter than the best single plan, so no claim is made that graph merging improves plan quality in these settings.</w:t>
+        <w:t>Our proposers are programs and we never tried a language model, so these results say nothing about how real model errors would behave. The goal-biased proposer plants a BFS plan, which makes absolute success rates in Sections V-A and V-B higher than a real proposer would give; the paired differences are less affected. Dead-corner pruning is standard in Sokoban solvers, so Section V-E shows only that our validator works as that pruner on external levels. Boxoban coverage is one file per set and one rule. The harder-game scrambles are random walks, which are easier than uniformly random instances, and we tested the cube only up to 8-move scrambles. We cannot compare with TAPE's reported numbers because its benchmarks need a language model. The weight search used 8 training seeds, so its ranking is noisy, the search comparison has few instances on the small games, and weighted A* returns plans that are not optimal, so a lower node count can come with a longer plan.</w:t>
       </w:r>
     </w:p>
     <w:p>
@@ -5824,20 +5766,7 @@
         <w:rPr>
           <w:rFonts w:ascii="Times New Roman" w:hAnsi="Times New Roman"/>
         </w:rPr>
-        <w:t>The framework provides a base for several extensions. As an immediate next step, a learned proposer, such as an imitation or reinforcement-learning policy, would give more realistic proposer errors than the synthetic ones used here (</w:t>
-      </w:r>
-      <w:r>
-        <w:rPr>
-          <w:rFonts w:ascii="Times New Roman" w:hAnsi="Times New Roman"/>
-          <w:b/>
-        </w:rPr>
-        <w:t>[TODO]</w:t>
-      </w:r>
-      <w:r>
-        <w:rPr>
-          <w:rFonts w:ascii="Times New Roman" w:hAnsi="Times New Roman"/>
-        </w:rPr>
-        <w:t xml:space="preserve"> confirm with the guide whether learned models are allowed). A second Sokoban rule, such as frozen boxes, and the remaining Boxoban files would show whether the gain grows. The slip model could be planned for, rather than replanned after, with an AND/OR search that handles loops such as LAO*. The same checking layer could be tested on benchmarks such as ALFWorld, MuSiQue and GSM8K-Hard once a language model proposer is allowed, which would also allow a direct comparison with TAPE. Finally, a written soundness argument for each validator, and stronger classical baselines such as a standard planner, would strengthen the claims.</w:t>
+        <w:t>The most useful next experiment is a learned proposer. We would train a policy by imitation on the Boxoban solutions we have and check whether checker pruning still saves nodes when the proposals contain realistic mistakes. A second Sokoban rule, such as frozen boxes, would show whether the Boxoban gain grows with more rules; the measure would be levels solved at 10,000 nodes. The slip model could be planned for in advance with LAO*, and the comparison would be expected replans against our replan-on-mismatch baseline. We would also write a soundness argument for each validator, as we did informally for the pagoda bound, and add a standard classical planner as a stronger baseline than plain A*.</w:t>
       </w:r>
     </w:p>
     <w:p>
@@ -5873,7 +5802,7 @@
         <w:rPr>
           <w:rFonts w:ascii="Times New Roman" w:hAnsi="Times New Roman"/>
         </w:rPr>
-        <w:t>A validation and adaptive-selection layer was built on the TAPE pipeline and evaluated on seven games without any language model. Rule checking made plans safe and made search solve more real levels, choosing the solver per task saved planning time, and failure memory reduced replans when failures depend on the state. A comparison of search methods found that depth-first search suits Peg Solitaire and weighted A* suits the rest, and that AO* does not apply to deterministic games. The framework does not claim to raise the goal-reach rate of a competent proposer; its contribution is safety, fewer wasted replans, and earlier detection of positions that cannot be won. Several hoped-for effects did not appear, and they are reported with the rest. Collectively, these results support a proposer-agnostic checking layer as a practical addition to plan-graph planners, to be validated further with learned proposers.</w:t>
+        <w:t>On these seven games the layer's value is mostly in what it prevents. It stops rule-breaking plans in River Crossing, wastes less search on dead branches in Boxoban and Peg Solitaire, and spends less solver time on single-piece problems. It did not raise the goal-reach rate of a proposer that already finds good plans, and two ideas we expected to help, weight tuning and plan merging, did nothing measurable. For Peg Solitaire the better change was to the search method: depth-first search with the pagoda checker solved the real start in 6,455 nodes against 139,048 for plain weighted A*.</w:t>
       </w:r>
     </w:p>
     <w:p>

</xml_diff>

<commit_message>
Paper: second rewrite, IEEE caption and abstract conventions, hand-drawn grayscale figures
Co-Authored-By: Claude Sonnet 5.5 <noreply@anthropic.com>
</commit_message>
<xml_diff>
--- a/paper/paper.docx
+++ b/paper/paper.docx
@@ -14,7 +14,7 @@
           <w:b/>
           <w:sz w:val="48"/>
         </w:rPr>
-        <w:t>A Validation and Adaptive-Selection Layer for Plan-Graph Planning</w:t>
+        <w:t>Rule Checking and Adaptive Solver Choice for Plan-Graph Planning</w:t>
       </w:r>
     </w:p>
     <w:tbl>
@@ -441,7 +441,7 @@
           <w:i/>
           <w:sz w:val="18"/>
         </w:rPr>
-        <w:t>Abstract</w:t>
+        <w:t>Abstract—</w:t>
       </w:r>
       <w:r>
         <w:rPr>
@@ -449,7 +449,7 @@
           <w:b/>
           <w:sz w:val="18"/>
         </w:rPr>
-        <w:t xml:space="preserve"> - TAPE plans by merging several candidate plans into one graph and letting a solver pick a path through it. It does not test a move against the rules of the task before trusting it, and it uses the same solver for every problem. We add a layer with three parts: a rule checker for each game that rejects or downweights moves, a store of past failures that adjusts how far each move is trusted, and a selection rule that picks A* or a constraint solver by the number of movable pieces. No language model is involved. We test the layer on seven games: Sokoban, River Crossing, Rush Hour, Peg Solitaire, the 24-puzzle, the Rubik's cube and 3,000 public Boxoban levels. On River Crossing the checker takes safe success from 0% to 100%. Used to prune a search, it raises the share of Boxoban levels solved at every node budget in all three difficulty sets, for example from 54% to 82% on the hard set at 30,000 nodes. Choosing A* for single-piece games cut planning time on one-box Sokoban from 52 ms to 8 ms, and remembering failures reduced replans on two of four games. Depth-first search needed thirteen times fewer nodes than weighted A* on Peg Solitaire, and AO* turned out not to apply to our deterministic games. Tuning the cost weights found nothing better than our defaults, and merging plans never produced a shorter path.</w:t>
+        <w:t>TAPE builds one graph out of several candidate plans and hands the choice of path to a solver. It never asks whether a move is allowed by the task's rules, and it uses one solver for every problem. We bolted three things onto it. Each game gets a rule checker that throws out or discounts moves. A small database remembers which moves failed before. And a cost-based rule picks A* or a constraint solver depending on how many pieces can move. No language model is used anywhere, because our guide did not allow one. We ran the result on Sokoban, River Crossing, Rush Hour, Peg Solitaire, the 24-puzzle, the Rubik's cube and 3,000 public Boxoban levels. The checker took River Crossing from 0% to 100% safe success. As a pruner it raised the share of solved Boxoban levels at every budget we tried; on the hard set at 30,000 nodes the figure went from 54% to 82%. Picking A* for single-piece games cut planning time on one-box Sokoban from 51.8 ms to 7.6 ms. Remembering failures reduced replans on two of four games. A plain depth-first search beat weighted A* by a factor of thirteen on Peg Solitaire. Two ideas did nothing: tuning the cost weights, and merging plans to shorten paths.</w:t>
       </w:r>
     </w:p>
     <w:p>
@@ -466,7 +466,7 @@
           <w:i/>
           <w:sz w:val="18"/>
         </w:rPr>
-        <w:t xml:space="preserve">Keywords - </w:t>
+        <w:t>Index Terms—</w:t>
       </w:r>
       <w:r>
         <w:rPr>
@@ -475,7 +475,7 @@
           <w:i/>
           <w:sz w:val="18"/>
         </w:rPr>
-        <w:t>plan graph, rule validation, adaptive solver selection, A* search, constraint programming, puzzle benchmarks, safe planning.</w:t>
+        <w:t>plan graph, rule validation, solver selection, A* search, constraint programming, puzzle benchmarks, safe planning.</w:t>
       </w:r>
     </w:p>
     <w:p>
@@ -511,7 +511,7 @@
         <w:rPr>
           <w:rFonts w:ascii="Times New Roman" w:hAnsi="Times New Roman"/>
         </w:rPr>
-        <w:t>A plan that looks fine on paper can fail at the first move that breaks a rule. TAPE [1] tries to avoid this by asking for several candidate plans, merging the states they share into one graph, and letting an integer-programming solver pick the cheapest feasible path. If the world then differs from the prediction, it plans again from the real state. Its authors name two limits: the graph is only as good as the plans that built it, and the solver is chosen in advance.</w:t>
+        <w:t>Anyone who has watched a planner walk into a wall knows the problem. A plan can look reasonable and still contain one move that the rules forbid. TAPE [1] asks a language model for several plans, merges the states they share into a graph, and lets an integer program find the cheapest path. When reality disagrees with the prediction it plans again from where it actually is. The authors list two weak points themselves. The graph is only as good as the plans that went into it. And the solver is picked ahead of time, whatever the problem looks like.</w:t>
       </w:r>
     </w:p>
     <w:p>
@@ -525,7 +525,7 @@
         <w:rPr>
           <w:rFonts w:ascii="Times New Roman" w:hAnsi="Times New Roman"/>
         </w:rPr>
-        <w:t>We looked at what those limits mean in small puzzles where the rules are exact. In River Crossing a plan can reach the far bank after leaving the missionaries outnumbered on the way, and because the environment accepts every move, a pipeline that checks only legality reports success. In Sokoban one push into a corner ends the game, but the pipeline learns this only when the search comes back empty. In Rush Hour two stuck vehicles can seal a row. In each case a short rule check would have caught the problem before any search effort was spent.</w:t>
+        <w:t>We wanted to see what those weak points cost in settings where the rules are exact and we can check everything. Three small cases made it concrete. In River Crossing a plan can reach the far bank after leaving more cannibals than missionaries somewhere along the way, and since our environment accepts every move, a pipeline that checks only legality calls this a success. In Sokoban a single push into a corner ends the level, yet the pipeline finds out only when the search comes back empty. In Rush Hour two stuck vehicles can seal a row for good. A short rule check catches each of these before any search effort is spent.</w:t>
       </w:r>
     </w:p>
     <w:p>
@@ -539,7 +539,7 @@
         <w:rPr>
           <w:rFonts w:ascii="Times New Roman" w:hAnsi="Times New Roman"/>
         </w:rPr>
-        <w:t>This paper adds four pieces to the pipeline and tests them on seven games. A rule checker for each game rejects forbidden moves and lowers confidence in suspicious ones. An experience store remembers which moves failed in earlier episodes. A cost function combines progress toward the goal, confidence and the remaining step budget into one number per move. A selection rule sends single-piece problems to A* and multi-piece problems to a constraint solver. We also compare plain search methods (BFS, DFS, weighted A* and meet in the middle) on the same games, to find out whether a different proposer would help more than any of the additions. The proposers are ordinary programs, not language models, so every run can be repeated from a seed and we can set how good the candidate plans are.</w:t>
+        <w:t>So we added four pieces and tested them on seven games. A checker per game rejects forbidden moves and lowers confidence in doubtful ones. An experience store remembers earlier failures. A cost function turns progress, confidence and the remaining step budget into one number per move. A selection rule sends single-piece problems to A* and the rest to a constraint solver. Afterwards we asked a blunter question: would a better search method have helped more than any of this? For that we compared BFS, DFS, weighted A* and a meet-in-the-middle search on the same games. Our proposers are ordinary programs. Every run can be repeated from a seed, and we can dial the quality of the candidate plans up and down, which a language model would not let us do.</w:t>
       </w:r>
     </w:p>
     <w:p>
@@ -575,7 +575,7 @@
         <w:rPr>
           <w:rFonts w:ascii="Times New Roman" w:hAnsi="Times New Roman"/>
         </w:rPr>
-        <w:t>Work on language-model agents falls into three groups. One group alternates reasoning with acting: ReAct [2] interleaves thoughts and tool calls, Reflexion [5] adds a written memory of earlier failures, and Toolformer [6] trains a model to decide when to call a tool. A second group searches over reasoning steps. Tree of Thoughts [3] and Graph of Thoughts [4] expand and score alternatives, with the graph version letting paths merge, while chain-of-thought prompting [7], Plan-and-Solve [8] and ReWOO [9] fix the plan before acting. The third is TAPE [1], which builds a merged plan graph and gives path selection to an external solver. It was evaluated on Sokoban, ALFWorld [10], MuSiQue [11] and GSM8K-Hard, which is built on GSM8K [12].</w:t>
+        <w:t>Most agent work with language models belongs to one of three families. The first alternates thinking and acting. ReAct [2] interleaves reasoning with tool calls, Reflexion [5] keeps a written memory of past mistakes, and Toolformer [6] teaches a model when to call a tool at all. The second family searches over reasoning steps: Tree of Thoughts [3] expands and scores branches, Graph of Thoughts [4] lets branches merge, and chain-of-thought [7], Plan-and-Solve [8] and ReWOO [9] settle on a plan first and act later. TAPE [1] is the third. It merges plans into a graph and gives the path choice to an external solver, and it was tested on Sokoban, ALFWorld [10], MuSiQue [11] and GSM8K-Hard (from GSM8K [12]).</w:t>
       </w:r>
     </w:p>
     <w:p>
@@ -589,7 +589,7 @@
         <w:rPr>
           <w:rFonts w:ascii="Times New Roman" w:hAnsi="Times New Roman"/>
         </w:rPr>
-        <w:t>These systems judge a plan by running it or by asking a model. None tests a proposed step against a rule that the task's designer wrote down. Reflexion's memory is text, so it cannot change the cost of one particular move. TAPE is closest to our setting, but it trusts every move it is shown and fixes the solver in advance.</w:t>
+        <w:t>What these systems share is that a plan is judged by running it or by asking a model. None of them tests a step against a rule written down by the task's designer. Reflexion's memory is prose, so it cannot change the price of one particular move. TAPE comes closest to our setting, but it trusts every move it is given and fixes its solver in advance.</w:t>
       </w:r>
     </w:p>
     <w:p>
@@ -603,7 +603,7 @@
         <w:rPr>
           <w:rFonts w:ascii="Times New Roman" w:hAnsi="Times New Roman"/>
         </w:rPr>
-        <w:t>The search literature supplies the tools for testing this. Weighted A* [18] trades plan length for speed. Iterative deepening [19] made optimal sliding-tile solving practical, pattern databases did the same for the Rubik's cube [20], and the cube's diameter is twenty moves [21]. Sokoban [14] and Rush Hour [15] are PSPACE-complete. Dead-corner pruning is a standard Sokoban technique, so we treat it as a baseline to measure and not as a contribution. Peg Solitaire has a proof tool, the pagoda function [22], [23], which we use as a checker. AO* handles actions with several outcomes and LAO* [24] extends it to graphs with cycles; Section V-G explains why neither is needed here. We use the public Boxoban levels [16] and the CP-SAT solver in OR-Tools [17].</w:t>
+        <w:t>For the testing we lean on older search work. Weighted A* [18] gives up plan length for speed. Iterative deepening [19] made optimal sliding-tile solving practical, pattern databases did the same for the cube [20], and the cube's diameter turned out to be twenty moves [21]. Sokoban [14] and Rush Hour [15] are both PSPACE-complete. Dead-corner pruning is routine in Sokoban solvers, so we treat it as a baseline to measure, not as something new. Peg Solitaire has its own proof device, the pagoda function [22], [23], and we use it as a checker. AO* is for actions with several outcomes and LAO* [24] extends it to graphs with loops; Section V-G says why we did not need either. Levels come from the public Boxoban set [16] and the solver is CP-SAT from OR-Tools [17].</w:t>
       </w:r>
     </w:p>
     <w:p>
@@ -639,7 +639,7 @@
         <w:rPr>
           <w:rFonts w:ascii="Times New Roman" w:hAnsi="Times New Roman"/>
         </w:rPr>
-        <w:t>Every game implements the same six-method interface: the list of actions, a step function that returns the next state and whether the move was legal, a goal test, a heuristic distance to the goal, a count of independently movable pieces, and a text renderer. Nothing downstream depends on a particular game, so adding one means writing that interface and a checker.</w:t>
+        <w:t>Each game implements the same six things: a list of actions, a step function that returns the next state and whether the move was legal, a goal test, a heuristic distance to the goal, a count of pieces that move independently, and a text renderer. Nothing downstream knows which game it is running, so a new game costs one interface and one checker.</w:t>
       </w:r>
     </w:p>
     <w:p>
@@ -668,7 +668,7 @@
         <w:rPr>
           <w:rFonts w:ascii="Times New Roman" w:hAnsi="Times New Roman"/>
         </w:rPr>
-        <w:t>Fig. 1 shows one planning round. The proposer returns candidate plans from the current state. We replay each plan move by move and merge equal states into one node of a directed graph. The checker then judges every move and the experience store adjusts its confidence. Each surviving move gets a cost, and the solver finds the cheapest path from the current state to a goal state. That path is executed. If an executed move does not produce the predicted state, we record the failure and start a new round from the real state. Proposing, merging and executing follow TAPE. Checking and the cost-based choice of solver are ours.</w:t>
+        <w:t>One planning round is drawn in Fig. 1. The proposer returns candidate plans from the current state. We replay each plan move by move and merge identical states into a single node of a directed graph. The checker then judges every move and the experience store adjusts its confidence. Moves that survive get a cost, and the solver looks for the cheapest path from the current state to a goal. That path is executed. If a move lands somewhere other than predicted, the failure is recorded and a new round begins from the real state. Proposing, merging and executing come from TAPE. The checking and the cost-driven solver choice are our additions.</w:t>
       </w:r>
     </w:p>
     <w:p>
@@ -680,7 +680,7 @@
       <w:r>
         <w:drawing>
           <wp:inline xmlns:a="http://schemas.openxmlformats.org/drawingml/2006/main" xmlns:pic="http://schemas.openxmlformats.org/drawingml/2006/picture">
-            <wp:extent cx="3048000" cy="2144322"/>
+            <wp:extent cx="3048000" cy="2232392"/>
             <wp:docPr id="1" name="Picture 1"/>
             <wp:cNvGraphicFramePr>
               <a:graphicFrameLocks noChangeAspect="1"/>
@@ -701,7 +701,7 @@
                   <pic:spPr>
                     <a:xfrm>
                       <a:off x="0" y="0"/>
-                      <a:ext cx="3048000" cy="2144322"/>
+                      <a:ext cx="3048000" cy="2232392"/>
                     </a:xfrm>
                     <a:prstGeom prst="rect"/>
                   </pic:spPr>
@@ -716,14 +716,14 @@
       <w:pPr>
         <w:keepNext w:val="0"/>
         <w:spacing w:before="40" w:after="160"/>
-        <w:jc w:val="center"/>
+        <w:jc w:val="both"/>
       </w:pPr>
       <w:r>
         <w:rPr>
           <w:rFonts w:ascii="Times New Roman" w:hAnsi="Times New Roman"/>
-          <w:sz w:val="18"/>
+          <w:sz w:val="16"/>
         </w:rPr>
-        <w:t>Fig. 1. The pipeline. Check (rules and experience memory) and Choose (move score, A* or CP-SAT) are the additions to TAPE. A mismatch during Run triggers a replan from the real state.</w:t>
+        <w:t>Fig. 1. One planning round. Checking and choosing are the additions to TAPE; a mismatch while running sends control back to proposing.</w:t>
       </w:r>
     </w:p>
     <w:p>
@@ -752,7 +752,7 @@
         <w:rPr>
           <w:rFonts w:ascii="Times New Roman" w:hAnsi="Times New Roman"/>
         </w:rPr>
-        <w:t>For a move from state s to state s', a validator returns either a rejection or an acceptance with a confidence between 0 and 1. A rejected move never becomes an edge, so every candidate plan that uses it ends there. We wrote one validator per game.</w:t>
+        <w:t>For a move from state s to state s', a validator either rejects it or accepts it with a confidence between 0 and 1. A rejected move never becomes an edge, so any plan that contains it dies at that point. There is one validator per game.</w:t>
       </w:r>
     </w:p>
     <w:p>
@@ -766,7 +766,7 @@
         <w:rPr>
           <w:rFonts w:ascii="Times New Roman" w:hAnsi="Times New Roman"/>
         </w:rPr>
-        <w:t>In Sokoban we reject a push that puts a box in a corner that is not a goal, since the box can never move again, and we accept a box resting against a wall off a goal at confidence 0.5. In River Crossing we reject any state with more cannibals than missionaries on a bank that still has a missionary. The step function does not enforce this on purpose, so only the validator knows the rule. In Rush Hour we reject a row filled completely by horizontal vehicles that blocks the target, and accept a blocker that is itself stuck at confidence 0.5.</w:t>
+        <w:t>In Sokoban we reject a push that leaves a box in a non-goal corner, because that box can never move again, and we accept a box against a wall away from a goal at confidence 0.5. In River Crossing we reject a bank with more cannibals than missionaries while at least one missionary is still there. The step function does not enforce this on purpose, so the validator is the only place the rule lives. In Rush Hour we reject a row completely filled by horizontal vehicles that blocks the target, and accept a blocker that is itself stuck at confidence 0.5.</w:t>
       </w:r>
     </w:p>
     <w:p>
@@ -780,7 +780,7 @@
         <w:rPr>
           <w:rFonts w:ascii="Times New Roman" w:hAnsi="Times New Roman"/>
         </w:rPr>
-        <w:t>Peg Solitaire uses pagoda functions. A pagoda assigns a weight w(p) &gt;= 0 to each hole so that w(a) + w(b) &gt;= w(c) for every jump of a peg from a over b into c. A jump removes the pegs at a and b and adds one at c, so the total weight of the pegs can never go up. If a position's total is already below the weight of the goal, which is one peg in the centre, the goal is unreachable. We get twelve pagodas from a small linear programme and recheck every inequality after solving. For the 24-puzzle we reject any move whose result is unsolvable under the inversion-parity rule. For the Rubik's cube we reject a state that breaks one of four cubie invariants: each slot holds a real cubie exactly once, corner twists sum to 0 mod 3, edge flips sum to 0 mod 2, and corner and edge permutations have the same parity. Legal moves never break the last two rules, so on those games the checker only matters when the start itself is unsolvable.</w:t>
+        <w:t>Peg Solitaire needed more thought. A pagoda function gives each hole a weight w(p) &gt;= 0 such that w(a) + w(b) &gt;= w(c) for every jump from a over b into c. A jump takes pegs off a and b and puts one on c, so the total weight of the board never rises. If a position already weighs less than the goal (one peg in the middle), the goal cannot be reached. A small linear program yields twelve pagodas, and we recheck every inequality after solving. For the 24-puzzle a move is rejected when its result is unsolvable under the inversion-parity rule. For the cube we reject a state that breaks any of four cubie invariants: every slot holds a real cubie exactly once, corner twists sum to 0 mod 3, edge flips sum to 0 mod 2, and corner and edge permutations share parity. Legal moves never break the last two, so on these games the checker matters only when the starting position itself is unsolvable.</w:t>
       </w:r>
     </w:p>
     <w:p>
@@ -809,7 +809,7 @@
         <w:rPr>
           <w:rFonts w:ascii="Times New Roman" w:hAnsi="Times New Roman"/>
         </w:rPr>
-        <w:t>A SQLite table keeps the number of successes s and failures f for each level, state and move. Confidence is Laplace-smoothed, so that a single early failure does not set trust to zero:</w:t>
+        <w:t>A SQLite table counts successes s and failures f for each level, state and move. Confidence is Laplace-smoothed so that one early failure does not drop trust to zero:</w:t>
       </w:r>
     </w:p>
     <w:p>
@@ -850,7 +850,7 @@
         <w:rPr>
           <w:rFonts w:ascii="Times New Roman" w:hAnsi="Times New Roman"/>
         </w:rPr>
-        <w:t>A move with no history has confidence 1. The value multiplies the validator's confidence, and one recorded failure takes trust from 1.00 to 0.33.</w:t>
+        <w:t>A move with no history starts at 1, and a single recorded failure takes it to 0.33. The result is multiplied by the validator's confidence.</w:t>
       </w:r>
     </w:p>
     <w:p>
@@ -879,7 +879,7 @@
         <w:rPr>
           <w:rFonts w:ascii="Times New Roman" w:hAnsi="Times New Roman"/>
         </w:rPr>
-        <w:t>CP-SAT needs integer coefficients, so each accepted move gets an integer cost, scaled by ten:</w:t>
+        <w:t>CP-SAT wants integer coefficients, so every accepted move gets an integer cost scaled by ten:</w:t>
       </w:r>
     </w:p>
     <w:p>
@@ -920,7 +920,7 @@
         <w:rPr>
           <w:rFonts w:ascii="Times New Roman" w:hAnsi="Times New Roman"/>
         </w:rPr>
-        <w:t>Here r = max(0, h(s') - h(s)) is how far the move increases the heuristic distance to the goal, c is the confidence, and t / T is the fraction of the step budget already used. The weights 1.5, 4.0 and 2.0 are our defaults. Section V-C reports whether tuning improved them.</w:t>
+        <w:t>Here r = max(0, h(s') - h(s)) is how much the move worsens the heuristic distance, c is the confidence, and t / T is the share of the step budget already spent. The weights 1.5, 4.0 and 2.0 are our first guesses. Section V-C reports what happened when we tried to improve them.</w:t>
       </w:r>
     </w:p>
     <w:p>
@@ -949,7 +949,7 @@
         <w:rPr>
           <w:rFonts w:ascii="Times New Roman" w:hAnsi="Times New Roman"/>
         </w:rPr>
-        <w:t>The selection rule reads the number of independently movable pieces. With one piece, such as a single Sokoban box or the River Crossing boat, the problem is a shortest path and we run A* with the cost above. With several pieces, such as several boxes or vehicles whose routes can conflict, we formulate the path as a one-unit flow and solve it with CP-SAT. The chosen path is executed move by move. After a mismatch we write the failure to the store and plan again from the real state, up to a fixed number of replans.</w:t>
+        <w:t>The selection rule reads the piece count. With one independent piece (one Sokoban box, or the River Crossing boat) the problem is an ordinary shortest path, so we run A* on the cost above. With several pieces whose routes can interfere we write the path as a one-unit flow and give it to CP-SAT. The chosen path is executed move by move. After a mismatch the failure goes into the store and we plan again from the real state, up to a fixed number of replans.</w:t>
       </w:r>
     </w:p>
     <w:p>
@@ -985,7 +985,7 @@
         <w:rPr>
           <w:rFonts w:ascii="Times New Roman" w:hAnsi="Times New Roman"/>
         </w:rPr>
-        <w:t>Each experiment changes one component and holds the rest fixed.</w:t>
+        <w:t>Every experiment changes one component and leaves the rest alone.</w:t>
       </w:r>
     </w:p>
     <w:p>
@@ -1014,7 +1014,7 @@
         <w:rPr>
           <w:rFonts w:ascii="Times New Roman" w:hAnsi="Times New Roman"/>
         </w:rPr>
-        <w:t>Sokoban has four hand-made levels with one to three boxes, the hardest with a 29-move optimum. River Crossing has three missionary-cannibal pairs and a two-seat boat, with an 11-move optimum. Rush Hour is a six-by-six board solved in six moves. Boxoban [16] adds one file from each of its three difficulty sets (unfiltered, medium and hard), 1,000 ten-by-ten levels with four boxes each. Peg Solitaire is the English board, with about 3.6 million reachable positions. The 24-puzzle has about 7.8 x 10^24 states and the 3x3x3 Rubik's cube about 4.3 x 10^19.</w:t>
+        <w:t>Sokoban has four hand-made levels with one to three boxes; the hardest has a 29-move optimum. River Crossing has three missionary and cannibal pairs and a two-seat boat, with an 11-move optimum. Rush Hour is a six-by-six board solved in six moves. From Boxoban [16] we take one file for each difficulty (unfiltered, medium, hard), which is 1,000 ten-by-ten levels with four boxes each. Peg Solitaire is the English board with about 3.6 million reachable positions. The 24-puzzle has about 7.8 x 10^24 states and the 3x3x3 cube about 4.3 x 10^19.</w:t>
       </w:r>
     </w:p>
     <w:p>
@@ -1043,7 +1043,7 @@
         <w:rPr>
           <w:rFonts w:ascii="Times New Roman" w:hAnsi="Times New Roman"/>
         </w:rPr>
-        <w:t>Our first proposer planted one shortest plan, found by BFS, among noisy walks. On River Crossing that plan is nine moves long and passes through unsafe states, because the step function accepts them. We therefore let the planted plan use the validator, which gives the textbook 11-move answer. An adversarial proposer returns uniformly random moves. A quality proposer either mixes guided and random walks or takes an optimal plan and randomizes each step with a set probability. For Boxoban, Peg Solitaire and the 24-puzzle we use weighted A* under a node budget, and for the cube a search that grows from the start and from the solved cube until the two meet. Section V-G also uses plain BFS and DFS.</w:t>
+        <w:t>Our first proposer hid one shortest plan, found by BFS, among noisy walks. On River Crossing that plan has nine moves and passes through unsafe states, because the step function allows them. We therefore let the hidden plan consult the validator, and it becomes the textbook 11-move answer. An adversarial proposer returns uniformly random moves. A quality proposer either mixes guided and random walks, or takes an optimal plan and randomizes each step with a set probability. For Boxoban, Peg Solitaire and the 24-puzzle we use weighted A* under a node budget. For the cube we use a search that grows from the start and from the solved cube until the two meet. Section V-G adds plain BFS and DFS.</w:t>
       </w:r>
     </w:p>
     <w:p>
@@ -1072,7 +1072,7 @@
         <w:rPr>
           <w:rFonts w:ascii="Times New Roman" w:hAnsi="Times New Roman"/>
         </w:rPr>
-        <w:t>We call an episode a safe success when it reaches the goal and an independent auditor, which applies the game's rules whether or not the configuration under test used a validator, rejects none of its executed moves. Plain success would score River Crossing's baseline at 100% even though it breaks the rule every time. We also report replans per episode, planning time, and, for Boxoban, the share of levels solved within a node budget. Proportions carry 95% Wilson intervals. Paired comparisons use identical hazards and seeds in both arms and report the mean difference with its standard error. The weight search was fitted on training seeds and checked on seeds it had not seen.</w:t>
+        <w:t>An episode is a safe success if it reaches the goal and an independent auditor, which applies the game's rules whatever the tested configuration did, rejects none of the executed moves. Plain success would give River Crossing's baseline 100% while it breaks the rule in every episode. We also report replans per episode, planning time and, for Boxoban, the share of levels solved within a node budget. Proportions carry 95% Wilson intervals. Paired comparisons use identical hazards and seeds in both arms and report the mean difference with its standard error. The weight search was fitted on training seeds and then checked on seeds it had never seen.</w:t>
       </w:r>
     </w:p>
     <w:p>
@@ -1108,7 +1108,7 @@
         <w:rPr>
           <w:rFonts w:ascii="Times New Roman" w:hAnsi="Times New Roman"/>
         </w:rPr>
-        <w:t>Table 1 collects the headline measurements. The subsections below give the experiment behind each row, including the ones where an addition did nothing.</w:t>
+        <w:t>Table I gathers the headline numbers. The subsections give the experiment behind each row, and they include the places where an addition did nothing.</w:t>
       </w:r>
     </w:p>
     <w:p>
@@ -1120,9 +1120,10 @@
       <w:r>
         <w:rPr>
           <w:rFonts w:ascii="Times New Roman" w:hAnsi="Times New Roman"/>
-          <w:sz w:val="20"/>
+          <w:smallCaps/>
+          <w:sz w:val="16"/>
         </w:rPr>
-        <w:t>TABLE 1</w:t>
+        <w:t>TABLE I</w:t>
       </w:r>
     </w:p>
     <w:p>
@@ -1134,7 +1135,8 @@
       <w:r>
         <w:rPr>
           <w:rFonts w:ascii="Times New Roman" w:hAnsi="Times New Roman"/>
-          <w:sz w:val="20"/>
+          <w:smallCaps/>
+          <w:sz w:val="16"/>
         </w:rPr>
         <w:t>SUMMARY OF RESULTS</w:t>
       </w:r>
@@ -1176,7 +1178,7 @@
               <w:rPr>
                 <w:rFonts w:ascii="Times New Roman" w:hAnsi="Times New Roman"/>
                 <w:b/>
-                <w:sz w:val="18"/>
+                <w:sz w:val="16"/>
               </w:rPr>
               <w:t>Measurement</w:t>
             </w:r>
@@ -1195,14 +1197,14 @@
           <w:p>
             <w:pPr>
               <w:spacing w:before="30" w:after="30"/>
-              <w:jc w:val="left"/>
+              <w:jc w:val="center"/>
             </w:pPr>
             <w:r/>
             <w:r>
               <w:rPr>
                 <w:rFonts w:ascii="Times New Roman" w:hAnsi="Times New Roman"/>
                 <w:b/>
-                <w:sz w:val="18"/>
+                <w:sz w:val="16"/>
               </w:rPr>
               <w:t>Without</w:t>
             </w:r>
@@ -1221,14 +1223,14 @@
           <w:p>
             <w:pPr>
               <w:spacing w:before="30" w:after="30"/>
-              <w:jc w:val="left"/>
+              <w:jc w:val="center"/>
             </w:pPr>
             <w:r/>
             <w:r>
               <w:rPr>
                 <w:rFonts w:ascii="Times New Roman" w:hAnsi="Times New Roman"/>
                 <w:b/>
-                <w:sz w:val="18"/>
+                <w:sz w:val="16"/>
               </w:rPr>
               <w:t>With</w:t>
             </w:r>
@@ -1255,7 +1257,7 @@
             <w:r>
               <w:rPr>
                 <w:rFonts w:ascii="Times New Roman" w:hAnsi="Times New Roman"/>
-                <w:sz w:val="18"/>
+                <w:sz w:val="16"/>
               </w:rPr>
               <w:t>River Crossing, safe success</w:t>
             </w:r>
@@ -1274,13 +1276,13 @@
           <w:p>
             <w:pPr>
               <w:spacing w:before="30" w:after="30"/>
-              <w:jc w:val="left"/>
+              <w:jc w:val="center"/>
             </w:pPr>
             <w:r/>
             <w:r>
               <w:rPr>
                 <w:rFonts w:ascii="Times New Roman" w:hAnsi="Times New Roman"/>
-                <w:sz w:val="18"/>
+                <w:sz w:val="16"/>
               </w:rPr>
               <w:t>0%</w:t>
             </w:r>
@@ -1299,13 +1301,13 @@
           <w:p>
             <w:pPr>
               <w:spacing w:before="30" w:after="30"/>
-              <w:jc w:val="left"/>
+              <w:jc w:val="center"/>
             </w:pPr>
             <w:r/>
             <w:r>
               <w:rPr>
                 <w:rFonts w:ascii="Times New Roman" w:hAnsi="Times New Roman"/>
-                <w:sz w:val="18"/>
+                <w:sz w:val="16"/>
               </w:rPr>
               <w:t>100%</w:t>
             </w:r>
@@ -1332,7 +1334,7 @@
             <w:r>
               <w:rPr>
                 <w:rFonts w:ascii="Times New Roman" w:hAnsi="Times New Roman"/>
-                <w:sz w:val="18"/>
+                <w:sz w:val="16"/>
               </w:rPr>
               <w:t>Planning time, one-box Sokoban (ms)</w:t>
             </w:r>
@@ -1351,13 +1353,13 @@
           <w:p>
             <w:pPr>
               <w:spacing w:before="30" w:after="30"/>
-              <w:jc w:val="left"/>
+              <w:jc w:val="center"/>
             </w:pPr>
             <w:r/>
             <w:r>
               <w:rPr>
                 <w:rFonts w:ascii="Times New Roman" w:hAnsi="Times New Roman"/>
-                <w:sz w:val="18"/>
+                <w:sz w:val="16"/>
               </w:rPr>
               <w:t>51.8</w:t>
             </w:r>
@@ -1376,13 +1378,13 @@
           <w:p>
             <w:pPr>
               <w:spacing w:before="30" w:after="30"/>
-              <w:jc w:val="left"/>
+              <w:jc w:val="center"/>
             </w:pPr>
             <w:r/>
             <w:r>
               <w:rPr>
                 <w:rFonts w:ascii="Times New Roman" w:hAnsi="Times New Roman"/>
-                <w:sz w:val="18"/>
+                <w:sz w:val="16"/>
               </w:rPr>
               <w:t>7.6</w:t>
             </w:r>
@@ -1409,7 +1411,7 @@
             <w:r>
               <w:rPr>
                 <w:rFonts w:ascii="Times New Roman" w:hAnsi="Times New Roman"/>
-                <w:sz w:val="18"/>
+                <w:sz w:val="16"/>
               </w:rPr>
               <w:t>Boxoban hard set, solved at 30k nodes</w:t>
             </w:r>
@@ -1428,13 +1430,13 @@
           <w:p>
             <w:pPr>
               <w:spacing w:before="30" w:after="30"/>
-              <w:jc w:val="left"/>
+              <w:jc w:val="center"/>
             </w:pPr>
             <w:r/>
             <w:r>
               <w:rPr>
                 <w:rFonts w:ascii="Times New Roman" w:hAnsi="Times New Roman"/>
-                <w:sz w:val="18"/>
+                <w:sz w:val="16"/>
               </w:rPr>
               <w:t>54%</w:t>
             </w:r>
@@ -1453,13 +1455,13 @@
           <w:p>
             <w:pPr>
               <w:spacing w:before="30" w:after="30"/>
-              <w:jc w:val="left"/>
+              <w:jc w:val="center"/>
             </w:pPr>
             <w:r/>
             <w:r>
               <w:rPr>
                 <w:rFonts w:ascii="Times New Roman" w:hAnsi="Times New Roman"/>
-                <w:sz w:val="18"/>
+                <w:sz w:val="16"/>
               </w:rPr>
               <w:t>82%</w:t>
             </w:r>
@@ -1486,7 +1488,7 @@
             <w:r>
               <w:rPr>
                 <w:rFonts w:ascii="Times New Roman" w:hAnsi="Times New Roman"/>
-                <w:sz w:val="18"/>
+                <w:sz w:val="16"/>
               </w:rPr>
               <w:t>Peg Solitaire start, nodes to a plan</w:t>
             </w:r>
@@ -1505,13 +1507,13 @@
           <w:p>
             <w:pPr>
               <w:spacing w:before="30" w:after="30"/>
-              <w:jc w:val="left"/>
+              <w:jc w:val="center"/>
             </w:pPr>
             <w:r/>
             <w:r>
               <w:rPr>
                 <w:rFonts w:ascii="Times New Roman" w:hAnsi="Times New Roman"/>
-                <w:sz w:val="18"/>
+                <w:sz w:val="16"/>
               </w:rPr>
               <w:t>139,048</w:t>
             </w:r>
@@ -1530,13 +1532,13 @@
           <w:p>
             <w:pPr>
               <w:spacing w:before="30" w:after="30"/>
-              <w:jc w:val="left"/>
+              <w:jc w:val="center"/>
             </w:pPr>
             <w:r/>
             <w:r>
               <w:rPr>
                 <w:rFonts w:ascii="Times New Roman" w:hAnsi="Times New Roman"/>
-                <w:sz w:val="18"/>
+                <w:sz w:val="16"/>
               </w:rPr>
               <w:t>82,009</w:t>
             </w:r>
@@ -1563,7 +1565,7 @@
             <w:r>
               <w:rPr>
                 <w:rFonts w:ascii="Times New Roman" w:hAnsi="Times New Roman"/>
-                <w:sz w:val="18"/>
+                <w:sz w:val="16"/>
               </w:rPr>
               <w:t>Peg Solitaire start, A* against DFS (nodes)</w:t>
             </w:r>
@@ -1582,13 +1584,13 @@
           <w:p>
             <w:pPr>
               <w:spacing w:before="30" w:after="30"/>
-              <w:jc w:val="left"/>
+              <w:jc w:val="center"/>
             </w:pPr>
             <w:r/>
             <w:r>
               <w:rPr>
                 <w:rFonts w:ascii="Times New Roman" w:hAnsi="Times New Roman"/>
-                <w:sz w:val="18"/>
+                <w:sz w:val="16"/>
               </w:rPr>
               <w:t>139,048</w:t>
             </w:r>
@@ -1607,13 +1609,13 @@
           <w:p>
             <w:pPr>
               <w:spacing w:before="30" w:after="30"/>
-              <w:jc w:val="left"/>
+              <w:jc w:val="center"/>
             </w:pPr>
             <w:r/>
             <w:r>
               <w:rPr>
                 <w:rFonts w:ascii="Times New Roman" w:hAnsi="Times New Roman"/>
-                <w:sz w:val="18"/>
+                <w:sz w:val="16"/>
               </w:rPr>
               <w:t>10,845</w:t>
             </w:r>
@@ -1640,7 +1642,7 @@
             <w:r>
               <w:rPr>
                 <w:rFonts w:ascii="Times New Roman" w:hAnsi="Times New Roman"/>
-                <w:sz w:val="18"/>
+                <w:sz w:val="16"/>
               </w:rPr>
               <w:t>Replans, one-box Sokoban (change)</w:t>
             </w:r>
@@ -1659,13 +1661,13 @@
           <w:p>
             <w:pPr>
               <w:spacing w:before="30" w:after="30"/>
-              <w:jc w:val="left"/>
+              <w:jc w:val="center"/>
             </w:pPr>
             <w:r/>
             <w:r>
               <w:rPr>
                 <w:rFonts w:ascii="Times New Roman" w:hAnsi="Times New Roman"/>
-                <w:sz w:val="18"/>
+                <w:sz w:val="16"/>
               </w:rPr>
               <w:t>0</w:t>
             </w:r>
@@ -1684,13 +1686,13 @@
           <w:p>
             <w:pPr>
               <w:spacing w:before="30" w:after="30"/>
-              <w:jc w:val="left"/>
+              <w:jc w:val="center"/>
             </w:pPr>
             <w:r/>
             <w:r>
               <w:rPr>
                 <w:rFonts w:ascii="Times New Roman" w:hAnsi="Times New Roman"/>
-                <w:sz w:val="18"/>
+                <w:sz w:val="16"/>
               </w:rPr>
               <w:t>-0.56</w:t>
             </w:r>
@@ -1729,7 +1731,7 @@
         <w:rPr>
           <w:rFonts w:ascii="Times New Roman" w:hAnsi="Times New Roman"/>
         </w:rPr>
-        <w:t>We ran five configurations on six benchmarks, 30 episodes per cell, with a 15% slip probability and the goal-biased proposer: the baseline, validator only, validator plus store, adaptive selection only, and everything. The baseline reaches the River Crossing goal in every episode and never does so safely. With the validator, safe success is 100% and raw success does not change. Adaptive selection saves time where one piece moves and does nothing elsewhere (Table 2), with identical success and action counts. Hard Sokoban stayed near 53% in all five configurations.</w:t>
+        <w:t>Five configurations ran on six benchmarks, 30 episodes per cell, with a 15% slip probability and the goal-biased proposer: baseline, validator only, validator plus store, adaptive selection only, and everything together. The baseline reaches the River Crossing goal in every episode and never does so safely. With the validator the safe rate is 100% and the raw rate does not move. Adaptive selection saves time where one piece moves and does nothing elsewhere (Table II), with identical success and action counts. Hard Sokoban sat at about 53% in all five configurations.</w:t>
       </w:r>
     </w:p>
     <w:p>
@@ -1741,9 +1743,10 @@
       <w:r>
         <w:rPr>
           <w:rFonts w:ascii="Times New Roman" w:hAnsi="Times New Roman"/>
-          <w:sz w:val="20"/>
+          <w:smallCaps/>
+          <w:sz w:val="16"/>
         </w:rPr>
-        <w:t>TABLE 2</w:t>
+        <w:t>TABLE II</w:t>
       </w:r>
     </w:p>
     <w:p>
@@ -1755,7 +1758,8 @@
       <w:r>
         <w:rPr>
           <w:rFonts w:ascii="Times New Roman" w:hAnsi="Times New Roman"/>
-          <w:sz w:val="20"/>
+          <w:smallCaps/>
+          <w:sz w:val="16"/>
         </w:rPr>
         <w:t>PLANNING TIME PER EPISODE (MS)</w:t>
       </w:r>
@@ -1797,7 +1801,7 @@
               <w:rPr>
                 <w:rFonts w:ascii="Times New Roman" w:hAnsi="Times New Roman"/>
                 <w:b/>
-                <w:sz w:val="18"/>
+                <w:sz w:val="16"/>
               </w:rPr>
               <w:t>Benchmark</w:t>
             </w:r>
@@ -1816,14 +1820,14 @@
           <w:p>
             <w:pPr>
               <w:spacing w:before="30" w:after="30"/>
-              <w:jc w:val="left"/>
+              <w:jc w:val="center"/>
             </w:pPr>
             <w:r/>
             <w:r>
               <w:rPr>
                 <w:rFonts w:ascii="Times New Roman" w:hAnsi="Times New Roman"/>
                 <w:b/>
-                <w:sz w:val="18"/>
+                <w:sz w:val="16"/>
               </w:rPr>
               <w:t>Always CP-SAT</w:t>
             </w:r>
@@ -1842,14 +1846,14 @@
           <w:p>
             <w:pPr>
               <w:spacing w:before="30" w:after="30"/>
-              <w:jc w:val="left"/>
+              <w:jc w:val="center"/>
             </w:pPr>
             <w:r/>
             <w:r>
               <w:rPr>
                 <w:rFonts w:ascii="Times New Roman" w:hAnsi="Times New Roman"/>
                 <w:b/>
-                <w:sz w:val="18"/>
+                <w:sz w:val="16"/>
               </w:rPr>
               <w:t>Adaptive</w:t>
             </w:r>
@@ -1876,7 +1880,7 @@
             <w:r>
               <w:rPr>
                 <w:rFonts w:ascii="Times New Roman" w:hAnsi="Times New Roman"/>
-                <w:sz w:val="18"/>
+                <w:sz w:val="16"/>
               </w:rPr>
               <w:t>Sokoban, one box</w:t>
             </w:r>
@@ -1895,13 +1899,13 @@
           <w:p>
             <w:pPr>
               <w:spacing w:before="30" w:after="30"/>
-              <w:jc w:val="left"/>
+              <w:jc w:val="center"/>
             </w:pPr>
             <w:r/>
             <w:r>
               <w:rPr>
                 <w:rFonts w:ascii="Times New Roman" w:hAnsi="Times New Roman"/>
-                <w:sz w:val="18"/>
+                <w:sz w:val="16"/>
               </w:rPr>
               <w:t>51.8</w:t>
             </w:r>
@@ -1920,13 +1924,13 @@
           <w:p>
             <w:pPr>
               <w:spacing w:before="30" w:after="30"/>
-              <w:jc w:val="left"/>
+              <w:jc w:val="center"/>
             </w:pPr>
             <w:r/>
             <w:r>
               <w:rPr>
                 <w:rFonts w:ascii="Times New Roman" w:hAnsi="Times New Roman"/>
-                <w:sz w:val="18"/>
+                <w:sz w:val="16"/>
               </w:rPr>
               <w:t>7.6</w:t>
             </w:r>
@@ -1953,7 +1957,7 @@
             <w:r>
               <w:rPr>
                 <w:rFonts w:ascii="Times New Roman" w:hAnsi="Times New Roman"/>
-                <w:sz w:val="18"/>
+                <w:sz w:val="16"/>
               </w:rPr>
               <w:t>River Crossing</w:t>
             </w:r>
@@ -1972,13 +1976,13 @@
           <w:p>
             <w:pPr>
               <w:spacing w:before="30" w:after="30"/>
-              <w:jc w:val="left"/>
+              <w:jc w:val="center"/>
             </w:pPr>
             <w:r/>
             <w:r>
               <w:rPr>
                 <w:rFonts w:ascii="Times New Roman" w:hAnsi="Times New Roman"/>
-                <w:sz w:val="18"/>
+                <w:sz w:val="16"/>
               </w:rPr>
               <w:t>62.1</w:t>
             </w:r>
@@ -1997,13 +2001,13 @@
           <w:p>
             <w:pPr>
               <w:spacing w:before="30" w:after="30"/>
-              <w:jc w:val="left"/>
+              <w:jc w:val="center"/>
             </w:pPr>
             <w:r/>
             <w:r>
               <w:rPr>
                 <w:rFonts w:ascii="Times New Roman" w:hAnsi="Times New Roman"/>
-                <w:sz w:val="18"/>
+                <w:sz w:val="16"/>
               </w:rPr>
               <w:t>3.6</w:t>
             </w:r>
@@ -2030,7 +2034,7 @@
             <w:r>
               <w:rPr>
                 <w:rFonts w:ascii="Times New Roman" w:hAnsi="Times New Roman"/>
-                <w:sz w:val="18"/>
+                <w:sz w:val="16"/>
               </w:rPr>
               <w:t>Sokoban, two boxes</w:t>
             </w:r>
@@ -2049,13 +2053,13 @@
           <w:p>
             <w:pPr>
               <w:spacing w:before="30" w:after="30"/>
-              <w:jc w:val="left"/>
+              <w:jc w:val="center"/>
             </w:pPr>
             <w:r/>
             <w:r>
               <w:rPr>
                 <w:rFonts w:ascii="Times New Roman" w:hAnsi="Times New Roman"/>
-                <w:sz w:val="18"/>
+                <w:sz w:val="16"/>
               </w:rPr>
               <w:t>99.9</w:t>
             </w:r>
@@ -2074,13 +2078,13 @@
           <w:p>
             <w:pPr>
               <w:spacing w:before="30" w:after="30"/>
-              <w:jc w:val="left"/>
+              <w:jc w:val="center"/>
             </w:pPr>
             <w:r/>
             <w:r>
               <w:rPr>
                 <w:rFonts w:ascii="Times New Roman" w:hAnsi="Times New Roman"/>
-                <w:sz w:val="18"/>
+                <w:sz w:val="16"/>
               </w:rPr>
               <w:t>96.4</w:t>
             </w:r>
@@ -2107,7 +2111,7 @@
             <w:r>
               <w:rPr>
                 <w:rFonts w:ascii="Times New Roman" w:hAnsi="Times New Roman"/>
-                <w:sz w:val="18"/>
+                <w:sz w:val="16"/>
               </w:rPr>
               <w:t>Rush Hour</w:t>
             </w:r>
@@ -2126,13 +2130,13 @@
           <w:p>
             <w:pPr>
               <w:spacing w:before="30" w:after="30"/>
-              <w:jc w:val="left"/>
+              <w:jc w:val="center"/>
             </w:pPr>
             <w:r/>
             <w:r>
               <w:rPr>
                 <w:rFonts w:ascii="Times New Roman" w:hAnsi="Times New Roman"/>
-                <w:sz w:val="18"/>
+                <w:sz w:val="16"/>
               </w:rPr>
               <w:t>36.2</w:t>
             </w:r>
@@ -2151,13 +2155,13 @@
           <w:p>
             <w:pPr>
               <w:spacing w:before="30" w:after="30"/>
-              <w:jc w:val="left"/>
+              <w:jc w:val="center"/>
             </w:pPr>
             <w:r/>
             <w:r>
               <w:rPr>
                 <w:rFonts w:ascii="Times New Roman" w:hAnsi="Times New Roman"/>
-                <w:sz w:val="18"/>
+                <w:sz w:val="16"/>
               </w:rPr>
               <w:t>36.1</w:t>
             </w:r>
@@ -2196,7 +2200,7 @@
         <w:rPr>
           <w:rFonts w:ascii="Times New Roman" w:hAnsi="Times New Roman"/>
         </w:rPr>
-        <w:t>With uniform random slips the store had nothing to learn and changed nothing. We then made 25% of the state and move pairs slip with probability 0.7 and compared validator only with validator plus store, paired over 20 hazard seeds of 30 episodes (Table 3). The store cut late-episode replans by about 14% on one-box Sokoban and River Crossing, did not separate from zero on Rush Hour, and made no difference on two-box Sokoban. We have not tested why, but a plausible reason is that two-box levels offer more routes and the 30 candidates rarely include a detour around a learned hazard. The store can only reweight edges that are already in the graph.</w:t>
+        <w:t>With uniform random slips the store has nothing to learn, and it changed nothing. So we made 25% of state and move pairs slip with probability 0.7 and compared validator only against validator plus store, paired over 20 hazard seeds of 30 episodes each (Table III). Late-episode replans fell by about 14% on one-box Sokoban and River Crossing. Rush Hour did not separate from zero, and two-box Sokoban showed no difference. We did not test why. Our guess is that two-box levels offer many routes while the 30 candidate plans rarely include a detour around a learned hazard, and the store can only reweight edges that already exist.</w:t>
       </w:r>
     </w:p>
     <w:p>
@@ -2208,9 +2212,10 @@
       <w:r>
         <w:rPr>
           <w:rFonts w:ascii="Times New Roman" w:hAnsi="Times New Roman"/>
-          <w:sz w:val="20"/>
+          <w:smallCaps/>
+          <w:sz w:val="16"/>
         </w:rPr>
-        <w:t>TABLE 3</w:t>
+        <w:t>TABLE III</w:t>
       </w:r>
     </w:p>
     <w:p>
@@ -2222,7 +2227,8 @@
       <w:r>
         <w:rPr>
           <w:rFonts w:ascii="Times New Roman" w:hAnsi="Times New Roman"/>
-          <w:sz w:val="20"/>
+          <w:smallCaps/>
+          <w:sz w:val="16"/>
         </w:rPr>
         <w:t>EXPERIENCE STORE UNDER STATE-DEPENDENT SLIP</w:t>
       </w:r>
@@ -2264,7 +2270,7 @@
               <w:rPr>
                 <w:rFonts w:ascii="Times New Roman" w:hAnsi="Times New Roman"/>
                 <w:b/>
-                <w:sz w:val="18"/>
+                <w:sz w:val="16"/>
               </w:rPr>
               <w:t>Benchmark</w:t>
             </w:r>
@@ -2283,14 +2289,14 @@
           <w:p>
             <w:pPr>
               <w:spacing w:before="30" w:after="30"/>
-              <w:jc w:val="left"/>
+              <w:jc w:val="center"/>
             </w:pPr>
             <w:r/>
             <w:r>
               <w:rPr>
                 <w:rFonts w:ascii="Times New Roman" w:hAnsi="Times New Roman"/>
                 <w:b/>
-                <w:sz w:val="18"/>
+                <w:sz w:val="16"/>
               </w:rPr>
               <w:t>Replans (late)</w:t>
             </w:r>
@@ -2309,14 +2315,14 @@
           <w:p>
             <w:pPr>
               <w:spacing w:before="30" w:after="30"/>
-              <w:jc w:val="left"/>
+              <w:jc w:val="center"/>
             </w:pPr>
             <w:r/>
             <w:r>
               <w:rPr>
                 <w:rFonts w:ascii="Times New Roman" w:hAnsi="Times New Roman"/>
                 <w:b/>
-                <w:sz w:val="18"/>
+                <w:sz w:val="16"/>
               </w:rPr>
               <w:t>Success</w:t>
             </w:r>
@@ -2343,7 +2349,7 @@
             <w:r>
               <w:rPr>
                 <w:rFonts w:ascii="Times New Roman" w:hAnsi="Times New Roman"/>
-                <w:sz w:val="18"/>
+                <w:sz w:val="16"/>
               </w:rPr>
               <w:t>Sokoban, one box</w:t>
             </w:r>
@@ -2362,13 +2368,13 @@
           <w:p>
             <w:pPr>
               <w:spacing w:before="30" w:after="30"/>
-              <w:jc w:val="left"/>
+              <w:jc w:val="center"/>
             </w:pPr>
             <w:r/>
             <w:r>
               <w:rPr>
                 <w:rFonts w:ascii="Times New Roman" w:hAnsi="Times New Roman"/>
-                <w:sz w:val="18"/>
+                <w:sz w:val="16"/>
               </w:rPr>
               <w:t>-0.56 +/- 0.18</w:t>
             </w:r>
@@ -2387,13 +2393,13 @@
           <w:p>
             <w:pPr>
               <w:spacing w:before="30" w:after="30"/>
-              <w:jc w:val="left"/>
+              <w:jc w:val="center"/>
             </w:pPr>
             <w:r/>
             <w:r>
               <w:rPr>
                 <w:rFonts w:ascii="Times New Roman" w:hAnsi="Times New Roman"/>
-                <w:sz w:val="18"/>
+                <w:sz w:val="16"/>
               </w:rPr>
               <w:t>+5.5 pts</w:t>
             </w:r>
@@ -2420,7 +2426,7 @@
             <w:r>
               <w:rPr>
                 <w:rFonts w:ascii="Times New Roman" w:hAnsi="Times New Roman"/>
-                <w:sz w:val="18"/>
+                <w:sz w:val="16"/>
               </w:rPr>
               <w:t>River Crossing</w:t>
             </w:r>
@@ -2439,13 +2445,13 @@
           <w:p>
             <w:pPr>
               <w:spacing w:before="30" w:after="30"/>
-              <w:jc w:val="left"/>
+              <w:jc w:val="center"/>
             </w:pPr>
             <w:r/>
             <w:r>
               <w:rPr>
                 <w:rFonts w:ascii="Times New Roman" w:hAnsi="Times New Roman"/>
-                <w:sz w:val="18"/>
+                <w:sz w:val="16"/>
               </w:rPr>
               <w:t>-0.54 +/- 0.15</w:t>
             </w:r>
@@ -2464,13 +2470,13 @@
           <w:p>
             <w:pPr>
               <w:spacing w:before="30" w:after="30"/>
-              <w:jc w:val="left"/>
+              <w:jc w:val="center"/>
             </w:pPr>
             <w:r/>
             <w:r>
               <w:rPr>
                 <w:rFonts w:ascii="Times New Roman" w:hAnsi="Times New Roman"/>
-                <w:sz w:val="18"/>
+                <w:sz w:val="16"/>
               </w:rPr>
               <w:t>+5.0 pts</w:t>
             </w:r>
@@ -2497,7 +2503,7 @@
             <w:r>
               <w:rPr>
                 <w:rFonts w:ascii="Times New Roman" w:hAnsi="Times New Roman"/>
-                <w:sz w:val="18"/>
+                <w:sz w:val="16"/>
               </w:rPr>
               <w:t>Rush Hour</w:t>
             </w:r>
@@ -2516,13 +2522,13 @@
           <w:p>
             <w:pPr>
               <w:spacing w:before="30" w:after="30"/>
-              <w:jc w:val="left"/>
+              <w:jc w:val="center"/>
             </w:pPr>
             <w:r/>
             <w:r>
               <w:rPr>
                 <w:rFonts w:ascii="Times New Roman" w:hAnsi="Times New Roman"/>
-                <w:sz w:val="18"/>
+                <w:sz w:val="16"/>
               </w:rPr>
               <w:t>-0.17 +/- 0.11</w:t>
             </w:r>
@@ -2541,13 +2547,13 @@
           <w:p>
             <w:pPr>
               <w:spacing w:before="30" w:after="30"/>
-              <w:jc w:val="left"/>
+              <w:jc w:val="center"/>
             </w:pPr>
             <w:r/>
             <w:r>
               <w:rPr>
                 <w:rFonts w:ascii="Times New Roman" w:hAnsi="Times New Roman"/>
-                <w:sz w:val="18"/>
+                <w:sz w:val="16"/>
               </w:rPr>
               <w:t>+1.2 pts</w:t>
             </w:r>
@@ -2574,7 +2580,7 @@
             <w:r>
               <w:rPr>
                 <w:rFonts w:ascii="Times New Roman" w:hAnsi="Times New Roman"/>
-                <w:sz w:val="18"/>
+                <w:sz w:val="16"/>
               </w:rPr>
               <w:t>Sokoban, two boxes</w:t>
             </w:r>
@@ -2593,13 +2599,13 @@
           <w:p>
             <w:pPr>
               <w:spacing w:before="30" w:after="30"/>
-              <w:jc w:val="left"/>
+              <w:jc w:val="center"/>
             </w:pPr>
             <w:r/>
             <w:r>
               <w:rPr>
                 <w:rFonts w:ascii="Times New Roman" w:hAnsi="Times New Roman"/>
-                <w:sz w:val="18"/>
+                <w:sz w:val="16"/>
               </w:rPr>
               <w:t>+0.06 +/- 0.03</w:t>
             </w:r>
@@ -2618,13 +2624,13 @@
           <w:p>
             <w:pPr>
               <w:spacing w:before="30" w:after="30"/>
-              <w:jc w:val="left"/>
+              <w:jc w:val="center"/>
             </w:pPr>
             <w:r/>
             <w:r>
               <w:rPr>
                 <w:rFonts w:ascii="Times New Roman" w:hAnsi="Times New Roman"/>
-                <w:sz w:val="18"/>
+                <w:sz w:val="16"/>
               </w:rPr>
               <w:t>-0.2 pts</w:t>
             </w:r>
@@ -2663,7 +2669,7 @@
         <w:rPr>
           <w:rFonts w:ascii="Times New Roman" w:hAnsi="Times New Roman"/>
         </w:rPr>
-        <w:t>We searched 80 combinations of the three penalty weights on 8 training seeds, then reran the top three and our defaults on 16 unseen seeds. The objective was replans plus three times the failure rate, averaged over four benchmarks. The best training point scored 3.906 against 4.219 for the defaults, which ranked 23rd of 80, but on the unseen seeds it was worse by 0.122 +/- 0.111. No candidate beat the defaults by more than one standard error, so we kept them. This shows only that the search found nothing better, not that the defaults are optimal.</w:t>
+        <w:t>This was the experiment we expected to win. We searched 80 combinations of the three penalty weights on 8 training seeds, then reran the top three and our defaults on 16 unseen seeds. The objective was replans plus three times the failure rate, averaged over four benchmarks. The best training point scored 3.906 against 4.219 for the defaults, which had ranked 23rd of 80. On the unseen seeds that same point was worse than the defaults by 0.122 +/- 0.111. Nothing beat the defaults by more than one standard error, so we kept them. All this tells us is that the search found nothing better; it does not make the defaults optimal.</w:t>
       </w:r>
     </w:p>
     <w:p>
@@ -2692,7 +2698,7 @@
         <w:rPr>
           <w:rFonts w:ascii="Times New Roman" w:hAnsi="Times New Roman"/>
         </w:rPr>
-        <w:t>We then asked how much the layer matters as the proposer gets better or worse. A proposer built only from random and guided walks barely solved the easiest non-trivial level (17% at best), so it told us little. With a proposer that corrupts an optimal plan, the full layer and the baseline differed by less than two standard errors on almost every Sokoban and Rush Hour comparison. River Crossing stayed at 0% safe success in both arms: this proposer never learns the safety rule, so its best plan is the unsafe one, and the validator correctly rejects it. What the validator did buy was 2.7 to 3.4 fewer replans per episode at quality 0.7 and above. It can remove bad plans, but it cannot supply a good one that the proposer never produced.</w:t>
+        <w:t>Next we varied the proposer. One built only from random and guided walks barely solved the easiest non-trivial level (17% at best), so it told us little. With a proposer that corrupts an optimal plan, the full layer and the baseline differed by less than two standard errors on nearly every Sokoban and Rush Hour comparison. River Crossing stayed at 0% safe success in both arms, because this proposer never learns the safety rule and its best plan is the unsafe one, which the validator rightly rejects. What the validator did buy was 2.7 to 3.4 fewer replans per episode at quality 0.7 and above. It can remove bad plans. It cannot invent a good one the proposer never made.</w:t>
       </w:r>
     </w:p>
     <w:p>
@@ -2721,7 +2727,7 @@
         <w:rPr>
           <w:rFonts w:ascii="Times New Roman" w:hAnsi="Times New Roman"/>
         </w:rPr>
-        <w:t>Here a level counts as solved if any of four searches finds a plan within the node budget. Without pruning the search does not know about dead corners, and with the checker it skips them (Fig. 2, Table 4). The checker did better in all 15 combinations of set and budget, with non-overlapping 95% intervals, and never missed a level that the unpruned search solved. The gain grows with difficulty: at 10,000 nodes it is 8, 19 and 22 points on the three sets, and at 30,000 nodes 3, 17 and 28 points. At the full budget the checker also expands 20%, 25% and 23% fewer nodes per level. Merging plans did not shorten any path in practice. It produced a shorter path than the best single plan on one level out of 2,680 solved, and a longer one on 33, because the solver minimizes the cost in Eq. (2) and not the number of moves.</w:t>
+        <w:t>A level counts as solved if any of four searches finds a plan inside the node budget. Without pruning the search knows nothing about dead corners; with the checker it skips them (Fig. 2, Table IV). The checker came out ahead in all 15 combinations of set and budget with non-overlapping 95% intervals, and it never missed a level that the unpruned search solved. The gap widens with difficulty. At 10,000 nodes it is 8, 19 and 22 points on the three sets, and at 30,000 nodes 3, 17 and 28. At the full budget the checker also expands 20%, 25% and 23% fewer nodes per level. Merging plans did not shorten paths in practice: out of 2,680 solved levels it beat the best single plan on one and lost to it on 33, because the solver minimizes the cost in Eq. (2) and not the number of moves.</w:t>
       </w:r>
     </w:p>
     <w:p>
@@ -2769,14 +2775,14 @@
       <w:pPr>
         <w:keepNext w:val="0"/>
         <w:spacing w:before="40" w:after="160"/>
-        <w:jc w:val="center"/>
+        <w:jc w:val="both"/>
       </w:pPr>
       <w:r>
         <w:rPr>
           <w:rFonts w:ascii="Times New Roman" w:hAnsi="Times New Roman"/>
-          <w:sz w:val="18"/>
+          <w:sz w:val="16"/>
         </w:rPr>
-        <w:t>Fig. 2. Boxoban: share of 1,000 levels solved against the node budget, with the corner checker (solid) and without pruning (dashed).</w:t>
+        <w:t>Fig. 2. Boxoban levels solved out of 1,000 against the node budget, with the corner checker (solid) and without pruning (dashed).</w:t>
       </w:r>
     </w:p>
     <w:p>
@@ -2788,9 +2794,10 @@
       <w:r>
         <w:rPr>
           <w:rFonts w:ascii="Times New Roman" w:hAnsi="Times New Roman"/>
-          <w:sz w:val="20"/>
+          <w:smallCaps/>
+          <w:sz w:val="16"/>
         </w:rPr>
-        <w:t>TABLE 4</w:t>
+        <w:t>TABLE IV</w:t>
       </w:r>
     </w:p>
     <w:p>
@@ -2802,7 +2809,8 @@
       <w:r>
         <w:rPr>
           <w:rFonts w:ascii="Times New Roman" w:hAnsi="Times New Roman"/>
-          <w:sz w:val="20"/>
+          <w:smallCaps/>
+          <w:sz w:val="16"/>
         </w:rPr>
         <w:t>BOXOBAN LEVELS SOLVED (%), NO PRUNING / CHECKER</w:t>
       </w:r>
@@ -2845,7 +2853,7 @@
               <w:rPr>
                 <w:rFonts w:ascii="Times New Roman" w:hAnsi="Times New Roman"/>
                 <w:b/>
-                <w:sz w:val="18"/>
+                <w:sz w:val="16"/>
               </w:rPr>
               <w:t>Nodes</w:t>
             </w:r>
@@ -2864,14 +2872,14 @@
           <w:p>
             <w:pPr>
               <w:spacing w:before="30" w:after="30"/>
-              <w:jc w:val="left"/>
+              <w:jc w:val="center"/>
             </w:pPr>
             <w:r/>
             <w:r>
               <w:rPr>
                 <w:rFonts w:ascii="Times New Roman" w:hAnsi="Times New Roman"/>
                 <w:b/>
-                <w:sz w:val="18"/>
+                <w:sz w:val="16"/>
               </w:rPr>
               <w:t>Unfiltered</w:t>
             </w:r>
@@ -2890,14 +2898,14 @@
           <w:p>
             <w:pPr>
               <w:spacing w:before="30" w:after="30"/>
-              <w:jc w:val="left"/>
+              <w:jc w:val="center"/>
             </w:pPr>
             <w:r/>
             <w:r>
               <w:rPr>
                 <w:rFonts w:ascii="Times New Roman" w:hAnsi="Times New Roman"/>
                 <w:b/>
-                <w:sz w:val="18"/>
+                <w:sz w:val="16"/>
               </w:rPr>
               <w:t>Medium</w:t>
             </w:r>
@@ -2916,14 +2924,14 @@
           <w:p>
             <w:pPr>
               <w:spacing w:before="30" w:after="30"/>
-              <w:jc w:val="left"/>
+              <w:jc w:val="center"/>
             </w:pPr>
             <w:r/>
             <w:r>
               <w:rPr>
                 <w:rFonts w:ascii="Times New Roman" w:hAnsi="Times New Roman"/>
                 <w:b/>
-                <w:sz w:val="18"/>
+                <w:sz w:val="16"/>
               </w:rPr>
               <w:t>Hard</w:t>
             </w:r>
@@ -2950,7 +2958,7 @@
             <w:r>
               <w:rPr>
                 <w:rFonts w:ascii="Times New Roman" w:hAnsi="Times New Roman"/>
-                <w:sz w:val="18"/>
+                <w:sz w:val="16"/>
               </w:rPr>
               <w:t>2,000</w:t>
             </w:r>
@@ -2969,13 +2977,13 @@
           <w:p>
             <w:pPr>
               <w:spacing w:before="30" w:after="30"/>
-              <w:jc w:val="left"/>
+              <w:jc w:val="center"/>
             </w:pPr>
             <w:r/>
             <w:r>
               <w:rPr>
                 <w:rFonts w:ascii="Times New Roman" w:hAnsi="Times New Roman"/>
-                <w:sz w:val="18"/>
+                <w:sz w:val="16"/>
               </w:rPr>
               <w:t>57 / 65</w:t>
             </w:r>
@@ -2994,13 +3002,13 @@
           <w:p>
             <w:pPr>
               <w:spacing w:before="30" w:after="30"/>
-              <w:jc w:val="left"/>
+              <w:jc w:val="center"/>
             </w:pPr>
             <w:r/>
             <w:r>
               <w:rPr>
                 <w:rFonts w:ascii="Times New Roman" w:hAnsi="Times New Roman"/>
-                <w:sz w:val="18"/>
+                <w:sz w:val="16"/>
               </w:rPr>
               <w:t>14 / 23</w:t>
             </w:r>
@@ -3019,13 +3027,13 @@
           <w:p>
             <w:pPr>
               <w:spacing w:before="30" w:after="30"/>
-              <w:jc w:val="left"/>
+              <w:jc w:val="center"/>
             </w:pPr>
             <w:r/>
             <w:r>
               <w:rPr>
                 <w:rFonts w:ascii="Times New Roman" w:hAnsi="Times New Roman"/>
-                <w:sz w:val="18"/>
+                <w:sz w:val="16"/>
               </w:rPr>
               <w:t>6 / 13</w:t>
             </w:r>
@@ -3052,7 +3060,7 @@
             <w:r>
               <w:rPr>
                 <w:rFonts w:ascii="Times New Roman" w:hAnsi="Times New Roman"/>
-                <w:sz w:val="18"/>
+                <w:sz w:val="16"/>
               </w:rPr>
               <w:t>5,000</w:t>
             </w:r>
@@ -3071,13 +3079,13 @@
           <w:p>
             <w:pPr>
               <w:spacing w:before="30" w:after="30"/>
-              <w:jc w:val="left"/>
+              <w:jc w:val="center"/>
             </w:pPr>
             <w:r/>
             <w:r>
               <w:rPr>
                 <w:rFonts w:ascii="Times New Roman" w:hAnsi="Times New Roman"/>
-                <w:sz w:val="18"/>
+                <w:sz w:val="16"/>
               </w:rPr>
               <w:t>73 / 82</w:t>
             </w:r>
@@ -3096,13 +3104,13 @@
           <w:p>
             <w:pPr>
               <w:spacing w:before="30" w:after="30"/>
-              <w:jc w:val="left"/>
+              <w:jc w:val="center"/>
             </w:pPr>
             <w:r/>
             <w:r>
               <w:rPr>
                 <w:rFonts w:ascii="Times New Roman" w:hAnsi="Times New Roman"/>
-                <w:sz w:val="18"/>
+                <w:sz w:val="16"/>
               </w:rPr>
               <w:t>29 / 45</w:t>
             </w:r>
@@ -3121,13 +3129,13 @@
           <w:p>
             <w:pPr>
               <w:spacing w:before="30" w:after="30"/>
-              <w:jc w:val="left"/>
+              <w:jc w:val="center"/>
             </w:pPr>
             <w:r/>
             <w:r>
               <w:rPr>
                 <w:rFonts w:ascii="Times New Roman" w:hAnsi="Times New Roman"/>
-                <w:sz w:val="18"/>
+                <w:sz w:val="16"/>
               </w:rPr>
               <w:t>16 / 29</w:t>
             </w:r>
@@ -3154,7 +3162,7 @@
             <w:r>
               <w:rPr>
                 <w:rFonts w:ascii="Times New Roman" w:hAnsi="Times New Roman"/>
-                <w:sz w:val="18"/>
+                <w:sz w:val="16"/>
               </w:rPr>
               <w:t>10,000</w:t>
             </w:r>
@@ -3173,13 +3181,13 @@
           <w:p>
             <w:pPr>
               <w:spacing w:before="30" w:after="30"/>
-              <w:jc w:val="left"/>
+              <w:jc w:val="center"/>
             </w:pPr>
             <w:r/>
             <w:r>
               <w:rPr>
                 <w:rFonts w:ascii="Times New Roman" w:hAnsi="Times New Roman"/>
-                <w:sz w:val="18"/>
+                <w:sz w:val="16"/>
               </w:rPr>
               <w:t>84 / 92</w:t>
             </w:r>
@@ -3198,13 +3206,13 @@
           <w:p>
             <w:pPr>
               <w:spacing w:before="30" w:after="30"/>
-              <w:jc w:val="left"/>
+              <w:jc w:val="center"/>
             </w:pPr>
             <w:r/>
             <w:r>
               <w:rPr>
                 <w:rFonts w:ascii="Times New Roman" w:hAnsi="Times New Roman"/>
-                <w:sz w:val="18"/>
+                <w:sz w:val="16"/>
               </w:rPr>
               <w:t>46 / 65</w:t>
             </w:r>
@@ -3223,13 +3231,13 @@
           <w:p>
             <w:pPr>
               <w:spacing w:before="30" w:after="30"/>
-              <w:jc w:val="left"/>
+              <w:jc w:val="center"/>
             </w:pPr>
             <w:r/>
             <w:r>
               <w:rPr>
                 <w:rFonts w:ascii="Times New Roman" w:hAnsi="Times New Roman"/>
-                <w:sz w:val="18"/>
+                <w:sz w:val="16"/>
               </w:rPr>
               <w:t>27 / 49</w:t>
             </w:r>
@@ -3256,7 +3264,7 @@
             <w:r>
               <w:rPr>
                 <w:rFonts w:ascii="Times New Roman" w:hAnsi="Times New Roman"/>
-                <w:sz w:val="18"/>
+                <w:sz w:val="16"/>
               </w:rPr>
               <w:t>20,000</w:t>
             </w:r>
@@ -3275,13 +3283,13 @@
           <w:p>
             <w:pPr>
               <w:spacing w:before="30" w:after="30"/>
-              <w:jc w:val="left"/>
+              <w:jc w:val="center"/>
             </w:pPr>
             <w:r/>
             <w:r>
               <w:rPr>
                 <w:rFonts w:ascii="Times New Roman" w:hAnsi="Times New Roman"/>
-                <w:sz w:val="18"/>
+                <w:sz w:val="16"/>
               </w:rPr>
               <w:t>92 / 96</w:t>
             </w:r>
@@ -3300,13 +3308,13 @@
           <w:p>
             <w:pPr>
               <w:spacing w:before="30" w:after="30"/>
-              <w:jc w:val="left"/>
+              <w:jc w:val="center"/>
             </w:pPr>
             <w:r/>
             <w:r>
               <w:rPr>
                 <w:rFonts w:ascii="Times New Roman" w:hAnsi="Times New Roman"/>
-                <w:sz w:val="18"/>
+                <w:sz w:val="16"/>
               </w:rPr>
               <w:t>61 / 82</w:t>
             </w:r>
@@ -3325,13 +3333,13 @@
           <w:p>
             <w:pPr>
               <w:spacing w:before="30" w:after="30"/>
-              <w:jc w:val="left"/>
+              <w:jc w:val="center"/>
             </w:pPr>
             <w:r/>
             <w:r>
               <w:rPr>
                 <w:rFonts w:ascii="Times New Roman" w:hAnsi="Times New Roman"/>
-                <w:sz w:val="18"/>
+                <w:sz w:val="16"/>
               </w:rPr>
               <w:t>44 / 70</w:t>
             </w:r>
@@ -3358,7 +3366,7 @@
             <w:r>
               <w:rPr>
                 <w:rFonts w:ascii="Times New Roman" w:hAnsi="Times New Roman"/>
-                <w:sz w:val="18"/>
+                <w:sz w:val="16"/>
               </w:rPr>
               <w:t>30,000</w:t>
             </w:r>
@@ -3377,13 +3385,13 @@
           <w:p>
             <w:pPr>
               <w:spacing w:before="30" w:after="30"/>
-              <w:jc w:val="left"/>
+              <w:jc w:val="center"/>
             </w:pPr>
             <w:r/>
             <w:r>
               <w:rPr>
                 <w:rFonts w:ascii="Times New Roman" w:hAnsi="Times New Roman"/>
-                <w:sz w:val="18"/>
+                <w:sz w:val="16"/>
               </w:rPr>
               <w:t>95 / 98</w:t>
             </w:r>
@@ -3402,13 +3410,13 @@
           <w:p>
             <w:pPr>
               <w:spacing w:before="30" w:after="30"/>
-              <w:jc w:val="left"/>
+              <w:jc w:val="center"/>
             </w:pPr>
             <w:r/>
             <w:r>
               <w:rPr>
                 <w:rFonts w:ascii="Times New Roman" w:hAnsi="Times New Roman"/>
-                <w:sz w:val="18"/>
+                <w:sz w:val="16"/>
               </w:rPr>
               <w:t>71 / 88</w:t>
             </w:r>
@@ -3427,13 +3435,13 @@
           <w:p>
             <w:pPr>
               <w:spacing w:before="30" w:after="30"/>
-              <w:jc w:val="left"/>
+              <w:jc w:val="center"/>
             </w:pPr>
             <w:r/>
             <w:r>
               <w:rPr>
                 <w:rFonts w:ascii="Times New Roman" w:hAnsi="Times New Roman"/>
-                <w:sz w:val="18"/>
+                <w:sz w:val="16"/>
               </w:rPr>
               <w:t>54 / 82</w:t>
             </w:r>
@@ -3472,7 +3480,7 @@
         <w:rPr>
           <w:rFonts w:ascii="Times New Roman" w:hAnsi="Times New Roman"/>
         </w:rPr>
-        <w:t>Peg Solitaire is the only game where the checker helps during play. We tested its soundness by sampling positions that the pagoda checker rejects and proving each unsolvable by exhaustive search; none was solvable. From the real start position the checker cuts the search from 139,048 to 82,009 nodes, a 41% saving. Our first benchmark used positions reached by random play, but most of them could not be solved within the budget and the search could not tell whether they were lost, so it separated nothing. We rebuilt it by playing jumps backwards from the goal, which guarantees that every position is solvable. Within 60,000 nodes the checker solves 98% of positions 22 jumps from the goal against 93% without it, and 75% against 58% at 26 jumps, using 19 to 31% fewer nodes. It never lost a position that the plain search solved (Fig. 3, Table 5).</w:t>
+        <w:t>Peg Solitaire is the one game where the checker helps during play. To test soundness we sampled positions that the pagoda checker rejects and tried to prove each unsolvable by exhaustive search; none turned out solvable. From the real start the checker cuts the search from 139,048 to 82,009 nodes, a 41% saving. Our first benchmark used positions reached by random play. Most were out of reach within the budget, the search could not say whether they were lost, and nothing separated. We rebuilt it by playing jumps backwards from the goal, which guarantees that each position is solvable. Within 60,000 nodes the checker solves 98% of positions 22 jumps out against 93% without it, and 75% against 58% at 26 jumps, using 19 to 31% fewer nodes. It never lost a position that the plain search solved (Fig. 3, Table V).</w:t>
       </w:r>
     </w:p>
     <w:p>
@@ -3520,14 +3528,14 @@
       <w:pPr>
         <w:keepNext w:val="0"/>
         <w:spacing w:before="40" w:after="160"/>
-        <w:jc w:val="center"/>
+        <w:jc w:val="both"/>
       </w:pPr>
       <w:r>
         <w:rPr>
           <w:rFonts w:ascii="Times New Roman" w:hAnsi="Times New Roman"/>
-          <w:sz w:val="18"/>
+          <w:sz w:val="16"/>
         </w:rPr>
-        <w:t>Fig. 3. Peg Solitaire on positions built backwards from the goal: share solved (top) and mean nodes per search (bottom, log scale).</w:t>
+        <w:t>Fig. 3. Peg Solitaire on positions built backwards from the goal: share solved (top) and mean nodes per search on a log scale (bottom).</w:t>
       </w:r>
     </w:p>
     <w:p>
@@ -3539,9 +3547,10 @@
       <w:r>
         <w:rPr>
           <w:rFonts w:ascii="Times New Roman" w:hAnsi="Times New Roman"/>
-          <w:sz w:val="20"/>
+          <w:smallCaps/>
+          <w:sz w:val="16"/>
         </w:rPr>
-        <w:t>TABLE 5</w:t>
+        <w:t>TABLE V</w:t>
       </w:r>
     </w:p>
     <w:p>
@@ -3553,7 +3562,8 @@
       <w:r>
         <w:rPr>
           <w:rFonts w:ascii="Times New Roman" w:hAnsi="Times New Roman"/>
-          <w:sz w:val="20"/>
+          <w:smallCaps/>
+          <w:sz w:val="16"/>
         </w:rPr>
         <w:t>PEG SOLITAIRE, SOLVED (%) AND MEAN NODES</w:t>
       </w:r>
@@ -3596,7 +3606,7 @@
               <w:rPr>
                 <w:rFonts w:ascii="Times New Roman" w:hAnsi="Times New Roman"/>
                 <w:b/>
-                <w:sz w:val="18"/>
+                <w:sz w:val="16"/>
               </w:rPr>
               <w:t>Jumps</w:t>
             </w:r>
@@ -3615,14 +3625,14 @@
           <w:p>
             <w:pPr>
               <w:spacing w:before="30" w:after="30"/>
-              <w:jc w:val="left"/>
+              <w:jc w:val="center"/>
             </w:pPr>
             <w:r/>
             <w:r>
               <w:rPr>
                 <w:rFonts w:ascii="Times New Roman" w:hAnsi="Times New Roman"/>
                 <w:b/>
-                <w:sz w:val="18"/>
+                <w:sz w:val="16"/>
               </w:rPr>
               <w:t>No checker</w:t>
             </w:r>
@@ -3641,14 +3651,14 @@
           <w:p>
             <w:pPr>
               <w:spacing w:before="30" w:after="30"/>
-              <w:jc w:val="left"/>
+              <w:jc w:val="center"/>
             </w:pPr>
             <w:r/>
             <w:r>
               <w:rPr>
                 <w:rFonts w:ascii="Times New Roman" w:hAnsi="Times New Roman"/>
                 <w:b/>
-                <w:sz w:val="18"/>
+                <w:sz w:val="16"/>
               </w:rPr>
               <w:t>Checker</w:t>
             </w:r>
@@ -3667,14 +3677,14 @@
           <w:p>
             <w:pPr>
               <w:spacing w:before="30" w:after="30"/>
-              <w:jc w:val="left"/>
+              <w:jc w:val="center"/>
             </w:pPr>
             <w:r/>
             <w:r>
               <w:rPr>
                 <w:rFonts w:ascii="Times New Roman" w:hAnsi="Times New Roman"/>
                 <w:b/>
-                <w:sz w:val="18"/>
+                <w:sz w:val="16"/>
               </w:rPr>
               <w:t>Nodes (no / with)</w:t>
             </w:r>
@@ -3701,7 +3711,7 @@
             <w:r>
               <w:rPr>
                 <w:rFonts w:ascii="Times New Roman" w:hAnsi="Times New Roman"/>
-                <w:sz w:val="18"/>
+                <w:sz w:val="16"/>
               </w:rPr>
               <w:t>12</w:t>
             </w:r>
@@ -3720,13 +3730,13 @@
           <w:p>
             <w:pPr>
               <w:spacing w:before="30" w:after="30"/>
-              <w:jc w:val="left"/>
+              <w:jc w:val="center"/>
             </w:pPr>
             <w:r/>
             <w:r>
               <w:rPr>
                 <w:rFonts w:ascii="Times New Roman" w:hAnsi="Times New Roman"/>
-                <w:sz w:val="18"/>
+                <w:sz w:val="16"/>
               </w:rPr>
               <w:t>100</w:t>
             </w:r>
@@ -3745,13 +3755,13 @@
           <w:p>
             <w:pPr>
               <w:spacing w:before="30" w:after="30"/>
-              <w:jc w:val="left"/>
+              <w:jc w:val="center"/>
             </w:pPr>
             <w:r/>
             <w:r>
               <w:rPr>
                 <w:rFonts w:ascii="Times New Roman" w:hAnsi="Times New Roman"/>
-                <w:sz w:val="18"/>
+                <w:sz w:val="16"/>
               </w:rPr>
               <w:t>100</w:t>
             </w:r>
@@ -3770,13 +3780,13 @@
           <w:p>
             <w:pPr>
               <w:spacing w:before="30" w:after="30"/>
-              <w:jc w:val="left"/>
+              <w:jc w:val="center"/>
             </w:pPr>
             <w:r/>
             <w:r>
               <w:rPr>
                 <w:rFonts w:ascii="Times New Roman" w:hAnsi="Times New Roman"/>
-                <w:sz w:val="18"/>
+                <w:sz w:val="16"/>
               </w:rPr>
               <w:t>296 / 237</w:t>
             </w:r>
@@ -3803,7 +3813,7 @@
             <w:r>
               <w:rPr>
                 <w:rFonts w:ascii="Times New Roman" w:hAnsi="Times New Roman"/>
-                <w:sz w:val="18"/>
+                <w:sz w:val="16"/>
               </w:rPr>
               <w:t>18</w:t>
             </w:r>
@@ -3822,13 +3832,13 @@
           <w:p>
             <w:pPr>
               <w:spacing w:before="30" w:after="30"/>
-              <w:jc w:val="left"/>
+              <w:jc w:val="center"/>
             </w:pPr>
             <w:r/>
             <w:r>
               <w:rPr>
                 <w:rFonts w:ascii="Times New Roman" w:hAnsi="Times New Roman"/>
-                <w:sz w:val="18"/>
+                <w:sz w:val="16"/>
               </w:rPr>
               <w:t>100</w:t>
             </w:r>
@@ -3847,13 +3857,13 @@
           <w:p>
             <w:pPr>
               <w:spacing w:before="30" w:after="30"/>
-              <w:jc w:val="left"/>
+              <w:jc w:val="center"/>
             </w:pPr>
             <w:r/>
             <w:r>
               <w:rPr>
                 <w:rFonts w:ascii="Times New Roman" w:hAnsi="Times New Roman"/>
-                <w:sz w:val="18"/>
+                <w:sz w:val="16"/>
               </w:rPr>
               <w:t>100</w:t>
             </w:r>
@@ -3872,13 +3882,13 @@
           <w:p>
             <w:pPr>
               <w:spacing w:before="30" w:after="30"/>
-              <w:jc w:val="left"/>
+              <w:jc w:val="center"/>
             </w:pPr>
             <w:r/>
             <w:r>
               <w:rPr>
                 <w:rFonts w:ascii="Times New Roman" w:hAnsi="Times New Roman"/>
-                <w:sz w:val="18"/>
+                <w:sz w:val="16"/>
               </w:rPr>
               <w:t>2,776 / 1,914</w:t>
             </w:r>
@@ -3905,7 +3915,7 @@
             <w:r>
               <w:rPr>
                 <w:rFonts w:ascii="Times New Roman" w:hAnsi="Times New Roman"/>
-                <w:sz w:val="18"/>
+                <w:sz w:val="16"/>
               </w:rPr>
               <w:t>22</w:t>
             </w:r>
@@ -3924,13 +3934,13 @@
           <w:p>
             <w:pPr>
               <w:spacing w:before="30" w:after="30"/>
-              <w:jc w:val="left"/>
+              <w:jc w:val="center"/>
             </w:pPr>
             <w:r/>
             <w:r>
               <w:rPr>
                 <w:rFonts w:ascii="Times New Roman" w:hAnsi="Times New Roman"/>
-                <w:sz w:val="18"/>
+                <w:sz w:val="16"/>
               </w:rPr>
               <w:t>93</w:t>
             </w:r>
@@ -3949,13 +3959,13 @@
           <w:p>
             <w:pPr>
               <w:spacing w:before="30" w:after="30"/>
-              <w:jc w:val="left"/>
+              <w:jc w:val="center"/>
             </w:pPr>
             <w:r/>
             <w:r>
               <w:rPr>
                 <w:rFonts w:ascii="Times New Roman" w:hAnsi="Times New Roman"/>
-                <w:sz w:val="18"/>
+                <w:sz w:val="16"/>
               </w:rPr>
               <w:t>98</w:t>
             </w:r>
@@ -3974,13 +3984,13 @@
           <w:p>
             <w:pPr>
               <w:spacing w:before="30" w:after="30"/>
-              <w:jc w:val="left"/>
+              <w:jc w:val="center"/>
             </w:pPr>
             <w:r/>
             <w:r>
               <w:rPr>
                 <w:rFonts w:ascii="Times New Roman" w:hAnsi="Times New Roman"/>
-                <w:sz w:val="18"/>
+                <w:sz w:val="16"/>
               </w:rPr>
               <w:t>13,780 / 9,663</w:t>
             </w:r>
@@ -4007,7 +4017,7 @@
             <w:r>
               <w:rPr>
                 <w:rFonts w:ascii="Times New Roman" w:hAnsi="Times New Roman"/>
-                <w:sz w:val="18"/>
+                <w:sz w:val="16"/>
               </w:rPr>
               <w:t>26</w:t>
             </w:r>
@@ -4026,13 +4036,13 @@
           <w:p>
             <w:pPr>
               <w:spacing w:before="30" w:after="30"/>
-              <w:jc w:val="left"/>
+              <w:jc w:val="center"/>
             </w:pPr>
             <w:r/>
             <w:r>
               <w:rPr>
                 <w:rFonts w:ascii="Times New Roman" w:hAnsi="Times New Roman"/>
-                <w:sz w:val="18"/>
+                <w:sz w:val="16"/>
               </w:rPr>
               <w:t>58</w:t>
             </w:r>
@@ -4051,13 +4061,13 @@
           <w:p>
             <w:pPr>
               <w:spacing w:before="30" w:after="30"/>
-              <w:jc w:val="left"/>
+              <w:jc w:val="center"/>
             </w:pPr>
             <w:r/>
             <w:r>
               <w:rPr>
                 <w:rFonts w:ascii="Times New Roman" w:hAnsi="Times New Roman"/>
-                <w:sz w:val="18"/>
+                <w:sz w:val="16"/>
               </w:rPr>
               <w:t>75</w:t>
             </w:r>
@@ -4076,13 +4086,13 @@
           <w:p>
             <w:pPr>
               <w:spacing w:before="30" w:after="30"/>
-              <w:jc w:val="left"/>
+              <w:jc w:val="center"/>
             </w:pPr>
             <w:r/>
             <w:r>
               <w:rPr>
                 <w:rFonts w:ascii="Times New Roman" w:hAnsi="Times New Roman"/>
-                <w:sz w:val="18"/>
+                <w:sz w:val="16"/>
               </w:rPr>
               <w:t>39,170 / 31,817</w:t>
             </w:r>
@@ -4106,7 +4116,7 @@
         <w:rPr>
           <w:rFonts w:ascii="Times New Roman" w:hAnsi="Times New Roman"/>
         </w:rPr>
-        <w:t>The 24-puzzle and the cube behave differently. Legal moves never break the parity rule or the cubie invariants, and we confirmed that the checks change no result on a solvable start. They matter when the input itself is unsolvable. With two tiles swapped, or one cube corner twisted, the plain search burned its whole budget (60,000 and 400,000 nodes) and the check stopped it after at most one. Weighted A* solved random-walk scrambles of the 24-puzzle at rates of 100%, 95%, 73% and 57% for 20, 40, 60 and 80 moves, and the meet-in-the-middle search solved every cube scramble of 4 to 8 moves.</w:t>
+        <w:t>The 24-puzzle and the cube behave differently. Legal moves never break the parity rule or the cubie invariants, and we confirmed that the checks change no result on a solvable start. They matter when the input itself is unsolvable. With two tiles swapped, or one cube corner twisted, the plain search burned its whole budget (60,000 and 400,000 nodes) and the check stopped it after at most one. Weighted A* solved random-walk scrambles of the 24-puzzle at 100%, 95%, 73% and 57% for 20, 40, 60 and 80 moves, and meet in the middle solved every cube scramble of 4 to 8 moves.</w:t>
       </w:r>
     </w:p>
     <w:p>
@@ -4135,7 +4145,7 @@
         <w:rPr>
           <w:rFonts w:ascii="Times New Roman" w:hAnsi="Times New Roman"/>
         </w:rPr>
-        <w:t>We ran BFS, DFS, weighted A* and meet in the middle on every game each can handle, without checkers, with a budget of 100,000 nodes. The small games had one instance and the others 20 (Table 6, Fig. 4).</w:t>
+        <w:t>BFS, DFS, weighted A* and meet in the middle ran on every game each can handle, without checkers, at 100,000 nodes. The small games have one instance each and the rest have 20 (Table VI, Fig. 4).</w:t>
       </w:r>
     </w:p>
     <w:p>
@@ -4147,9 +4157,10 @@
       <w:r>
         <w:rPr>
           <w:rFonts w:ascii="Times New Roman" w:hAnsi="Times New Roman"/>
-          <w:sz w:val="20"/>
+          <w:smallCaps/>
+          <w:sz w:val="16"/>
         </w:rPr>
-        <w:t>TABLE 6</w:t>
+        <w:t>TABLE VI</w:t>
       </w:r>
     </w:p>
     <w:p>
@@ -4161,7 +4172,8 @@
       <w:r>
         <w:rPr>
           <w:rFonts w:ascii="Times New Roman" w:hAnsi="Times New Roman"/>
-          <w:sz w:val="20"/>
+          <w:smallCaps/>
+          <w:sz w:val="16"/>
         </w:rPr>
         <w:t>SEARCH METHODS: SOLVED (%) AND MEAN NODES</w:t>
       </w:r>
@@ -4205,7 +4217,7 @@
               <w:rPr>
                 <w:rFonts w:ascii="Times New Roman" w:hAnsi="Times New Roman"/>
                 <w:b/>
-                <w:sz w:val="15"/>
+                <w:sz w:val="14"/>
               </w:rPr>
               <w:t>Game</w:t>
             </w:r>
@@ -4224,14 +4236,14 @@
           <w:p>
             <w:pPr>
               <w:spacing w:before="30" w:after="30"/>
-              <w:jc w:val="left"/>
+              <w:jc w:val="center"/>
             </w:pPr>
             <w:r/>
             <w:r>
               <w:rPr>
                 <w:rFonts w:ascii="Times New Roman" w:hAnsi="Times New Roman"/>
                 <w:b/>
-                <w:sz w:val="15"/>
+                <w:sz w:val="14"/>
               </w:rPr>
               <w:t>BFS</w:t>
             </w:r>
@@ -4250,14 +4262,14 @@
           <w:p>
             <w:pPr>
               <w:spacing w:before="30" w:after="30"/>
-              <w:jc w:val="left"/>
+              <w:jc w:val="center"/>
             </w:pPr>
             <w:r/>
             <w:r>
               <w:rPr>
                 <w:rFonts w:ascii="Times New Roman" w:hAnsi="Times New Roman"/>
                 <w:b/>
-                <w:sz w:val="15"/>
+                <w:sz w:val="14"/>
               </w:rPr>
               <w:t>DFS</w:t>
             </w:r>
@@ -4276,14 +4288,14 @@
           <w:p>
             <w:pPr>
               <w:spacing w:before="30" w:after="30"/>
-              <w:jc w:val="left"/>
+              <w:jc w:val="center"/>
             </w:pPr>
             <w:r/>
             <w:r>
               <w:rPr>
                 <w:rFonts w:ascii="Times New Roman" w:hAnsi="Times New Roman"/>
                 <w:b/>
-                <w:sz w:val="15"/>
+                <w:sz w:val="14"/>
               </w:rPr>
               <w:t>A*</w:t>
             </w:r>
@@ -4302,14 +4314,14 @@
           <w:p>
             <w:pPr>
               <w:spacing w:before="30" w:after="30"/>
-              <w:jc w:val="left"/>
+              <w:jc w:val="center"/>
             </w:pPr>
             <w:r/>
             <w:r>
               <w:rPr>
                 <w:rFonts w:ascii="Times New Roman" w:hAnsi="Times New Roman"/>
                 <w:b/>
-                <w:sz w:val="15"/>
+                <w:sz w:val="14"/>
               </w:rPr>
               <w:t>MITM</w:t>
             </w:r>
@@ -4336,7 +4348,7 @@
             <w:r>
               <w:rPr>
                 <w:rFonts w:ascii="Times New Roman" w:hAnsi="Times New Roman"/>
-                <w:sz w:val="15"/>
+                <w:sz w:val="14"/>
               </w:rPr>
               <w:t>River Crossing</w:t>
             </w:r>
@@ -4355,13 +4367,13 @@
           <w:p>
             <w:pPr>
               <w:spacing w:before="30" w:after="30"/>
-              <w:jc w:val="left"/>
+              <w:jc w:val="center"/>
             </w:pPr>
             <w:r/>
             <w:r>
               <w:rPr>
                 <w:rFonts w:ascii="Times New Roman" w:hAnsi="Times New Roman"/>
-                <w:sz w:val="15"/>
+                <w:sz w:val="14"/>
               </w:rPr>
               <w:t>100 / 28</w:t>
             </w:r>
@@ -4380,13 +4392,13 @@
           <w:p>
             <w:pPr>
               <w:spacing w:before="30" w:after="30"/>
-              <w:jc w:val="left"/>
+              <w:jc w:val="center"/>
             </w:pPr>
             <w:r/>
             <w:r>
               <w:rPr>
                 <w:rFonts w:ascii="Times New Roman" w:hAnsi="Times New Roman"/>
-                <w:sz w:val="15"/>
+                <w:sz w:val="14"/>
               </w:rPr>
               <w:t>100 / 19</w:t>
             </w:r>
@@ -4405,13 +4417,13 @@
           <w:p>
             <w:pPr>
               <w:spacing w:before="30" w:after="30"/>
-              <w:jc w:val="left"/>
+              <w:jc w:val="center"/>
             </w:pPr>
             <w:r/>
             <w:r>
               <w:rPr>
                 <w:rFonts w:ascii="Times New Roman" w:hAnsi="Times New Roman"/>
-                <w:sz w:val="15"/>
+                <w:sz w:val="14"/>
               </w:rPr>
               <w:t>100 / 26</w:t>
             </w:r>
@@ -4430,13 +4442,13 @@
           <w:p>
             <w:pPr>
               <w:spacing w:before="30" w:after="30"/>
-              <w:jc w:val="left"/>
+              <w:jc w:val="center"/>
             </w:pPr>
             <w:r/>
             <w:r>
               <w:rPr>
                 <w:rFonts w:ascii="Times New Roman" w:hAnsi="Times New Roman"/>
-                <w:sz w:val="15"/>
+                <w:sz w:val="14"/>
               </w:rPr>
               <w:t>n/a</w:t>
             </w:r>
@@ -4463,7 +4475,7 @@
             <w:r>
               <w:rPr>
                 <w:rFonts w:ascii="Times New Roman" w:hAnsi="Times New Roman"/>
-                <w:sz w:val="15"/>
+                <w:sz w:val="14"/>
               </w:rPr>
               <w:t>Rush Hour</w:t>
             </w:r>
@@ -4482,13 +4494,13 @@
           <w:p>
             <w:pPr>
               <w:spacing w:before="30" w:after="30"/>
-              <w:jc w:val="left"/>
+              <w:jc w:val="center"/>
             </w:pPr>
             <w:r/>
             <w:r>
               <w:rPr>
                 <w:rFonts w:ascii="Times New Roman" w:hAnsi="Times New Roman"/>
-                <w:sz w:val="15"/>
+                <w:sz w:val="14"/>
               </w:rPr>
               <w:t>100 / 20</w:t>
             </w:r>
@@ -4507,13 +4519,13 @@
           <w:p>
             <w:pPr>
               <w:spacing w:before="30" w:after="30"/>
-              <w:jc w:val="left"/>
+              <w:jc w:val="center"/>
             </w:pPr>
             <w:r/>
             <w:r>
               <w:rPr>
                 <w:rFonts w:ascii="Times New Roman" w:hAnsi="Times New Roman"/>
-                <w:sz w:val="15"/>
+                <w:sz w:val="14"/>
               </w:rPr>
               <w:t>100 / 18</w:t>
             </w:r>
@@ -4532,13 +4544,13 @@
           <w:p>
             <w:pPr>
               <w:spacing w:before="30" w:after="30"/>
-              <w:jc w:val="left"/>
+              <w:jc w:val="center"/>
             </w:pPr>
             <w:r/>
             <w:r>
               <w:rPr>
                 <w:rFonts w:ascii="Times New Roman" w:hAnsi="Times New Roman"/>
-                <w:sz w:val="15"/>
+                <w:sz w:val="14"/>
               </w:rPr>
               <w:t>100 / 12</w:t>
             </w:r>
@@ -4557,13 +4569,13 @@
           <w:p>
             <w:pPr>
               <w:spacing w:before="30" w:after="30"/>
-              <w:jc w:val="left"/>
+              <w:jc w:val="center"/>
             </w:pPr>
             <w:r/>
             <w:r>
               <w:rPr>
                 <w:rFonts w:ascii="Times New Roman" w:hAnsi="Times New Roman"/>
-                <w:sz w:val="15"/>
+                <w:sz w:val="14"/>
               </w:rPr>
               <w:t>n/a</w:t>
             </w:r>
@@ -4590,7 +4602,7 @@
             <w:r>
               <w:rPr>
                 <w:rFonts w:ascii="Times New Roman" w:hAnsi="Times New Roman"/>
-                <w:sz w:val="15"/>
+                <w:sz w:val="14"/>
               </w:rPr>
               <w:t>Sokoban</w:t>
             </w:r>
@@ -4609,13 +4621,13 @@
           <w:p>
             <w:pPr>
               <w:spacing w:before="30" w:after="30"/>
-              <w:jc w:val="left"/>
+              <w:jc w:val="center"/>
             </w:pPr>
             <w:r/>
             <w:r>
               <w:rPr>
                 <w:rFonts w:ascii="Times New Roman" w:hAnsi="Times New Roman"/>
-                <w:sz w:val="15"/>
+                <w:sz w:val="14"/>
               </w:rPr>
               <w:t>100 / 1,363</w:t>
             </w:r>
@@ -4634,13 +4646,13 @@
           <w:p>
             <w:pPr>
               <w:spacing w:before="30" w:after="30"/>
-              <w:jc w:val="left"/>
+              <w:jc w:val="center"/>
             </w:pPr>
             <w:r/>
             <w:r>
               <w:rPr>
                 <w:rFonts w:ascii="Times New Roman" w:hAnsi="Times New Roman"/>
-                <w:sz w:val="15"/>
+                <w:sz w:val="14"/>
               </w:rPr>
               <w:t>0</w:t>
             </w:r>
@@ -4659,13 +4671,13 @@
           <w:p>
             <w:pPr>
               <w:spacing w:before="30" w:after="30"/>
-              <w:jc w:val="left"/>
+              <w:jc w:val="center"/>
             </w:pPr>
             <w:r/>
             <w:r>
               <w:rPr>
                 <w:rFonts w:ascii="Times New Roman" w:hAnsi="Times New Roman"/>
-                <w:sz w:val="15"/>
+                <w:sz w:val="14"/>
               </w:rPr>
               <w:t>100 / 107</w:t>
             </w:r>
@@ -4684,13 +4696,13 @@
           <w:p>
             <w:pPr>
               <w:spacing w:before="30" w:after="30"/>
-              <w:jc w:val="left"/>
+              <w:jc w:val="center"/>
             </w:pPr>
             <w:r/>
             <w:r>
               <w:rPr>
                 <w:rFonts w:ascii="Times New Roman" w:hAnsi="Times New Roman"/>
-                <w:sz w:val="15"/>
+                <w:sz w:val="14"/>
               </w:rPr>
               <w:t>n/a</w:t>
             </w:r>
@@ -4717,7 +4729,7 @@
             <w:r>
               <w:rPr>
                 <w:rFonts w:ascii="Times New Roman" w:hAnsi="Times New Roman"/>
-                <w:sz w:val="15"/>
+                <w:sz w:val="14"/>
               </w:rPr>
               <w:t>Peg, real start</w:t>
             </w:r>
@@ -4736,13 +4748,13 @@
           <w:p>
             <w:pPr>
               <w:spacing w:before="30" w:after="30"/>
-              <w:jc w:val="left"/>
+              <w:jc w:val="center"/>
             </w:pPr>
             <w:r/>
             <w:r>
               <w:rPr>
                 <w:rFonts w:ascii="Times New Roman" w:hAnsi="Times New Roman"/>
-                <w:sz w:val="15"/>
+                <w:sz w:val="14"/>
               </w:rPr>
               <w:t>0</w:t>
             </w:r>
@@ -4761,13 +4773,13 @@
           <w:p>
             <w:pPr>
               <w:spacing w:before="30" w:after="30"/>
-              <w:jc w:val="left"/>
+              <w:jc w:val="center"/>
             </w:pPr>
             <w:r/>
             <w:r>
               <w:rPr>
                 <w:rFonts w:ascii="Times New Roman" w:hAnsi="Times New Roman"/>
-                <w:sz w:val="15"/>
+                <w:sz w:val="14"/>
               </w:rPr>
               <w:t>100 / 10.8k</w:t>
             </w:r>
@@ -4786,13 +4798,13 @@
           <w:p>
             <w:pPr>
               <w:spacing w:before="30" w:after="30"/>
-              <w:jc w:val="left"/>
+              <w:jc w:val="center"/>
             </w:pPr>
             <w:r/>
             <w:r>
               <w:rPr>
                 <w:rFonts w:ascii="Times New Roman" w:hAnsi="Times New Roman"/>
-                <w:sz w:val="15"/>
+                <w:sz w:val="14"/>
               </w:rPr>
               <w:t>0</w:t>
             </w:r>
@@ -4811,13 +4823,13 @@
           <w:p>
             <w:pPr>
               <w:spacing w:before="30" w:after="30"/>
-              <w:jc w:val="left"/>
+              <w:jc w:val="center"/>
             </w:pPr>
             <w:r/>
             <w:r>
               <w:rPr>
                 <w:rFonts w:ascii="Times New Roman" w:hAnsi="Times New Roman"/>
-                <w:sz w:val="15"/>
+                <w:sz w:val="14"/>
               </w:rPr>
               <w:t>n/a</w:t>
             </w:r>
@@ -4844,7 +4856,7 @@
             <w:r>
               <w:rPr>
                 <w:rFonts w:ascii="Times New Roman" w:hAnsi="Times New Roman"/>
-                <w:sz w:val="15"/>
+                <w:sz w:val="14"/>
               </w:rPr>
               <w:t>Boxoban</w:t>
             </w:r>
@@ -4863,13 +4875,13 @@
           <w:p>
             <w:pPr>
               <w:spacing w:before="30" w:after="30"/>
-              <w:jc w:val="left"/>
+              <w:jc w:val="center"/>
             </w:pPr>
             <w:r/>
             <w:r>
               <w:rPr>
                 <w:rFonts w:ascii="Times New Roman" w:hAnsi="Times New Roman"/>
-                <w:sz w:val="15"/>
+                <w:sz w:val="14"/>
               </w:rPr>
               <w:t>45 / 41.3k</w:t>
             </w:r>
@@ -4888,13 +4900,13 @@
           <w:p>
             <w:pPr>
               <w:spacing w:before="30" w:after="30"/>
-              <w:jc w:val="left"/>
+              <w:jc w:val="center"/>
             </w:pPr>
             <w:r/>
             <w:r>
               <w:rPr>
                 <w:rFonts w:ascii="Times New Roman" w:hAnsi="Times New Roman"/>
-                <w:sz w:val="15"/>
+                <w:sz w:val="14"/>
               </w:rPr>
               <w:t>55 / 37.8k</w:t>
             </w:r>
@@ -4913,13 +4925,13 @@
           <w:p>
             <w:pPr>
               <w:spacing w:before="30" w:after="30"/>
-              <w:jc w:val="left"/>
+              <w:jc w:val="center"/>
             </w:pPr>
             <w:r/>
             <w:r>
               <w:rPr>
                 <w:rFonts w:ascii="Times New Roman" w:hAnsi="Times New Roman"/>
-                <w:sz w:val="15"/>
+                <w:sz w:val="14"/>
               </w:rPr>
               <w:t>55 / 24.4k</w:t>
             </w:r>
@@ -4938,13 +4950,13 @@
           <w:p>
             <w:pPr>
               <w:spacing w:before="30" w:after="30"/>
-              <w:jc w:val="left"/>
+              <w:jc w:val="center"/>
             </w:pPr>
             <w:r/>
             <w:r>
               <w:rPr>
                 <w:rFonts w:ascii="Times New Roman" w:hAnsi="Times New Roman"/>
-                <w:sz w:val="15"/>
+                <w:sz w:val="14"/>
               </w:rPr>
               <w:t>n/a</w:t>
             </w:r>
@@ -4971,7 +4983,7 @@
             <w:r>
               <w:rPr>
                 <w:rFonts w:ascii="Times New Roman" w:hAnsi="Times New Roman"/>
-                <w:sz w:val="15"/>
+                <w:sz w:val="14"/>
               </w:rPr>
               <w:t>Peg, 22 jumps</w:t>
             </w:r>
@@ -4990,13 +5002,13 @@
           <w:p>
             <w:pPr>
               <w:spacing w:before="30" w:after="30"/>
-              <w:jc w:val="left"/>
+              <w:jc w:val="center"/>
             </w:pPr>
             <w:r/>
             <w:r>
               <w:rPr>
                 <w:rFonts w:ascii="Times New Roman" w:hAnsi="Times New Roman"/>
-                <w:sz w:val="15"/>
+                <w:sz w:val="14"/>
               </w:rPr>
               <w:t>0</w:t>
             </w:r>
@@ -5015,13 +5027,13 @@
           <w:p>
             <w:pPr>
               <w:spacing w:before="30" w:after="30"/>
-              <w:jc w:val="left"/>
+              <w:jc w:val="center"/>
             </w:pPr>
             <w:r/>
             <w:r>
               <w:rPr>
                 <w:rFonts w:ascii="Times New Roman" w:hAnsi="Times New Roman"/>
-                <w:sz w:val="15"/>
+                <w:sz w:val="14"/>
               </w:rPr>
               <w:t>85 / 23.8k</w:t>
             </w:r>
@@ -5040,13 +5052,13 @@
           <w:p>
             <w:pPr>
               <w:spacing w:before="30" w:after="30"/>
-              <w:jc w:val="left"/>
+              <w:jc w:val="center"/>
             </w:pPr>
             <w:r/>
             <w:r>
               <w:rPr>
                 <w:rFonts w:ascii="Times New Roman" w:hAnsi="Times New Roman"/>
-                <w:sz w:val="15"/>
+                <w:sz w:val="14"/>
               </w:rPr>
               <w:t>95 / 20.9k</w:t>
             </w:r>
@@ -5065,13 +5077,13 @@
           <w:p>
             <w:pPr>
               <w:spacing w:before="30" w:after="30"/>
-              <w:jc w:val="left"/>
+              <w:jc w:val="center"/>
             </w:pPr>
             <w:r/>
             <w:r>
               <w:rPr>
                 <w:rFonts w:ascii="Times New Roman" w:hAnsi="Times New Roman"/>
-                <w:sz w:val="15"/>
+                <w:sz w:val="14"/>
               </w:rPr>
               <w:t>n/a</w:t>
             </w:r>
@@ -5098,7 +5110,7 @@
             <w:r>
               <w:rPr>
                 <w:rFonts w:ascii="Times New Roman" w:hAnsi="Times New Roman"/>
-                <w:sz w:val="15"/>
+                <w:sz w:val="14"/>
               </w:rPr>
               <w:t>24-puzzle, 20</w:t>
             </w:r>
@@ -5117,13 +5129,13 @@
           <w:p>
             <w:pPr>
               <w:spacing w:before="30" w:after="30"/>
-              <w:jc w:val="left"/>
+              <w:jc w:val="center"/>
             </w:pPr>
             <w:r/>
             <w:r>
               <w:rPr>
                 <w:rFonts w:ascii="Times New Roman" w:hAnsi="Times New Roman"/>
-                <w:sz w:val="15"/>
+                <w:sz w:val="14"/>
               </w:rPr>
               <w:t>0</w:t>
             </w:r>
@@ -5142,13 +5154,13 @@
           <w:p>
             <w:pPr>
               <w:spacing w:before="30" w:after="30"/>
-              <w:jc w:val="left"/>
+              <w:jc w:val="center"/>
             </w:pPr>
             <w:r/>
             <w:r>
               <w:rPr>
                 <w:rFonts w:ascii="Times New Roman" w:hAnsi="Times New Roman"/>
-                <w:sz w:val="15"/>
+                <w:sz w:val="14"/>
               </w:rPr>
               <w:t>0</w:t>
             </w:r>
@@ -5167,13 +5179,13 @@
           <w:p>
             <w:pPr>
               <w:spacing w:before="30" w:after="30"/>
-              <w:jc w:val="left"/>
+              <w:jc w:val="center"/>
             </w:pPr>
             <w:r/>
             <w:r>
               <w:rPr>
                 <w:rFonts w:ascii="Times New Roman" w:hAnsi="Times New Roman"/>
-                <w:sz w:val="15"/>
+                <w:sz w:val="14"/>
               </w:rPr>
               <w:t>100 / 413</w:t>
             </w:r>
@@ -5192,13 +5204,13 @@
           <w:p>
             <w:pPr>
               <w:spacing w:before="30" w:after="30"/>
-              <w:jc w:val="left"/>
+              <w:jc w:val="center"/>
             </w:pPr>
             <w:r/>
             <w:r>
               <w:rPr>
                 <w:rFonts w:ascii="Times New Roman" w:hAnsi="Times New Roman"/>
-                <w:sz w:val="15"/>
+                <w:sz w:val="14"/>
               </w:rPr>
               <w:t>100 / 18.5k</w:t>
             </w:r>
@@ -5225,7 +5237,7 @@
             <w:r>
               <w:rPr>
                 <w:rFonts w:ascii="Times New Roman" w:hAnsi="Times New Roman"/>
-                <w:sz w:val="15"/>
+                <w:sz w:val="14"/>
               </w:rPr>
               <w:t>24-puzzle, 40</w:t>
             </w:r>
@@ -5244,13 +5256,13 @@
           <w:p>
             <w:pPr>
               <w:spacing w:before="30" w:after="30"/>
-              <w:jc w:val="left"/>
+              <w:jc w:val="center"/>
             </w:pPr>
             <w:r/>
             <w:r>
               <w:rPr>
                 <w:rFonts w:ascii="Times New Roman" w:hAnsi="Times New Roman"/>
-                <w:sz w:val="15"/>
+                <w:sz w:val="14"/>
               </w:rPr>
               <w:t>0</w:t>
             </w:r>
@@ -5269,13 +5281,13 @@
           <w:p>
             <w:pPr>
               <w:spacing w:before="30" w:after="30"/>
-              <w:jc w:val="left"/>
+              <w:jc w:val="center"/>
             </w:pPr>
             <w:r/>
             <w:r>
               <w:rPr>
                 <w:rFonts w:ascii="Times New Roman" w:hAnsi="Times New Roman"/>
-                <w:sz w:val="15"/>
+                <w:sz w:val="14"/>
               </w:rPr>
               <w:t>0</w:t>
             </w:r>
@@ -5294,13 +5306,13 @@
           <w:p>
             <w:pPr>
               <w:spacing w:before="30" w:after="30"/>
-              <w:jc w:val="left"/>
+              <w:jc w:val="center"/>
             </w:pPr>
             <w:r/>
             <w:r>
               <w:rPr>
                 <w:rFonts w:ascii="Times New Roman" w:hAnsi="Times New Roman"/>
-                <w:sz w:val="15"/>
+                <w:sz w:val="14"/>
               </w:rPr>
               <w:t>100 / 7,934</w:t>
             </w:r>
@@ -5319,13 +5331,13 @@
           <w:p>
             <w:pPr>
               <w:spacing w:before="30" w:after="30"/>
-              <w:jc w:val="left"/>
+              <w:jc w:val="center"/>
             </w:pPr>
             <w:r/>
             <w:r>
               <w:rPr>
                 <w:rFonts w:ascii="Times New Roman" w:hAnsi="Times New Roman"/>
-                <w:sz w:val="15"/>
+                <w:sz w:val="14"/>
               </w:rPr>
               <w:t>0</w:t>
             </w:r>
@@ -5352,7 +5364,7 @@
             <w:r>
               <w:rPr>
                 <w:rFonts w:ascii="Times New Roman" w:hAnsi="Times New Roman"/>
-                <w:sz w:val="15"/>
+                <w:sz w:val="14"/>
               </w:rPr>
               <w:t>Cube, 5 moves</w:t>
             </w:r>
@@ -5371,13 +5383,13 @@
           <w:p>
             <w:pPr>
               <w:spacing w:before="30" w:after="30"/>
-              <w:jc w:val="left"/>
+              <w:jc w:val="center"/>
             </w:pPr>
             <w:r/>
             <w:r>
               <w:rPr>
                 <w:rFonts w:ascii="Times New Roman" w:hAnsi="Times New Roman"/>
-                <w:sz w:val="15"/>
+                <w:sz w:val="14"/>
               </w:rPr>
               <w:t>30 / 30.8k</w:t>
             </w:r>
@@ -5396,13 +5408,13 @@
           <w:p>
             <w:pPr>
               <w:spacing w:before="30" w:after="30"/>
-              <w:jc w:val="left"/>
+              <w:jc w:val="center"/>
             </w:pPr>
             <w:r/>
             <w:r>
               <w:rPr>
                 <w:rFonts w:ascii="Times New Roman" w:hAnsi="Times New Roman"/>
-                <w:sz w:val="15"/>
+                <w:sz w:val="14"/>
               </w:rPr>
               <w:t>5 / 27.7k</w:t>
             </w:r>
@@ -5421,13 +5433,13 @@
           <w:p>
             <w:pPr>
               <w:spacing w:before="30" w:after="30"/>
-              <w:jc w:val="left"/>
+              <w:jc w:val="center"/>
             </w:pPr>
             <w:r/>
             <w:r>
               <w:rPr>
                 <w:rFonts w:ascii="Times New Roman" w:hAnsi="Times New Roman"/>
-                <w:sz w:val="15"/>
+                <w:sz w:val="14"/>
               </w:rPr>
               <w:t>100 / 66</w:t>
             </w:r>
@@ -5446,13 +5458,13 @@
           <w:p>
             <w:pPr>
               <w:spacing w:before="30" w:after="30"/>
-              <w:jc w:val="left"/>
+              <w:jc w:val="center"/>
             </w:pPr>
             <w:r/>
             <w:r>
               <w:rPr>
                 <w:rFonts w:ascii="Times New Roman" w:hAnsi="Times New Roman"/>
-                <w:sz w:val="15"/>
+                <w:sz w:val="14"/>
               </w:rPr>
               <w:t>100 / 3,078</w:t>
             </w:r>
@@ -5479,7 +5491,7 @@
             <w:r>
               <w:rPr>
                 <w:rFonts w:ascii="Times New Roman" w:hAnsi="Times New Roman"/>
-                <w:sz w:val="15"/>
+                <w:sz w:val="14"/>
               </w:rPr>
               <w:t>Cube, 6 moves</w:t>
             </w:r>
@@ -5498,13 +5510,13 @@
           <w:p>
             <w:pPr>
               <w:spacing w:before="30" w:after="30"/>
-              <w:jc w:val="left"/>
+              <w:jc w:val="center"/>
             </w:pPr>
             <w:r/>
             <w:r>
               <w:rPr>
                 <w:rFonts w:ascii="Times New Roman" w:hAnsi="Times New Roman"/>
-                <w:sz w:val="15"/>
+                <w:sz w:val="14"/>
               </w:rPr>
               <w:t>15 / 11.7k</w:t>
             </w:r>
@@ -5523,13 +5535,13 @@
           <w:p>
             <w:pPr>
               <w:spacing w:before="30" w:after="30"/>
-              <w:jc w:val="left"/>
+              <w:jc w:val="center"/>
             </w:pPr>
             <w:r/>
             <w:r>
               <w:rPr>
                 <w:rFonts w:ascii="Times New Roman" w:hAnsi="Times New Roman"/>
-                <w:sz w:val="15"/>
+                <w:sz w:val="14"/>
               </w:rPr>
               <w:t>0</w:t>
             </w:r>
@@ -5548,13 +5560,13 @@
           <w:p>
             <w:pPr>
               <w:spacing w:before="30" w:after="30"/>
-              <w:jc w:val="left"/>
+              <w:jc w:val="center"/>
             </w:pPr>
             <w:r/>
             <w:r>
               <w:rPr>
                 <w:rFonts w:ascii="Times New Roman" w:hAnsi="Times New Roman"/>
-                <w:sz w:val="15"/>
+                <w:sz w:val="14"/>
               </w:rPr>
               <w:t>100 / 392</w:t>
             </w:r>
@@ -5573,13 +5585,13 @@
           <w:p>
             <w:pPr>
               <w:spacing w:before="30" w:after="30"/>
-              <w:jc w:val="left"/>
+              <w:jc w:val="center"/>
             </w:pPr>
             <w:r/>
             <w:r>
               <w:rPr>
                 <w:rFonts w:ascii="Times New Roman" w:hAnsi="Times New Roman"/>
-                <w:sz w:val="15"/>
+                <w:sz w:val="14"/>
               </w:rPr>
               <w:t>100 / 5,544</w:t>
             </w:r>
@@ -5637,12 +5649,12 @@
       <w:pPr>
         <w:keepNext w:val="0"/>
         <w:spacing w:before="40" w:after="160"/>
-        <w:jc w:val="center"/>
+        <w:jc w:val="both"/>
       </w:pPr>
       <w:r>
         <w:rPr>
           <w:rFonts w:ascii="Times New Roman" w:hAnsi="Times New Roman"/>
-          <w:sz w:val="18"/>
+          <w:sz w:val="16"/>
         </w:rPr>
         <w:t>Fig. 4. Share of instances solved within 100,000 nodes, by search method.</w:t>
       </w:r>
@@ -5658,7 +5670,7 @@
         <w:rPr>
           <w:rFonts w:ascii="Times New Roman" w:hAnsi="Times New Roman"/>
         </w:rPr>
-        <w:t>DFS won on one game and by a wide margin. Every Peg Solitaire solution has exactly 31 jumps, so a depth-first search that never revisits a state gives up nothing. From the real start it needed 10,845 nodes, or 6,455 with the pagoda checker, where weighted A* needed 139,048 and BFS found no plan in 400,000. On a position that weighted A* could not solve in 20,000 nodes, DFS needed about 10,800. On positions 22 jumps from the goal the order reversed slightly, with weighted A* at 95% and DFS at 85%. BFS was enough only on River Crossing and Rush Hour, where it also returns the shortest plan. Weighted A* was the best general choice, though DFS plans on Boxoban were about 2.5 times longer than its plans. Meet in the middle guarantees a shortest plan, but on short cube scrambles it used more nodes than A* with our sticker-count heuristic, and it ran out of budget on the 40-move 24-puzzle.</w:t>
+        <w:t>DFS won one game, and by a wide margin. Every Peg Solitaire solution has exactly 31 jumps, so a depth-first search that never revisits a state gives up nothing. From the real start it needed 10,845 nodes, or 6,455 with the pagoda checker. Weighted A* needed 139,048 and BFS found no plan in 400,000. On a position that weighted A* could not solve in 20,000 nodes, DFS needed about 10,800. On positions 22 jumps from the goal the order flipped slightly, with weighted A* at 95% and DFS at 85%. BFS was enough only for River Crossing and Rush Hour, where it also returns the shortest plan. Weighted A* is the best all-round choice, although DFS plans on Boxoban ran about 2.5 times longer than its plans. Meet in the middle guarantees a shortest plan, yet on short cube scrambles it used more nodes than A* with our sticker-count heuristic, and it ran out of budget on the 40-move 24-puzzle.</w:t>
       </w:r>
     </w:p>
     <w:p>
@@ -5672,7 +5684,7 @@
         <w:rPr>
           <w:rFonts w:ascii="Times New Roman" w:hAnsi="Times New Roman"/>
         </w:rPr>
-        <w:t>We did not implement AO*. It plans over graphs where an action has several possible outcomes, and each of our games is deterministic, so its graph has no AND nodes and it reduces to A*. It could matter for the slip model, where a move sometimes leaves the state unchanged. That outcome loops back to the same state, which is the case LAO* [24] was designed for. Node counts mean expansions for BFS, DFS and A*, and generated states for meet in the middle, so the last column is only roughly comparable.</w:t>
+        <w:t>We did not implement AO*. It plans over graphs where an action has several possible outcomes, and all our games are deterministic, so there are no AND nodes and it collapses into A*. It could matter for the slip model, where a move sometimes leaves the state unchanged. That outcome loops back to the same state, which is the case LAO* [24] was built for. One caution on the table: node counts mean expansions for BFS, DFS and A*, but generated states for meet in the middle, so the last column is only roughly comparable.</w:t>
       </w:r>
     </w:p>
     <w:p>
@@ -5701,7 +5713,7 @@
         <w:rPr>
           <w:rFonts w:ascii="Times New Roman" w:hAnsi="Times New Roman"/>
         </w:rPr>
-        <w:t>The checker earns its place in two situations: when the environment accepts moves that its rules forbid, as in River Crossing, and when it can prune a search that would otherwise explore dead branches, as in Boxoban and Peg Solitaire. It does little when the proposer already finds good plans, and it cannot create a plan the proposer lacks. Adaptive selection is a small saving that depends only on piece count. The experience store is worth running when failures depend on the state and the candidates offer a detour. Among search methods, use depth-first search when every solution has the same length, meet in the middle when only the shortest plan will do and the state space is reversible, and weighted A* otherwise.</w:t>
+        <w:t>The checker earns its place in two situations. One is when the environment accepts moves that the rules forbid, as in River Crossing. The other is when pruning saves a search from dead branches, as in Boxoban and Peg Solitaire. It does little when the proposer already finds good plans, and it cannot make a plan the proposer lacks. Adaptive selection is a small saving that depends only on piece count. The store pays off when failures depend on the state and the candidates include a detour. For search, depth-first is the pick when every solution has the same length, meet in the middle when only the shortest plan will do and moves can be undone, and weighted A* the rest of the time.</w:t>
       </w:r>
     </w:p>
     <w:p>
@@ -5730,7 +5742,7 @@
         <w:rPr>
           <w:rFonts w:ascii="Times New Roman" w:hAnsi="Times New Roman"/>
         </w:rPr>
-        <w:t>Our proposers are programs and we never tried a language model, so these results say nothing about how real model errors would behave. The goal-biased proposer plants a BFS plan, which makes absolute success rates in Sections V-A and V-B higher than a real proposer would give; the paired differences are less affected. Dead-corner pruning is standard in Sokoban solvers, so Section V-E shows only that our validator works as that pruner on external levels. Boxoban coverage is one file per set and one rule. The harder-game scrambles are random walks, which are easier than uniformly random instances, and we tested the cube only up to 8-move scrambles. We cannot compare with TAPE's reported numbers because its benchmarks need a language model. The weight search used 8 training seeds, so its ranking is noisy, the search comparison has few instances on the small games, and weighted A* returns plans that are not optimal, so a lower node count can come with a longer plan.</w:t>
+        <w:t>Our proposers are programs, and we never tried a language model, so we say nothing about how real model errors would behave. The goal-biased proposer hides a BFS plan, which makes the absolute success rates in Sections V-A and V-B higher than a real proposer would give; the paired differences suffer less. Dead-corner pruning is standard in Sokoban solvers, so Section V-E shows only that our validator works as that pruner on outside levels. Boxoban coverage is one file per set and one rule. The scrambles for the harder games are random walks, which are easier than uniformly random instances, and we tested the cube only up to 8 moves. We cannot compare against TAPE's own numbers because its benchmarks need a language model. The weight search used 8 training seeds, so its ranking is noisy. The small games in the search comparison have a single instance. And weighted A* returns plans that are not optimal, so a lower node count can come with a longer plan.</w:t>
       </w:r>
     </w:p>
     <w:p>
@@ -5766,7 +5778,7 @@
         <w:rPr>
           <w:rFonts w:ascii="Times New Roman" w:hAnsi="Times New Roman"/>
         </w:rPr>
-        <w:t>The most useful next experiment is a learned proposer. We would train a policy by imitation on the Boxoban solutions we have and check whether checker pruning still saves nodes when the proposals contain realistic mistakes. A second Sokoban rule, such as frozen boxes, would show whether the Boxoban gain grows with more rules; the measure would be levels solved at 10,000 nodes. The slip model could be planned for in advance with LAO*, and the comparison would be expected replans against our replan-on-mismatch baseline. We would also write a soundness argument for each validator, as we did informally for the pagoda bound, and add a standard classical planner as a stronger baseline than plain A*.</w:t>
+        <w:t>The experiment we most want is a learned proposer. We would train a policy by imitation on the Boxoban solutions we already have and check whether checker pruning still saves nodes when the proposals contain realistic mistakes. A second Sokoban rule, such as frozen boxes, would show whether the Boxoban gain grows as rules are added; the measure would be levels solved at 10,000 nodes. The slip model could be planned for in advance with LAO*, compared on expected replans against our replan-on-mismatch scheme. We would also write a soundness argument for every validator, as we did informally for the pagoda bound, and add a standard classical planner as a harder baseline than plain A*.</w:t>
       </w:r>
     </w:p>
     <w:p>
@@ -5802,7 +5814,7 @@
         <w:rPr>
           <w:rFonts w:ascii="Times New Roman" w:hAnsi="Times New Roman"/>
         </w:rPr>
-        <w:t>On these seven games the layer's value is mostly in what it prevents. It stops rule-breaking plans in River Crossing, wastes less search on dead branches in Boxoban and Peg Solitaire, and spends less solver time on single-piece problems. It did not raise the goal-reach rate of a proposer that already finds good plans, and two ideas we expected to help, weight tuning and plan merging, did nothing measurable. For Peg Solitaire the better change was to the search method: depth-first search with the pagoda checker solved the real start in 6,455 nodes against 139,048 for plain weighted A*.</w:t>
+        <w:t>On these seven games the layer mostly pays by preventing things. It stops rule-breaking plans in River Crossing, wastes less search on dead branches in Boxoban and Peg Solitaire, and spends less solver time on single-piece problems. It did not raise the goal-reach rate of a proposer that already finds good plans, and two ideas we expected to help, weight tuning and plan merging, did nothing we could measure. For Peg Solitaire the better move was to change the search itself: depth-first search with the pagoda checker solved the real start in 6,455 nodes, where plain weighted A* needed 139,048.</w:t>
       </w:r>
     </w:p>
     <w:p>
@@ -5823,28 +5835,34 @@
     <w:p>
       <w:pPr>
         <w:keepNext w:val="0"/>
+        <w:tabs>
+          <w:tab w:pos="400" w:val="left"/>
+        </w:tabs>
         <w:spacing w:before="0" w:after="0"/>
+        <w:ind w:left="400" w:hanging="400"/>
         <w:jc w:val="both"/>
       </w:pPr>
       <w:r>
         <w:rPr>
           <w:rFonts w:ascii="Times New Roman" w:hAnsi="Times New Roman"/>
-          <w:sz w:val="20"/>
+          <w:sz w:val="16"/>
         </w:rPr>
-        <w:t xml:space="preserve">[1] J. Jeong, J. Kim, and K. Lee, "TAPE: Tool-guided adaptive planning and constrained execution in language model agents," </w:t>
+        <w:t>[1]</w:t>
+        <w:tab/>
+        <w:t xml:space="preserve">J. Jeong, J. Kim, and K. Lee, "TAPE: Tool-guided adaptive planning and constrained execution in language model agents," </w:t>
       </w:r>
       <w:r>
         <w:rPr>
           <w:rFonts w:ascii="Times New Roman" w:hAnsi="Times New Roman"/>
           <w:i/>
-          <w:sz w:val="20"/>
+          <w:sz w:val="16"/>
         </w:rPr>
         <w:t>arXiv preprint</w:t>
       </w:r>
       <w:r>
         <w:rPr>
           <w:rFonts w:ascii="Times New Roman" w:hAnsi="Times New Roman"/>
-          <w:sz w:val="20"/>
+          <w:sz w:val="16"/>
         </w:rPr>
         <w:t xml:space="preserve"> arXiv:2602.19633, 2026.</w:t>
       </w:r>
@@ -5852,28 +5870,34 @@
     <w:p>
       <w:pPr>
         <w:keepNext w:val="0"/>
+        <w:tabs>
+          <w:tab w:pos="400" w:val="left"/>
+        </w:tabs>
         <w:spacing w:before="0" w:after="0"/>
+        <w:ind w:left="400" w:hanging="400"/>
         <w:jc w:val="both"/>
       </w:pPr>
       <w:r>
         <w:rPr>
           <w:rFonts w:ascii="Times New Roman" w:hAnsi="Times New Roman"/>
-          <w:sz w:val="20"/>
+          <w:sz w:val="16"/>
         </w:rPr>
-        <w:t xml:space="preserve">[2] S. Yao </w:t>
+        <w:t>[2]</w:t>
+        <w:tab/>
+        <w:t xml:space="preserve">S. Yao </w:t>
       </w:r>
       <w:r>
         <w:rPr>
           <w:rFonts w:ascii="Times New Roman" w:hAnsi="Times New Roman"/>
           <w:i/>
-          <w:sz w:val="20"/>
+          <w:sz w:val="16"/>
         </w:rPr>
         <w:t>et al.</w:t>
       </w:r>
       <w:r>
         <w:rPr>
           <w:rFonts w:ascii="Times New Roman" w:hAnsi="Times New Roman"/>
-          <w:sz w:val="20"/>
+          <w:sz w:val="16"/>
         </w:rPr>
         <w:t xml:space="preserve">, "ReAct: Synergizing reasoning and acting in language models," </w:t>
       </w:r>
@@ -5881,14 +5905,14 @@
         <w:rPr>
           <w:rFonts w:ascii="Times New Roman" w:hAnsi="Times New Roman"/>
           <w:i/>
-          <w:sz w:val="20"/>
+          <w:sz w:val="16"/>
         </w:rPr>
         <w:t>arXiv preprint</w:t>
       </w:r>
       <w:r>
         <w:rPr>
           <w:rFonts w:ascii="Times New Roman" w:hAnsi="Times New Roman"/>
-          <w:sz w:val="20"/>
+          <w:sz w:val="16"/>
         </w:rPr>
         <w:t xml:space="preserve"> arXiv:2210.03629, 2022.</w:t>
       </w:r>
@@ -5896,28 +5920,34 @@
     <w:p>
       <w:pPr>
         <w:keepNext w:val="0"/>
+        <w:tabs>
+          <w:tab w:pos="400" w:val="left"/>
+        </w:tabs>
         <w:spacing w:before="0" w:after="0"/>
+        <w:ind w:left="400" w:hanging="400"/>
         <w:jc w:val="both"/>
       </w:pPr>
       <w:r>
         <w:rPr>
           <w:rFonts w:ascii="Times New Roman" w:hAnsi="Times New Roman"/>
-          <w:sz w:val="20"/>
+          <w:sz w:val="16"/>
         </w:rPr>
-        <w:t xml:space="preserve">[3] S. Yao </w:t>
+        <w:t>[3]</w:t>
+        <w:tab/>
+        <w:t xml:space="preserve">S. Yao </w:t>
       </w:r>
       <w:r>
         <w:rPr>
           <w:rFonts w:ascii="Times New Roman" w:hAnsi="Times New Roman"/>
           <w:i/>
-          <w:sz w:val="20"/>
+          <w:sz w:val="16"/>
         </w:rPr>
         <w:t>et al.</w:t>
       </w:r>
       <w:r>
         <w:rPr>
           <w:rFonts w:ascii="Times New Roman" w:hAnsi="Times New Roman"/>
-          <w:sz w:val="20"/>
+          <w:sz w:val="16"/>
         </w:rPr>
         <w:t xml:space="preserve">, "Tree of thoughts: Deliberate problem solving with large language models," </w:t>
       </w:r>
@@ -5925,14 +5955,14 @@
         <w:rPr>
           <w:rFonts w:ascii="Times New Roman" w:hAnsi="Times New Roman"/>
           <w:i/>
-          <w:sz w:val="20"/>
+          <w:sz w:val="16"/>
         </w:rPr>
         <w:t>arXiv preprint</w:t>
       </w:r>
       <w:r>
         <w:rPr>
           <w:rFonts w:ascii="Times New Roman" w:hAnsi="Times New Roman"/>
-          <w:sz w:val="20"/>
+          <w:sz w:val="16"/>
         </w:rPr>
         <w:t xml:space="preserve"> arXiv:2305.10601, 2023.</w:t>
       </w:r>
@@ -5940,28 +5970,34 @@
     <w:p>
       <w:pPr>
         <w:keepNext w:val="0"/>
+        <w:tabs>
+          <w:tab w:pos="400" w:val="left"/>
+        </w:tabs>
         <w:spacing w:before="0" w:after="0"/>
+        <w:ind w:left="400" w:hanging="400"/>
         <w:jc w:val="both"/>
       </w:pPr>
       <w:r>
         <w:rPr>
           <w:rFonts w:ascii="Times New Roman" w:hAnsi="Times New Roman"/>
-          <w:sz w:val="20"/>
+          <w:sz w:val="16"/>
         </w:rPr>
-        <w:t xml:space="preserve">[4] M. Besta </w:t>
+        <w:t>[4]</w:t>
+        <w:tab/>
+        <w:t xml:space="preserve">M. Besta </w:t>
       </w:r>
       <w:r>
         <w:rPr>
           <w:rFonts w:ascii="Times New Roman" w:hAnsi="Times New Roman"/>
           <w:i/>
-          <w:sz w:val="20"/>
+          <w:sz w:val="16"/>
         </w:rPr>
         <w:t>et al.</w:t>
       </w:r>
       <w:r>
         <w:rPr>
           <w:rFonts w:ascii="Times New Roman" w:hAnsi="Times New Roman"/>
-          <w:sz w:val="20"/>
+          <w:sz w:val="16"/>
         </w:rPr>
         <w:t xml:space="preserve">, "Graph of thoughts: Solving elaborate problems with large language models," </w:t>
       </w:r>
@@ -5969,14 +6005,14 @@
         <w:rPr>
           <w:rFonts w:ascii="Times New Roman" w:hAnsi="Times New Roman"/>
           <w:i/>
-          <w:sz w:val="20"/>
+          <w:sz w:val="16"/>
         </w:rPr>
         <w:t>arXiv preprint</w:t>
       </w:r>
       <w:r>
         <w:rPr>
           <w:rFonts w:ascii="Times New Roman" w:hAnsi="Times New Roman"/>
-          <w:sz w:val="20"/>
+          <w:sz w:val="16"/>
         </w:rPr>
         <w:t xml:space="preserve"> arXiv:2308.09687, 2023.</w:t>
       </w:r>
@@ -5984,28 +6020,34 @@
     <w:p>
       <w:pPr>
         <w:keepNext w:val="0"/>
+        <w:tabs>
+          <w:tab w:pos="400" w:val="left"/>
+        </w:tabs>
         <w:spacing w:before="0" w:after="0"/>
+        <w:ind w:left="400" w:hanging="400"/>
         <w:jc w:val="both"/>
       </w:pPr>
       <w:r>
         <w:rPr>
           <w:rFonts w:ascii="Times New Roman" w:hAnsi="Times New Roman"/>
-          <w:sz w:val="20"/>
+          <w:sz w:val="16"/>
         </w:rPr>
-        <w:t xml:space="preserve">[5] N. Shinn </w:t>
+        <w:t>[5]</w:t>
+        <w:tab/>
+        <w:t xml:space="preserve">N. Shinn </w:t>
       </w:r>
       <w:r>
         <w:rPr>
           <w:rFonts w:ascii="Times New Roman" w:hAnsi="Times New Roman"/>
           <w:i/>
-          <w:sz w:val="20"/>
+          <w:sz w:val="16"/>
         </w:rPr>
         <w:t>et al.</w:t>
       </w:r>
       <w:r>
         <w:rPr>
           <w:rFonts w:ascii="Times New Roman" w:hAnsi="Times New Roman"/>
-          <w:sz w:val="20"/>
+          <w:sz w:val="16"/>
         </w:rPr>
         <w:t xml:space="preserve">, "Reflexion: Language agents with verbal reinforcement learning," </w:t>
       </w:r>
@@ -6013,14 +6055,14 @@
         <w:rPr>
           <w:rFonts w:ascii="Times New Roman" w:hAnsi="Times New Roman"/>
           <w:i/>
-          <w:sz w:val="20"/>
+          <w:sz w:val="16"/>
         </w:rPr>
         <w:t>arXiv preprint</w:t>
       </w:r>
       <w:r>
         <w:rPr>
           <w:rFonts w:ascii="Times New Roman" w:hAnsi="Times New Roman"/>
-          <w:sz w:val="20"/>
+          <w:sz w:val="16"/>
         </w:rPr>
         <w:t xml:space="preserve"> arXiv:2303.11366, 2023.</w:t>
       </w:r>
@@ -6028,28 +6070,34 @@
     <w:p>
       <w:pPr>
         <w:keepNext w:val="0"/>
+        <w:tabs>
+          <w:tab w:pos="400" w:val="left"/>
+        </w:tabs>
         <w:spacing w:before="0" w:after="0"/>
+        <w:ind w:left="400" w:hanging="400"/>
         <w:jc w:val="both"/>
       </w:pPr>
       <w:r>
         <w:rPr>
           <w:rFonts w:ascii="Times New Roman" w:hAnsi="Times New Roman"/>
-          <w:sz w:val="20"/>
+          <w:sz w:val="16"/>
         </w:rPr>
-        <w:t xml:space="preserve">[6] T. Schick </w:t>
+        <w:t>[6]</w:t>
+        <w:tab/>
+        <w:t xml:space="preserve">T. Schick </w:t>
       </w:r>
       <w:r>
         <w:rPr>
           <w:rFonts w:ascii="Times New Roman" w:hAnsi="Times New Roman"/>
           <w:i/>
-          <w:sz w:val="20"/>
+          <w:sz w:val="16"/>
         </w:rPr>
         <w:t>et al.</w:t>
       </w:r>
       <w:r>
         <w:rPr>
           <w:rFonts w:ascii="Times New Roman" w:hAnsi="Times New Roman"/>
-          <w:sz w:val="20"/>
+          <w:sz w:val="16"/>
         </w:rPr>
         <w:t xml:space="preserve">, "Toolformer: Language models can teach themselves to use tools," </w:t>
       </w:r>
@@ -6057,14 +6105,14 @@
         <w:rPr>
           <w:rFonts w:ascii="Times New Roman" w:hAnsi="Times New Roman"/>
           <w:i/>
-          <w:sz w:val="20"/>
+          <w:sz w:val="16"/>
         </w:rPr>
         <w:t>arXiv preprint</w:t>
       </w:r>
       <w:r>
         <w:rPr>
           <w:rFonts w:ascii="Times New Roman" w:hAnsi="Times New Roman"/>
-          <w:sz w:val="20"/>
+          <w:sz w:val="16"/>
         </w:rPr>
         <w:t xml:space="preserve"> arXiv:2302.04761, 2023.</w:t>
       </w:r>
@@ -6072,28 +6120,34 @@
     <w:p>
       <w:pPr>
         <w:keepNext w:val="0"/>
+        <w:tabs>
+          <w:tab w:pos="400" w:val="left"/>
+        </w:tabs>
         <w:spacing w:before="0" w:after="0"/>
+        <w:ind w:left="400" w:hanging="400"/>
         <w:jc w:val="both"/>
       </w:pPr>
       <w:r>
         <w:rPr>
           <w:rFonts w:ascii="Times New Roman" w:hAnsi="Times New Roman"/>
-          <w:sz w:val="20"/>
+          <w:sz w:val="16"/>
         </w:rPr>
-        <w:t xml:space="preserve">[7] J. Wei </w:t>
+        <w:t>[7]</w:t>
+        <w:tab/>
+        <w:t xml:space="preserve">J. Wei </w:t>
       </w:r>
       <w:r>
         <w:rPr>
           <w:rFonts w:ascii="Times New Roman" w:hAnsi="Times New Roman"/>
           <w:i/>
-          <w:sz w:val="20"/>
+          <w:sz w:val="16"/>
         </w:rPr>
         <w:t>et al.</w:t>
       </w:r>
       <w:r>
         <w:rPr>
           <w:rFonts w:ascii="Times New Roman" w:hAnsi="Times New Roman"/>
-          <w:sz w:val="20"/>
+          <w:sz w:val="16"/>
         </w:rPr>
         <w:t xml:space="preserve">, "Chain-of-thought prompting elicits reasoning in large language models," </w:t>
       </w:r>
@@ -6101,14 +6155,14 @@
         <w:rPr>
           <w:rFonts w:ascii="Times New Roman" w:hAnsi="Times New Roman"/>
           <w:i/>
-          <w:sz w:val="20"/>
+          <w:sz w:val="16"/>
         </w:rPr>
         <w:t>arXiv preprint</w:t>
       </w:r>
       <w:r>
         <w:rPr>
           <w:rFonts w:ascii="Times New Roman" w:hAnsi="Times New Roman"/>
-          <w:sz w:val="20"/>
+          <w:sz w:val="16"/>
         </w:rPr>
         <w:t xml:space="preserve"> arXiv:2201.11903, 2022.</w:t>
       </w:r>
@@ -6116,28 +6170,34 @@
     <w:p>
       <w:pPr>
         <w:keepNext w:val="0"/>
+        <w:tabs>
+          <w:tab w:pos="400" w:val="left"/>
+        </w:tabs>
         <w:spacing w:before="0" w:after="0"/>
+        <w:ind w:left="400" w:hanging="400"/>
         <w:jc w:val="both"/>
       </w:pPr>
       <w:r>
         <w:rPr>
           <w:rFonts w:ascii="Times New Roman" w:hAnsi="Times New Roman"/>
-          <w:sz w:val="20"/>
+          <w:sz w:val="16"/>
         </w:rPr>
-        <w:t xml:space="preserve">[8] L. Wang </w:t>
+        <w:t>[8]</w:t>
+        <w:tab/>
+        <w:t xml:space="preserve">L. Wang </w:t>
       </w:r>
       <w:r>
         <w:rPr>
           <w:rFonts w:ascii="Times New Roman" w:hAnsi="Times New Roman"/>
           <w:i/>
-          <w:sz w:val="20"/>
+          <w:sz w:val="16"/>
         </w:rPr>
         <w:t>et al.</w:t>
       </w:r>
       <w:r>
         <w:rPr>
           <w:rFonts w:ascii="Times New Roman" w:hAnsi="Times New Roman"/>
-          <w:sz w:val="20"/>
+          <w:sz w:val="16"/>
         </w:rPr>
         <w:t xml:space="preserve">, "Plan-and-solve prompting: Improving zero-shot chain-of-thought reasoning by large language models," </w:t>
       </w:r>
@@ -6145,14 +6205,14 @@
         <w:rPr>
           <w:rFonts w:ascii="Times New Roman" w:hAnsi="Times New Roman"/>
           <w:i/>
-          <w:sz w:val="20"/>
+          <w:sz w:val="16"/>
         </w:rPr>
         <w:t>arXiv preprint</w:t>
       </w:r>
       <w:r>
         <w:rPr>
           <w:rFonts w:ascii="Times New Roman" w:hAnsi="Times New Roman"/>
-          <w:sz w:val="20"/>
+          <w:sz w:val="16"/>
         </w:rPr>
         <w:t xml:space="preserve"> arXiv:2305.04091, 2023.</w:t>
       </w:r>
@@ -6160,28 +6220,34 @@
     <w:p>
       <w:pPr>
         <w:keepNext w:val="0"/>
+        <w:tabs>
+          <w:tab w:pos="400" w:val="left"/>
+        </w:tabs>
         <w:spacing w:before="0" w:after="0"/>
+        <w:ind w:left="400" w:hanging="400"/>
         <w:jc w:val="both"/>
       </w:pPr>
       <w:r>
         <w:rPr>
           <w:rFonts w:ascii="Times New Roman" w:hAnsi="Times New Roman"/>
-          <w:sz w:val="20"/>
+          <w:sz w:val="16"/>
         </w:rPr>
-        <w:t xml:space="preserve">[9] B. Xu </w:t>
+        <w:t>[9]</w:t>
+        <w:tab/>
+        <w:t xml:space="preserve">B. Xu </w:t>
       </w:r>
       <w:r>
         <w:rPr>
           <w:rFonts w:ascii="Times New Roman" w:hAnsi="Times New Roman"/>
           <w:i/>
-          <w:sz w:val="20"/>
+          <w:sz w:val="16"/>
         </w:rPr>
         <w:t>et al.</w:t>
       </w:r>
       <w:r>
         <w:rPr>
           <w:rFonts w:ascii="Times New Roman" w:hAnsi="Times New Roman"/>
-          <w:sz w:val="20"/>
+          <w:sz w:val="16"/>
         </w:rPr>
         <w:t xml:space="preserve">, "ReWOO: Decoupling reasoning from observations for efficient augmented language models," </w:t>
       </w:r>
@@ -6189,14 +6255,14 @@
         <w:rPr>
           <w:rFonts w:ascii="Times New Roman" w:hAnsi="Times New Roman"/>
           <w:i/>
-          <w:sz w:val="20"/>
+          <w:sz w:val="16"/>
         </w:rPr>
         <w:t>arXiv preprint</w:t>
       </w:r>
       <w:r>
         <w:rPr>
           <w:rFonts w:ascii="Times New Roman" w:hAnsi="Times New Roman"/>
-          <w:sz w:val="20"/>
+          <w:sz w:val="16"/>
         </w:rPr>
         <w:t xml:space="preserve"> arXiv:2305.18323, 2023.</w:t>
       </w:r>
@@ -6204,28 +6270,34 @@
     <w:p>
       <w:pPr>
         <w:keepNext w:val="0"/>
+        <w:tabs>
+          <w:tab w:pos="400" w:val="left"/>
+        </w:tabs>
         <w:spacing w:before="0" w:after="0"/>
+        <w:ind w:left="400" w:hanging="400"/>
         <w:jc w:val="both"/>
       </w:pPr>
       <w:r>
         <w:rPr>
           <w:rFonts w:ascii="Times New Roman" w:hAnsi="Times New Roman"/>
-          <w:sz w:val="20"/>
+          <w:sz w:val="16"/>
         </w:rPr>
-        <w:t xml:space="preserve">[10] M. Shridhar </w:t>
+        <w:t>[10]</w:t>
+        <w:tab/>
+        <w:t xml:space="preserve">M. Shridhar </w:t>
       </w:r>
       <w:r>
         <w:rPr>
           <w:rFonts w:ascii="Times New Roman" w:hAnsi="Times New Roman"/>
           <w:i/>
-          <w:sz w:val="20"/>
+          <w:sz w:val="16"/>
         </w:rPr>
         <w:t>et al.</w:t>
       </w:r>
       <w:r>
         <w:rPr>
           <w:rFonts w:ascii="Times New Roman" w:hAnsi="Times New Roman"/>
-          <w:sz w:val="20"/>
+          <w:sz w:val="16"/>
         </w:rPr>
         <w:t xml:space="preserve">, "ALFWorld: Aligning text and embodied environments for interactive learning," </w:t>
       </w:r>
@@ -6233,14 +6305,14 @@
         <w:rPr>
           <w:rFonts w:ascii="Times New Roman" w:hAnsi="Times New Roman"/>
           <w:i/>
-          <w:sz w:val="20"/>
+          <w:sz w:val="16"/>
         </w:rPr>
         <w:t>arXiv preprint</w:t>
       </w:r>
       <w:r>
         <w:rPr>
           <w:rFonts w:ascii="Times New Roman" w:hAnsi="Times New Roman"/>
-          <w:sz w:val="20"/>
+          <w:sz w:val="16"/>
         </w:rPr>
         <w:t xml:space="preserve"> arXiv:2010.03768, 2020.</w:t>
       </w:r>
@@ -6248,28 +6320,34 @@
     <w:p>
       <w:pPr>
         <w:keepNext w:val="0"/>
+        <w:tabs>
+          <w:tab w:pos="400" w:val="left"/>
+        </w:tabs>
         <w:spacing w:before="0" w:after="0"/>
+        <w:ind w:left="400" w:hanging="400"/>
         <w:jc w:val="both"/>
       </w:pPr>
       <w:r>
         <w:rPr>
           <w:rFonts w:ascii="Times New Roman" w:hAnsi="Times New Roman"/>
-          <w:sz w:val="20"/>
+          <w:sz w:val="16"/>
         </w:rPr>
-        <w:t xml:space="preserve">[11] H. Trivedi, N. Balasubramanian, T. Khot, and A. Sabharwal, "MuSiQue: Multihop questions via single-hop question composition," </w:t>
+        <w:t>[11]</w:t>
+        <w:tab/>
+        <w:t xml:space="preserve">H. Trivedi, N. Balasubramanian, T. Khot, and A. Sabharwal, "MuSiQue: Multihop questions via single-hop question composition," </w:t>
       </w:r>
       <w:r>
         <w:rPr>
           <w:rFonts w:ascii="Times New Roman" w:hAnsi="Times New Roman"/>
           <w:i/>
-          <w:sz w:val="20"/>
+          <w:sz w:val="16"/>
         </w:rPr>
         <w:t>arXiv preprint</w:t>
       </w:r>
       <w:r>
         <w:rPr>
           <w:rFonts w:ascii="Times New Roman" w:hAnsi="Times New Roman"/>
-          <w:sz w:val="20"/>
+          <w:sz w:val="16"/>
         </w:rPr>
         <w:t xml:space="preserve"> arXiv:2108.00573, 2021.</w:t>
       </w:r>
@@ -6277,28 +6355,34 @@
     <w:p>
       <w:pPr>
         <w:keepNext w:val="0"/>
+        <w:tabs>
+          <w:tab w:pos="400" w:val="left"/>
+        </w:tabs>
         <w:spacing w:before="0" w:after="0"/>
+        <w:ind w:left="400" w:hanging="400"/>
         <w:jc w:val="both"/>
       </w:pPr>
       <w:r>
         <w:rPr>
           <w:rFonts w:ascii="Times New Roman" w:hAnsi="Times New Roman"/>
-          <w:sz w:val="20"/>
+          <w:sz w:val="16"/>
         </w:rPr>
-        <w:t xml:space="preserve">[12] K. Cobbe </w:t>
+        <w:t>[12]</w:t>
+        <w:tab/>
+        <w:t xml:space="preserve">K. Cobbe </w:t>
       </w:r>
       <w:r>
         <w:rPr>
           <w:rFonts w:ascii="Times New Roman" w:hAnsi="Times New Roman"/>
           <w:i/>
-          <w:sz w:val="20"/>
+          <w:sz w:val="16"/>
         </w:rPr>
         <w:t>et al.</w:t>
       </w:r>
       <w:r>
         <w:rPr>
           <w:rFonts w:ascii="Times New Roman" w:hAnsi="Times New Roman"/>
-          <w:sz w:val="20"/>
+          <w:sz w:val="16"/>
         </w:rPr>
         <w:t xml:space="preserve">, "Training verifiers to solve math word problems," </w:t>
       </w:r>
@@ -6306,14 +6390,14 @@
         <w:rPr>
           <w:rFonts w:ascii="Times New Roman" w:hAnsi="Times New Roman"/>
           <w:i/>
-          <w:sz w:val="20"/>
+          <w:sz w:val="16"/>
         </w:rPr>
         <w:t>arXiv preprint</w:t>
       </w:r>
       <w:r>
         <w:rPr>
           <w:rFonts w:ascii="Times New Roman" w:hAnsi="Times New Roman"/>
-          <w:sz w:val="20"/>
+          <w:sz w:val="16"/>
         </w:rPr>
         <w:t xml:space="preserve"> arXiv:2110.14168, 2021.</w:t>
       </w:r>
@@ -6321,28 +6405,34 @@
     <w:p>
       <w:pPr>
         <w:keepNext w:val="0"/>
+        <w:tabs>
+          <w:tab w:pos="400" w:val="left"/>
+        </w:tabs>
         <w:spacing w:before="0" w:after="0"/>
+        <w:ind w:left="400" w:hanging="400"/>
         <w:jc w:val="both"/>
       </w:pPr>
       <w:r>
         <w:rPr>
           <w:rFonts w:ascii="Times New Roman" w:hAnsi="Times New Roman"/>
-          <w:sz w:val="20"/>
+          <w:sz w:val="16"/>
         </w:rPr>
-        <w:t xml:space="preserve">[13] P. E. Hart, N. J. Nilsson, and B. Raphael, "A formal basis for the heuristic determination of minimum cost paths," </w:t>
+        <w:t>[13]</w:t>
+        <w:tab/>
+        <w:t xml:space="preserve">P. E. Hart, N. J. Nilsson, and B. Raphael, "A formal basis for the heuristic determination of minimum cost paths," </w:t>
       </w:r>
       <w:r>
         <w:rPr>
           <w:rFonts w:ascii="Times New Roman" w:hAnsi="Times New Roman"/>
           <w:i/>
-          <w:sz w:val="20"/>
+          <w:sz w:val="16"/>
         </w:rPr>
         <w:t>IEEE Transactions on Systems Science and Cybernetics</w:t>
       </w:r>
       <w:r>
         <w:rPr>
           <w:rFonts w:ascii="Times New Roman" w:hAnsi="Times New Roman"/>
-          <w:sz w:val="20"/>
+          <w:sz w:val="16"/>
         </w:rPr>
         <w:t>, 1968.</w:t>
       </w:r>
@@ -6350,42 +6440,54 @@
     <w:p>
       <w:pPr>
         <w:keepNext w:val="0"/>
+        <w:tabs>
+          <w:tab w:pos="400" w:val="left"/>
+        </w:tabs>
         <w:spacing w:before="0" w:after="0"/>
+        <w:ind w:left="400" w:hanging="400"/>
         <w:jc w:val="both"/>
       </w:pPr>
       <w:r>
         <w:rPr>
           <w:rFonts w:ascii="Times New Roman" w:hAnsi="Times New Roman"/>
-          <w:sz w:val="20"/>
+          <w:sz w:val="16"/>
         </w:rPr>
-        <w:t>[14] J. Culberson, "Sokoban is PSPACE-complete," Tech. Rep. TR97-02, University of Alberta, 1997.</w:t>
+        <w:t>[14]</w:t>
+        <w:tab/>
+        <w:t>J. Culberson, "Sokoban is PSPACE-complete," Tech. Rep. TR97-02, University of Alberta, 1997.</w:t>
       </w:r>
     </w:p>
     <w:p>
       <w:pPr>
         <w:keepNext w:val="0"/>
+        <w:tabs>
+          <w:tab w:pos="400" w:val="left"/>
+        </w:tabs>
         <w:spacing w:before="0" w:after="0"/>
+        <w:ind w:left="400" w:hanging="400"/>
         <w:jc w:val="both"/>
       </w:pPr>
       <w:r>
         <w:rPr>
           <w:rFonts w:ascii="Times New Roman" w:hAnsi="Times New Roman"/>
-          <w:sz w:val="20"/>
+          <w:sz w:val="16"/>
         </w:rPr>
-        <w:t xml:space="preserve">[15] G. W. Flake and E. B. Baum, "Rush Hour is PSPACE-complete, or why you should generously tip parking lot attendants," </w:t>
+        <w:t>[15]</w:t>
+        <w:tab/>
+        <w:t xml:space="preserve">G. W. Flake and E. B. Baum, "Rush Hour is PSPACE-complete, or why you should generously tip parking lot attendants," </w:t>
       </w:r>
       <w:r>
         <w:rPr>
           <w:rFonts w:ascii="Times New Roman" w:hAnsi="Times New Roman"/>
           <w:i/>
-          <w:sz w:val="20"/>
+          <w:sz w:val="16"/>
         </w:rPr>
         <w:t>Theoretical Computer Science</w:t>
       </w:r>
       <w:r>
         <w:rPr>
           <w:rFonts w:ascii="Times New Roman" w:hAnsi="Times New Roman"/>
-          <w:sz w:val="20"/>
+          <w:sz w:val="16"/>
         </w:rPr>
         <w:t>, vol. 270, no. 1-2, pp. 895-911, 2002.</w:t>
       </w:r>
@@ -6393,56 +6495,74 @@
     <w:p>
       <w:pPr>
         <w:keepNext w:val="0"/>
+        <w:tabs>
+          <w:tab w:pos="400" w:val="left"/>
+        </w:tabs>
         <w:spacing w:before="0" w:after="0"/>
+        <w:ind w:left="400" w:hanging="400"/>
         <w:jc w:val="both"/>
       </w:pPr>
       <w:r>
         <w:rPr>
           <w:rFonts w:ascii="Times New Roman" w:hAnsi="Times New Roman"/>
-          <w:sz w:val="20"/>
+          <w:sz w:val="16"/>
         </w:rPr>
-        <w:t>[16] DeepMind, "Boxoban levels," github.com/google-deepmind/boxoban-levels.</w:t>
+        <w:t>[16]</w:t>
+        <w:tab/>
+        <w:t>DeepMind, "Boxoban levels," github.com/google-deepmind/boxoban-levels.</w:t>
       </w:r>
     </w:p>
     <w:p>
       <w:pPr>
         <w:keepNext w:val="0"/>
+        <w:tabs>
+          <w:tab w:pos="400" w:val="left"/>
+        </w:tabs>
         <w:spacing w:before="0" w:after="0"/>
+        <w:ind w:left="400" w:hanging="400"/>
         <w:jc w:val="both"/>
       </w:pPr>
       <w:r>
         <w:rPr>
           <w:rFonts w:ascii="Times New Roman" w:hAnsi="Times New Roman"/>
-          <w:sz w:val="20"/>
+          <w:sz w:val="16"/>
         </w:rPr>
-        <w:t>[17] L. Perron and V. Furnon, "OR-Tools," Google, developers.google.com/optimization.</w:t>
+        <w:t>[17]</w:t>
+        <w:tab/>
+        <w:t>L. Perron and V. Furnon, "OR-Tools," Google, developers.google.com/optimization.</w:t>
       </w:r>
     </w:p>
     <w:p>
       <w:pPr>
         <w:keepNext w:val="0"/>
+        <w:tabs>
+          <w:tab w:pos="400" w:val="left"/>
+        </w:tabs>
         <w:spacing w:before="0" w:after="0"/>
+        <w:ind w:left="400" w:hanging="400"/>
         <w:jc w:val="both"/>
       </w:pPr>
       <w:r>
         <w:rPr>
           <w:rFonts w:ascii="Times New Roman" w:hAnsi="Times New Roman"/>
-          <w:sz w:val="20"/>
+          <w:sz w:val="16"/>
         </w:rPr>
-        <w:t xml:space="preserve">[18] I. Pohl, "Heuristic search viewed as path finding in a graph," </w:t>
+        <w:t>[18]</w:t>
+        <w:tab/>
+        <w:t xml:space="preserve">I. Pohl, "Heuristic search viewed as path finding in a graph," </w:t>
       </w:r>
       <w:r>
         <w:rPr>
           <w:rFonts w:ascii="Times New Roman" w:hAnsi="Times New Roman"/>
           <w:i/>
-          <w:sz w:val="20"/>
+          <w:sz w:val="16"/>
         </w:rPr>
         <w:t>Artificial Intelligence</w:t>
       </w:r>
       <w:r>
         <w:rPr>
           <w:rFonts w:ascii="Times New Roman" w:hAnsi="Times New Roman"/>
-          <w:sz w:val="20"/>
+          <w:sz w:val="16"/>
         </w:rPr>
         <w:t>, vol. 1, no. 3-4, pp. 193-204, 1970.</w:t>
       </w:r>
@@ -6450,28 +6570,34 @@
     <w:p>
       <w:pPr>
         <w:keepNext w:val="0"/>
+        <w:tabs>
+          <w:tab w:pos="400" w:val="left"/>
+        </w:tabs>
         <w:spacing w:before="0" w:after="0"/>
+        <w:ind w:left="400" w:hanging="400"/>
         <w:jc w:val="both"/>
       </w:pPr>
       <w:r>
         <w:rPr>
           <w:rFonts w:ascii="Times New Roman" w:hAnsi="Times New Roman"/>
-          <w:sz w:val="20"/>
+          <w:sz w:val="16"/>
         </w:rPr>
-        <w:t xml:space="preserve">[19] R. E. Korf, "Depth-first iterative-deepening: An optimal admissible tree search," </w:t>
+        <w:t>[19]</w:t>
+        <w:tab/>
+        <w:t xml:space="preserve">R. E. Korf, "Depth-first iterative-deepening: An optimal admissible tree search," </w:t>
       </w:r>
       <w:r>
         <w:rPr>
           <w:rFonts w:ascii="Times New Roman" w:hAnsi="Times New Roman"/>
           <w:i/>
-          <w:sz w:val="20"/>
+          <w:sz w:val="16"/>
         </w:rPr>
         <w:t>Artificial Intelligence</w:t>
       </w:r>
       <w:r>
         <w:rPr>
           <w:rFonts w:ascii="Times New Roman" w:hAnsi="Times New Roman"/>
-          <w:sz w:val="20"/>
+          <w:sz w:val="16"/>
         </w:rPr>
         <w:t>, vol. 27, no. 1, pp. 97-109, 1985.</w:t>
       </w:r>
@@ -6479,28 +6605,34 @@
     <w:p>
       <w:pPr>
         <w:keepNext w:val="0"/>
+        <w:tabs>
+          <w:tab w:pos="400" w:val="left"/>
+        </w:tabs>
         <w:spacing w:before="0" w:after="0"/>
+        <w:ind w:left="400" w:hanging="400"/>
         <w:jc w:val="both"/>
       </w:pPr>
       <w:r>
         <w:rPr>
           <w:rFonts w:ascii="Times New Roman" w:hAnsi="Times New Roman"/>
-          <w:sz w:val="20"/>
+          <w:sz w:val="16"/>
         </w:rPr>
-        <w:t xml:space="preserve">[20] R. E. Korf, "Finding optimal solutions to Rubik's Cube using pattern databases," in </w:t>
+        <w:t>[20]</w:t>
+        <w:tab/>
+        <w:t xml:space="preserve">R. E. Korf, "Finding optimal solutions to Rubik's Cube using pattern databases," in </w:t>
       </w:r>
       <w:r>
         <w:rPr>
           <w:rFonts w:ascii="Times New Roman" w:hAnsi="Times New Roman"/>
           <w:i/>
-          <w:sz w:val="20"/>
+          <w:sz w:val="16"/>
         </w:rPr>
         <w:t>Proc. AAAI-97</w:t>
       </w:r>
       <w:r>
         <w:rPr>
           <w:rFonts w:ascii="Times New Roman" w:hAnsi="Times New Roman"/>
-          <w:sz w:val="20"/>
+          <w:sz w:val="16"/>
         </w:rPr>
         <w:t>, 1997, pp. 700-705.</w:t>
       </w:r>
@@ -6508,28 +6640,34 @@
     <w:p>
       <w:pPr>
         <w:keepNext w:val="0"/>
+        <w:tabs>
+          <w:tab w:pos="400" w:val="left"/>
+        </w:tabs>
         <w:spacing w:before="0" w:after="0"/>
+        <w:ind w:left="400" w:hanging="400"/>
         <w:jc w:val="both"/>
       </w:pPr>
       <w:r>
         <w:rPr>
           <w:rFonts w:ascii="Times New Roman" w:hAnsi="Times New Roman"/>
-          <w:sz w:val="20"/>
+          <w:sz w:val="16"/>
         </w:rPr>
-        <w:t xml:space="preserve">[21] T. Rokicki, H. Kociemba, M. Davidson, and J. Dethridge, "The diameter of the Rubik's Cube group is twenty," </w:t>
+        <w:t>[21]</w:t>
+        <w:tab/>
+        <w:t xml:space="preserve">T. Rokicki, H. Kociemba, M. Davidson, and J. Dethridge, "The diameter of the Rubik's Cube group is twenty," </w:t>
       </w:r>
       <w:r>
         <w:rPr>
           <w:rFonts w:ascii="Times New Roman" w:hAnsi="Times New Roman"/>
           <w:i/>
-          <w:sz w:val="20"/>
+          <w:sz w:val="16"/>
         </w:rPr>
         <w:t>SIAM Journal on Discrete Mathematics</w:t>
       </w:r>
       <w:r>
         <w:rPr>
           <w:rFonts w:ascii="Times New Roman" w:hAnsi="Times New Roman"/>
-          <w:sz w:val="20"/>
+          <w:sz w:val="16"/>
         </w:rPr>
         <w:t>, vol. 27, no. 2, pp. 1082-1105, 2013.</w:t>
       </w:r>
@@ -6537,28 +6675,34 @@
     <w:p>
       <w:pPr>
         <w:keepNext w:val="0"/>
+        <w:tabs>
+          <w:tab w:pos="400" w:val="left"/>
+        </w:tabs>
         <w:spacing w:before="0" w:after="0"/>
+        <w:ind w:left="400" w:hanging="400"/>
         <w:jc w:val="both"/>
       </w:pPr>
       <w:r>
         <w:rPr>
           <w:rFonts w:ascii="Times New Roman" w:hAnsi="Times New Roman"/>
-          <w:sz w:val="20"/>
+          <w:sz w:val="16"/>
         </w:rPr>
-        <w:t xml:space="preserve">[22] J. D. Beasley, </w:t>
+        <w:t>[22]</w:t>
+        <w:tab/>
+        <w:t xml:space="preserve">J. D. Beasley, </w:t>
       </w:r>
       <w:r>
         <w:rPr>
           <w:rFonts w:ascii="Times New Roman" w:hAnsi="Times New Roman"/>
           <w:i/>
-          <w:sz w:val="20"/>
+          <w:sz w:val="16"/>
         </w:rPr>
         <w:t>The Ins and Outs of Peg Solitaire</w:t>
       </w:r>
       <w:r>
         <w:rPr>
           <w:rFonts w:ascii="Times New Roman" w:hAnsi="Times New Roman"/>
-          <w:sz w:val="20"/>
+          <w:sz w:val="16"/>
         </w:rPr>
         <w:t>. Oxford University Press, 1985.</w:t>
       </w:r>
@@ -6566,28 +6710,34 @@
     <w:p>
       <w:pPr>
         <w:keepNext w:val="0"/>
+        <w:tabs>
+          <w:tab w:pos="400" w:val="left"/>
+        </w:tabs>
         <w:spacing w:before="0" w:after="0"/>
+        <w:ind w:left="400" w:hanging="400"/>
         <w:jc w:val="both"/>
       </w:pPr>
       <w:r>
         <w:rPr>
           <w:rFonts w:ascii="Times New Roman" w:hAnsi="Times New Roman"/>
-          <w:sz w:val="20"/>
+          <w:sz w:val="16"/>
         </w:rPr>
-        <w:t xml:space="preserve">[23] E. R. Berlekamp, J. H. Conway, and R. K. Guy, </w:t>
+        <w:t>[23]</w:t>
+        <w:tab/>
+        <w:t xml:space="preserve">E. R. Berlekamp, J. H. Conway, and R. K. Guy, </w:t>
       </w:r>
       <w:r>
         <w:rPr>
           <w:rFonts w:ascii="Times New Roman" w:hAnsi="Times New Roman"/>
           <w:i/>
-          <w:sz w:val="20"/>
+          <w:sz w:val="16"/>
         </w:rPr>
         <w:t>Winning Ways for your Mathematical Plays</w:t>
       </w:r>
       <w:r>
         <w:rPr>
           <w:rFonts w:ascii="Times New Roman" w:hAnsi="Times New Roman"/>
-          <w:sz w:val="20"/>
+          <w:sz w:val="16"/>
         </w:rPr>
         <w:t>. Academic Press, 1982.</w:t>
       </w:r>
@@ -6595,28 +6745,34 @@
     <w:p>
       <w:pPr>
         <w:keepNext w:val="0"/>
+        <w:tabs>
+          <w:tab w:pos="400" w:val="left"/>
+        </w:tabs>
         <w:spacing w:before="0" w:after="0"/>
+        <w:ind w:left="400" w:hanging="400"/>
         <w:jc w:val="both"/>
       </w:pPr>
       <w:r>
         <w:rPr>
           <w:rFonts w:ascii="Times New Roman" w:hAnsi="Times New Roman"/>
-          <w:sz w:val="20"/>
+          <w:sz w:val="16"/>
         </w:rPr>
-        <w:t xml:space="preserve">[24] E. A. Hansen and S. Zilberstein, "LAO*: A heuristic search algorithm that finds solutions with loops," </w:t>
+        <w:t>[24]</w:t>
+        <w:tab/>
+        <w:t xml:space="preserve">E. A. Hansen and S. Zilberstein, "LAO*: A heuristic search algorithm that finds solutions with loops," </w:t>
       </w:r>
       <w:r>
         <w:rPr>
           <w:rFonts w:ascii="Times New Roman" w:hAnsi="Times New Roman"/>
           <w:i/>
-          <w:sz w:val="20"/>
+          <w:sz w:val="16"/>
         </w:rPr>
         <w:t>Artificial Intelligence</w:t>
       </w:r>
       <w:r>
         <w:rPr>
           <w:rFonts w:ascii="Times New Roman" w:hAnsi="Times New Roman"/>
-          <w:sz w:val="20"/>
+          <w:sz w:val="16"/>
         </w:rPr>
         <w:t>, vol. 129, no. 1-2, pp. 35-62, 2001.</w:t>
       </w:r>

</xml_diff>

<commit_message>
Paper: third rewrite per audit rules, Fig. 1 as native Word canvas
Co-Authored-By: Claude Sonnet 5.5 <noreply@anthropic.com>
</commit_message>
<xml_diff>
--- a/paper/paper.docx
+++ b/paper/paper.docx
@@ -449,7 +449,7 @@
           <w:b/>
           <w:sz w:val="18"/>
         </w:rPr>
-        <w:t>TAPE builds one graph out of several candidate plans and hands the choice of path to a solver. It never asks whether a move is allowed by the task's rules, and it uses one solver for every problem. We bolted three things onto it. Each game gets a rule checker that throws out or discounts moves. A small database remembers which moves failed before. And a cost-based rule picks A* or a constraint solver depending on how many pieces can move. No language model is used anywhere, because our guide did not allow one. We ran the result on Sokoban, River Crossing, Rush Hour, Peg Solitaire, the 24-puzzle, the Rubik's cube and 3,000 public Boxoban levels. The checker took River Crossing from 0% to 100% safe success. As a pruner it raised the share of solved Boxoban levels at every budget we tried; on the hard set at 30,000 nodes the figure went from 54% to 82%. Picking A* for single-piece games cut planning time on one-box Sokoban from 51.8 ms to 7.6 ms. Remembering failures reduced replans on two of four games. A plain depth-first search beat weighted A* by a factor of thirteen on Peg Solitaire. Two ideas did nothing: tuning the cost weights, and merging plans to shorten paths.</w:t>
+        <w:t>TAPE merges several candidate plans into one graph and lets a solver choose the path. It never checks a move against the rules of the task, and the solver is the same for every problem. We added a rule checker for each game, a store of past move failures, and a cost rule that sends one-piece problems to A* and the rest to CP-SAT. The system contains no language model, since our guide ruled that out. On River Crossing the checker moved safe success from 0% to 100%. On 3,000 Boxoban levels it solved more levels at every node budget, reaching 82% on the hard set at 30,000 nodes against 54% without it. Using A* for single-piece games cut planning time on one-box Sokoban from 51.8 ms to 7.6 ms, and the failure store reduced replans on two of four games. We then added Peg Solitaire, the 24-puzzle and the Rubik's cube as harder tests. On the Peg Solitaire start, plain depth-first search needed 10,845 nodes where weighted A* needed 139,048. Tuning the cost weights and merging plans gave no gain.</w:t>
       </w:r>
     </w:p>
     <w:p>
@@ -511,7 +511,7 @@
         <w:rPr>
           <w:rFonts w:ascii="Times New Roman" w:hAnsi="Times New Roman"/>
         </w:rPr>
-        <w:t>Anyone who has watched a planner walk into a wall knows the problem. A plan can look reasonable and still contain one move that the rules forbid. TAPE [1] asks a language model for several plans, merges the states they share into a graph, and lets an integer program find the cheapest path. When reality disagrees with the prediction it plans again from where it actually is. The authors list two weak points themselves. The graph is only as good as the plans that went into it. And the solver is picked ahead of time, whatever the problem looks like.</w:t>
+        <w:t>TAPE [1] asks a language model for several plans, merges the states they share into a graph, and has an integer program pick the cheapest path. If the world disagrees with a prediction, it plans again from the real state. Its authors name two limits. The graph is only as good as the plans behind it, and the solver is fixed in advance.</w:t>
       </w:r>
     </w:p>
     <w:p>
@@ -525,7 +525,7 @@
         <w:rPr>
           <w:rFonts w:ascii="Times New Roman" w:hAnsi="Times New Roman"/>
         </w:rPr>
-        <w:t>We wanted to see what those weak points cost in settings where the rules are exact and we can check everything. Three small cases made it concrete. In River Crossing a plan can reach the far bank after leaving more cannibals than missionaries somewhere along the way, and since our environment accepts every move, a pipeline that checks only legality calls this a success. In Sokoban a single push into a corner ends the level, yet the pipeline finds out only when the search comes back empty. In Rush Hour two stuck vehicles can seal a row for good. A short rule check catches each of these before any search effort is spent.</w:t>
+        <w:t>Three small cases show what the first limit costs. In River Crossing a plan can reach the far bank after leaving more cannibals than missionaries on one side, and because our environment accepts every move, a pipeline that checks only legality reports success. In Sokoban one push into a corner ends the level, but the pipeline learns this only when the search returns nothing. In Rush Hour two stuck vehicles can seal a row for good. In all three a short rule check would have caught the problem before any search effort was spent.</w:t>
       </w:r>
     </w:p>
     <w:p>
@@ -539,7 +539,7 @@
         <w:rPr>
           <w:rFonts w:ascii="Times New Roman" w:hAnsi="Times New Roman"/>
         </w:rPr>
-        <w:t>So we added four pieces and tested them on seven games. A checker per game rejects forbidden moves and lowers confidence in doubtful ones. An experience store remembers earlier failures. A cost function turns progress, confidence and the remaining step budget into one number per move. A selection rule sends single-piece problems to A* and the rest to a constraint solver. Afterwards we asked a blunter question: would a better search method have helped more than any of this? For that we compared BFS, DFS, weighted A* and a meet-in-the-middle search on the same games. Our proposers are ordinary programs. Every run can be repeated from a seed, and we can dial the quality of the candidate plans up and down, which a language model would not let us do.</w:t>
+        <w:t>We therefore put a checker for each game in front of the solver, gave the pipeline a memory of failed moves, and let the piece count decide between A* and CP-SAT. Four questions follow. Does the checker change outcomes? Does the memory reduce replans? Does choosing the solver save time? And would a better search method have done more than any of these? We answer them on seven games with proposers that are ordinary programs. Runs repeat exactly from a seed, and we can set how good the candidate plans are, which a language model would not allow.</w:t>
       </w:r>
     </w:p>
     <w:p>
@@ -575,7 +575,7 @@
         <w:rPr>
           <w:rFonts w:ascii="Times New Roman" w:hAnsi="Times New Roman"/>
         </w:rPr>
-        <w:t>Most agent work with language models belongs to one of three families. The first alternates thinking and acting. ReAct [2] interleaves reasoning with tool calls, Reflexion [5] keeps a written memory of past mistakes, and Toolformer [6] teaches a model when to call a tool at all. The second family searches over reasoning steps: Tree of Thoughts [3] expands and scores branches, Graph of Thoughts [4] lets branches merge, and chain-of-thought [7], Plan-and-Solve [8] and ReWOO [9] settle on a plan first and act later. TAPE [1] is the third. It merges plans into a graph and gives the path choice to an external solver, and it was tested on Sokoban, ALFWorld [10], MuSiQue [11] and GSM8K-Hard (from GSM8K [12]).</w:t>
+        <w:t>Agent work with language models splits into three groups that differ in where the plan comes from. ReAct [2] interleaves reasoning with tool calls, Reflexion [5] adds a written memory of past failures, and Toolformer [6] teaches a model when to call a tool. Tree of Thoughts [3] and Graph of Thoughts [4] search over reasoning steps instead; the graph version lets branches merge. Chain-of-thought [7], Plan-and-Solve [8] and ReWOO [9] fix the plan before acting. TAPE [1] sits between these: it merges plans into a graph and gives path choice to an external solver. Its tests were Sokoban, ALFWorld [10], MuSiQue [11] and GSM8K-Hard, which is derived from GSM8K [12].</w:t>
       </w:r>
     </w:p>
     <w:p>
@@ -589,7 +589,7 @@
         <w:rPr>
           <w:rFonts w:ascii="Times New Roman" w:hAnsi="Times New Roman"/>
         </w:rPr>
-        <w:t>What these systems share is that a plan is judged by running it or by asking a model. None of them tests a step against a rule written down by the task's designer. Reflexion's memory is prose, so it cannot change the price of one particular move. TAPE comes closest to our setting, but it trusts every move it is given and fixes its solver in advance.</w:t>
+        <w:t>All of these judge a plan by running it or by asking a model. None tests a step against a rule that the task's designer wrote down. Reflexion's memory is prose, so it cannot change the price of one particular move, and TAPE trusts every move it is shown. That is the gap we work on.</w:t>
       </w:r>
     </w:p>
     <w:p>
@@ -603,7 +603,7 @@
         <w:rPr>
           <w:rFonts w:ascii="Times New Roman" w:hAnsi="Times New Roman"/>
         </w:rPr>
-        <w:t>For the testing we lean on older search work. Weighted A* [18] gives up plan length for speed. Iterative deepening [19] made optimal sliding-tile solving practical, pattern databases did the same for the cube [20], and the cube's diameter turned out to be twenty moves [21]. Sokoban [14] and Rush Hour [15] are both PSPACE-complete. Dead-corner pruning is routine in Sokoban solvers, so we treat it as a baseline to measure, not as something new. Peg Solitaire has its own proof device, the pagoda function [22], [23], and we use it as a checker. AO* is for actions with several outcomes and LAO* [24] extends it to graphs with loops; Section V-G says why we did not need either. Levels come from the public Boxoban set [16] and the solver is CP-SAT from OR-Tools [17].</w:t>
+        <w:t>The search side is older. Weighted A* [18] trades plan length for speed. Iterative deepening [19] made optimal sliding-tile solving practical, pattern databases did the same for the cube [20], and the cube's diameter is twenty moves [21]. Sokoban [14] and Rush Hour [15] are PSPACE-complete. Dead-corner pruning is routine in Sokoban solvers, so we measure it as a baseline and do not claim it. Peg Solitaire has pagoda functions [22], [23], which we use as a checker. AO* handles actions with several outcomes and LAO* [24] handles loops among them; Section V-G explains why we did not need either. Levels come from the public Boxoban set [16] and the solver is OR-Tools CP-SAT [17].</w:t>
       </w:r>
     </w:p>
     <w:p>
@@ -639,7 +639,7 @@
         <w:rPr>
           <w:rFonts w:ascii="Times New Roman" w:hAnsi="Times New Roman"/>
         </w:rPr>
-        <w:t>Each game implements the same six things: a list of actions, a step function that returns the next state and whether the move was legal, a goal test, a heuristic distance to the goal, a count of pieces that move independently, and a text renderer. Nothing downstream knows which game it is running, so a new game costs one interface and one checker.</w:t>
+        <w:t>Every game implements the same interface: a list of actions, a step function that returns the next state and whether the move was legal, a goal test, a heuristic distance, a count of independently movable pieces, and a text renderer. The rest of the pipeline never learns which game it is running. Adding a game means writing that interface and one checker.</w:t>
       </w:r>
     </w:p>
     <w:p>
@@ -654,7 +654,7 @@
           <w:i/>
           <w:sz w:val="20"/>
         </w:rPr>
-        <w:t>A. System Architecture Overview</w:t>
+        <w:t>A. System architecture</w:t>
       </w:r>
     </w:p>
     <w:p>
@@ -668,7 +668,7 @@
         <w:rPr>
           <w:rFonts w:ascii="Times New Roman" w:hAnsi="Times New Roman"/>
         </w:rPr>
-        <w:t>One planning round is drawn in Fig. 1. The proposer returns candidate plans from the current state. We replay each plan move by move and merge identical states into a single node of a directed graph. The checker then judges every move and the experience store adjusts its confidence. Moves that survive get a cost, and the solver looks for the cheapest path from the current state to a goal. That path is executed. If a move lands somewhere other than predicted, the failure is recorded and a new round begins from the real state. Proposing, merging and executing come from TAPE. The checking and the cost-driven solver choice are our additions.</w:t>
+        <w:t>Fig. 1 shows one planning round. The proposer returns candidate plans from the current state. Each plan is replayed move by move and identical states are merged into one node of a directed graph. The checker then judges every move and the experience store adjusts its confidence. Surviving moves get a cost, and the solver finds the cheapest path from the current state to a goal. The path is executed. When a move lands somewhere other than predicted, the failure is recorded and a new round starts from the real state. Proposing, merging and executing come from TAPE. Checking and the choice of solver by cost are ours.</w:t>
       </w:r>
     </w:p>
     <w:p>
@@ -678,34 +678,549 @@
         <w:jc w:val="center"/>
       </w:pPr>
       <w:r>
-        <w:drawing>
-          <wp:inline xmlns:a="http://schemas.openxmlformats.org/drawingml/2006/main" xmlns:pic="http://schemas.openxmlformats.org/drawingml/2006/picture">
-            <wp:extent cx="3048000" cy="2232392"/>
-            <wp:docPr id="1" name="Picture 1"/>
-            <wp:cNvGraphicFramePr>
-              <a:graphicFrameLocks noChangeAspect="1"/>
-            </wp:cNvGraphicFramePr>
+        <w:drawing xmlns:a="http://schemas.openxmlformats.org/drawingml/2006/main">
+          <wp:inline distT="0" distB="0" distL="0" distR="0">
+            <wp:extent cx="3073400" cy="3154679"/>
+            <wp:effectExtent l="0" t="0" r="0" b="0"/>
+            <wp:docPr id="199" name="Pipeline canvas"/>
+            <wp:cNvGraphicFramePr/>
             <a:graphic>
-              <a:graphicData uri="http://schemas.openxmlformats.org/drawingml/2006/picture">
-                <pic:pic>
-                  <pic:nvPicPr>
-                    <pic:cNvPr id="0" name="pipeline.png"/>
-                    <pic:cNvPicPr/>
-                  </pic:nvPicPr>
-                  <pic:blipFill>
-                    <a:blip r:embed="rId13"/>
-                    <a:stretch>
-                      <a:fillRect/>
-                    </a:stretch>
-                  </pic:blipFill>
-                  <pic:spPr>
-                    <a:xfrm>
-                      <a:off x="0" y="0"/>
-                      <a:ext cx="3048000" cy="2232392"/>
-                    </a:xfrm>
-                    <a:prstGeom prst="rect"/>
-                  </pic:spPr>
-                </pic:pic>
+              <a:graphicData uri="http://schemas.microsoft.com/office/word/2010/wordprocessingCanvas">
+                <wpc:wpc>
+                  <wpc:bg>
+                    <a:noFill/>
+                  </wpc:bg>
+                  <wpc:whole>
+                    <a:ln>
+                      <a:noFill/>
+                    </a:ln>
+                  </wpc:whole>
+                  <wps:wsp>
+                    <wps:cNvPr id="200" name="Stage 200"/>
+                    <wps:cNvSpPr/>
+                    <wps:spPr>
+                      <a:xfrm>
+                        <a:off x="419100" y="0"/>
+                        <a:ext cx="1905000" cy="312420"/>
+                      </a:xfrm>
+                      <a:prstGeom prst="rect">
+                        <a:avLst/>
+                      </a:prstGeom>
+                      <a:solidFill>
+                        <a:srgbClr val="FFFFFF"/>
+                      </a:solidFill>
+                      <a:ln w="9525">
+                        <a:solidFill>
+                          <a:srgbClr val="000000"/>
+                        </a:solidFill>
+                      </a:ln>
+                    </wps:spPr>
+                    <wps:txbx>
+                      <w:txbxContent>
+                        <w:p>
+                          <w:pPr>
+                            <w:jc w:val="center"/>
+                            <w:spacing w:before="0" w:after="0" w:line="240" w:lineRule="auto"/>
+                          </w:pPr>
+                          <w:r>
+                            <w:rPr>
+                              <w:rFonts w:ascii="Times New Roman" w:hAnsi="Times New Roman" w:cs="Times New Roman"/>
+                              <w:b/>
+                              <w:sz w:val="17"/>
+                            </w:rPr>
+                            <w:t xml:space="preserve">Environment</w:t>
+                          </w:r>
+                        </w:p>
+                        <w:p>
+                          <w:pPr>
+                            <w:jc w:val="center"/>
+                            <w:spacing w:before="0" w:after="0" w:line="240" w:lineRule="auto"/>
+                          </w:pPr>
+                          <w:r>
+                            <w:rPr>
+                              <w:rFonts w:ascii="Times New Roman" w:hAnsi="Times New Roman" w:cs="Times New Roman"/>
+                              <w:sz w:val="14"/>
+                            </w:rPr>
+                            <w:t xml:space="preserve">state, legal moves, goal test</w:t>
+                          </w:r>
+                        </w:p>
+                      </w:txbxContent>
+                    </wps:txbx>
+                    <wps:bodyPr rot="0" vert="horz" wrap="square" lIns="36000" tIns="18000" rIns="36000" bIns="18000" anchor="ctr" anchorCtr="0">
+                      <a:noAutofit/>
+                    </wps:bodyPr>
+                  </wps:wsp>
+                  <wps:wsp>
+                    <wps:cNvPr id="201" name="Stage 201"/>
+                    <wps:cNvSpPr/>
+                    <wps:spPr>
+                      <a:xfrm>
+                        <a:off x="165100" y="502920"/>
+                        <a:ext cx="2413000" cy="312420"/>
+                      </a:xfrm>
+                      <a:prstGeom prst="rect">
+                        <a:avLst/>
+                      </a:prstGeom>
+                      <a:solidFill>
+                        <a:srgbClr val="FFFFFF"/>
+                      </a:solidFill>
+                      <a:ln w="9525">
+                        <a:solidFill>
+                          <a:srgbClr val="000000"/>
+                        </a:solidFill>
+                      </a:ln>
+                    </wps:spPr>
+                    <wps:txbx>
+                      <w:txbxContent>
+                        <w:p>
+                          <w:pPr>
+                            <w:jc w:val="center"/>
+                            <w:spacing w:before="0" w:after="0" w:line="240" w:lineRule="auto"/>
+                          </w:pPr>
+                          <w:r>
+                            <w:rPr>
+                              <w:rFonts w:ascii="Times New Roman" w:hAnsi="Times New Roman" w:cs="Times New Roman"/>
+                              <w:b/>
+                              <w:sz w:val="17"/>
+                            </w:rPr>
+                            <w:t xml:space="preserve">Propose</w:t>
+                          </w:r>
+                        </w:p>
+                        <w:p>
+                          <w:pPr>
+                            <w:jc w:val="center"/>
+                            <w:spacing w:before="0" w:after="0" w:line="240" w:lineRule="auto"/>
+                          </w:pPr>
+                          <w:r>
+                            <w:rPr>
+                              <w:rFonts w:ascii="Times New Roman" w:hAnsi="Times New Roman" w:cs="Times New Roman"/>
+                              <w:sz w:val="14"/>
+                            </w:rPr>
+                            <w:t xml:space="preserve">candidate plans from the current state</w:t>
+                          </w:r>
+                        </w:p>
+                      </w:txbxContent>
+                    </wps:txbx>
+                    <wps:bodyPr rot="0" vert="horz" wrap="square" lIns="36000" tIns="18000" rIns="36000" bIns="18000" anchor="ctr" anchorCtr="0">
+                      <a:noAutofit/>
+                    </wps:bodyPr>
+                  </wps:wsp>
+                  <wps:wsp>
+                    <wps:cNvPr id="202" name="Arrow 202"/>
+                    <wps:cNvCnPr/>
+                    <wps:spPr>
+                      <a:xfrm>
+                        <a:off x="1371600" y="312420"/>
+                        <a:ext cx="0" cy="190500"/>
+                      </a:xfrm>
+                      <a:prstGeom prst="line">
+                        <a:avLst/>
+                      </a:prstGeom>
+                      <a:ln w="9525">
+                        <a:solidFill>
+                          <a:srgbClr val="000000"/>
+                        </a:solidFill>
+                        <a:tailEnd type="triangle" w="med" len="med"/>
+                      </a:ln>
+                    </wps:spPr>
+                    <wps:bodyPr/>
+                  </wps:wsp>
+                  <wps:wsp>
+                    <wps:cNvPr id="203" name="Stage 203"/>
+                    <wps:cNvSpPr/>
+                    <wps:spPr>
+                      <a:xfrm>
+                        <a:off x="12700" y="1005840"/>
+                        <a:ext cx="2717800" cy="312420"/>
+                      </a:xfrm>
+                      <a:prstGeom prst="rect">
+                        <a:avLst/>
+                      </a:prstGeom>
+                      <a:solidFill>
+                        <a:srgbClr val="FFFFFF"/>
+                      </a:solidFill>
+                      <a:ln w="9525">
+                        <a:solidFill>
+                          <a:srgbClr val="000000"/>
+                        </a:solidFill>
+                      </a:ln>
+                    </wps:spPr>
+                    <wps:txbx>
+                      <w:txbxContent>
+                        <w:p>
+                          <w:pPr>
+                            <w:jc w:val="center"/>
+                            <w:spacing w:before="0" w:after="0" w:line="240" w:lineRule="auto"/>
+                          </w:pPr>
+                          <w:r>
+                            <w:rPr>
+                              <w:rFonts w:ascii="Times New Roman" w:hAnsi="Times New Roman" w:cs="Times New Roman"/>
+                              <w:b/>
+                              <w:sz w:val="17"/>
+                            </w:rPr>
+                            <w:t xml:space="preserve">Merge</w:t>
+                          </w:r>
+                        </w:p>
+                        <w:p>
+                          <w:pPr>
+                            <w:jc w:val="center"/>
+                            <w:spacing w:before="0" w:after="0" w:line="240" w:lineRule="auto"/>
+                          </w:pPr>
+                          <w:r>
+                            <w:rPr>
+                              <w:rFonts w:ascii="Times New Roman" w:hAnsi="Times New Roman" w:cs="Times New Roman"/>
+                              <w:sz w:val="14"/>
+                            </w:rPr>
+                            <w:t xml:space="preserve">replay every plan and join equal states into one directed graph</w:t>
+                          </w:r>
+                        </w:p>
+                      </w:txbxContent>
+                    </wps:txbx>
+                    <wps:bodyPr rot="0" vert="horz" wrap="square" lIns="36000" tIns="18000" rIns="36000" bIns="18000" anchor="ctr" anchorCtr="0">
+                      <a:noAutofit/>
+                    </wps:bodyPr>
+                  </wps:wsp>
+                  <wps:wsp>
+                    <wps:cNvPr id="204" name="Arrow 204"/>
+                    <wps:cNvCnPr/>
+                    <wps:spPr>
+                      <a:xfrm>
+                        <a:off x="1371600" y="815340"/>
+                        <a:ext cx="0" cy="190500"/>
+                      </a:xfrm>
+                      <a:prstGeom prst="line">
+                        <a:avLst/>
+                      </a:prstGeom>
+                      <a:ln w="9525">
+                        <a:solidFill>
+                          <a:srgbClr val="000000"/>
+                        </a:solidFill>
+                        <a:tailEnd type="triangle" w="med" len="med"/>
+                      </a:ln>
+                    </wps:spPr>
+                    <wps:bodyPr/>
+                  </wps:wsp>
+                  <wps:wsp>
+                    <wps:cNvPr id="205" name="Stage 205"/>
+                    <wps:cNvSpPr/>
+                    <wps:spPr>
+                      <a:xfrm>
+                        <a:off x="-63500" y="1508760"/>
+                        <a:ext cx="2870200" cy="421640"/>
+                      </a:xfrm>
+                      <a:prstGeom prst="rect">
+                        <a:avLst/>
+                      </a:prstGeom>
+                      <a:solidFill>
+                        <a:srgbClr val="D9D9D9"/>
+                      </a:solidFill>
+                      <a:ln w="19050">
+                        <a:solidFill>
+                          <a:srgbClr val="000000"/>
+                        </a:solidFill>
+                      </a:ln>
+                    </wps:spPr>
+                    <wps:txbx>
+                      <w:txbxContent>
+                        <w:p>
+                          <w:pPr>
+                            <w:jc w:val="center"/>
+                            <w:spacing w:before="0" w:after="0" w:line="240" w:lineRule="auto"/>
+                          </w:pPr>
+                          <w:r>
+                            <w:rPr>
+                              <w:rFonts w:ascii="Times New Roman" w:hAnsi="Times New Roman" w:cs="Times New Roman"/>
+                              <w:b/>
+                              <w:sz w:val="17"/>
+                            </w:rPr>
+                            <w:t xml:space="preserve">Check</w:t>
+                          </w:r>
+                        </w:p>
+                        <w:p>
+                          <w:pPr>
+                            <w:jc w:val="center"/>
+                            <w:spacing w:before="0" w:after="0" w:line="240" w:lineRule="auto"/>
+                          </w:pPr>
+                          <w:r>
+                            <w:rPr>
+                              <w:rFonts w:ascii="Times New Roman" w:hAnsi="Times New Roman" w:cs="Times New Roman"/>
+                              <w:sz w:val="14"/>
+                            </w:rPr>
+                            <w:t xml:space="preserve">a per-game validator rejects or discounts moves; the experience store scales confidence by past failures</w:t>
+                          </w:r>
+                        </w:p>
+                      </w:txbxContent>
+                    </wps:txbx>
+                    <wps:bodyPr rot="0" vert="horz" wrap="square" lIns="36000" tIns="18000" rIns="36000" bIns="18000" anchor="ctr" anchorCtr="0">
+                      <a:noAutofit/>
+                    </wps:bodyPr>
+                  </wps:wsp>
+                  <wps:wsp>
+                    <wps:cNvPr id="206" name="Arrow 206"/>
+                    <wps:cNvCnPr/>
+                    <wps:spPr>
+                      <a:xfrm>
+                        <a:off x="1371600" y="1318260"/>
+                        <a:ext cx="0" cy="190500"/>
+                      </a:xfrm>
+                      <a:prstGeom prst="line">
+                        <a:avLst/>
+                      </a:prstGeom>
+                      <a:ln w="9525">
+                        <a:solidFill>
+                          <a:srgbClr val="000000"/>
+                        </a:solidFill>
+                        <a:tailEnd type="triangle" w="med" len="med"/>
+                      </a:ln>
+                    </wps:spPr>
+                    <wps:bodyPr/>
+                  </wps:wsp>
+                  <wps:wsp>
+                    <wps:cNvPr id="207" name="Stage 207"/>
+                    <wps:cNvSpPr/>
+                    <wps:spPr>
+                      <a:xfrm>
+                        <a:off x="-63500" y="2120900"/>
+                        <a:ext cx="2870200" cy="421640"/>
+                      </a:xfrm>
+                      <a:prstGeom prst="rect">
+                        <a:avLst/>
+                      </a:prstGeom>
+                      <a:solidFill>
+                        <a:srgbClr val="D9D9D9"/>
+                      </a:solidFill>
+                      <a:ln w="19050">
+                        <a:solidFill>
+                          <a:srgbClr val="000000"/>
+                        </a:solidFill>
+                      </a:ln>
+                    </wps:spPr>
+                    <wps:txbx>
+                      <w:txbxContent>
+                        <w:p>
+                          <w:pPr>
+                            <w:jc w:val="center"/>
+                            <w:spacing w:before="0" w:after="0" w:line="240" w:lineRule="auto"/>
+                          </w:pPr>
+                          <w:r>
+                            <w:rPr>
+                              <w:rFonts w:ascii="Times New Roman" w:hAnsi="Times New Roman" w:cs="Times New Roman"/>
+                              <w:b/>
+                              <w:sz w:val="17"/>
+                            </w:rPr>
+                            <w:t xml:space="preserve">Choose</w:t>
+                          </w:r>
+                        </w:p>
+                        <w:p>
+                          <w:pPr>
+                            <w:jc w:val="center"/>
+                            <w:spacing w:before="0" w:after="0" w:line="240" w:lineRule="auto"/>
+                          </w:pPr>
+                          <w:r>
+                            <w:rPr>
+                              <w:rFonts w:ascii="Times New Roman" w:hAnsi="Times New Roman" w:cs="Times New Roman"/>
+                              <w:sz w:val="14"/>
+                            </w:rPr>
+                            <w:t xml:space="preserve">price each move, then run A* if one piece moves and CP-SAT if several do</w:t>
+                          </w:r>
+                        </w:p>
+                      </w:txbxContent>
+                    </wps:txbx>
+                    <wps:bodyPr rot="0" vert="horz" wrap="square" lIns="36000" tIns="18000" rIns="36000" bIns="18000" anchor="ctr" anchorCtr="0">
+                      <a:noAutofit/>
+                    </wps:bodyPr>
+                  </wps:wsp>
+                  <wps:wsp>
+                    <wps:cNvPr id="208" name="Arrow 208"/>
+                    <wps:cNvCnPr/>
+                    <wps:spPr>
+                      <a:xfrm>
+                        <a:off x="1371600" y="1930400"/>
+                        <a:ext cx="0" cy="190500"/>
+                      </a:xfrm>
+                      <a:prstGeom prst="line">
+                        <a:avLst/>
+                      </a:prstGeom>
+                      <a:ln w="9525">
+                        <a:solidFill>
+                          <a:srgbClr val="000000"/>
+                        </a:solidFill>
+                        <a:tailEnd type="triangle" w="med" len="med"/>
+                      </a:ln>
+                    </wps:spPr>
+                    <wps:bodyPr/>
+                  </wps:wsp>
+                  <wps:wsp>
+                    <wps:cNvPr id="209" name="Stage 209"/>
+                    <wps:cNvSpPr/>
+                    <wps:spPr>
+                      <a:xfrm>
+                        <a:off x="241300" y="2733040"/>
+                        <a:ext cx="2260600" cy="421640"/>
+                      </a:xfrm>
+                      <a:prstGeom prst="rect">
+                        <a:avLst/>
+                      </a:prstGeom>
+                      <a:solidFill>
+                        <a:srgbClr val="FFFFFF"/>
+                      </a:solidFill>
+                      <a:ln w="9525">
+                        <a:solidFill>
+                          <a:srgbClr val="000000"/>
+                        </a:solidFill>
+                      </a:ln>
+                    </wps:spPr>
+                    <wps:txbx>
+                      <w:txbxContent>
+                        <w:p>
+                          <w:pPr>
+                            <w:jc w:val="center"/>
+                            <w:spacing w:before="0" w:after="0" w:line="240" w:lineRule="auto"/>
+                          </w:pPr>
+                          <w:r>
+                            <w:rPr>
+                              <w:rFonts w:ascii="Times New Roman" w:hAnsi="Times New Roman" w:cs="Times New Roman"/>
+                              <w:b/>
+                              <w:sz w:val="17"/>
+                            </w:rPr>
+                            <w:t xml:space="preserve">Run</w:t>
+                          </w:r>
+                        </w:p>
+                        <w:p>
+                          <w:pPr>
+                            <w:jc w:val="center"/>
+                            <w:spacing w:before="0" w:after="0" w:line="240" w:lineRule="auto"/>
+                          </w:pPr>
+                          <w:r>
+                            <w:rPr>
+                              <w:rFonts w:ascii="Times New Roman" w:hAnsi="Times New Roman" w:cs="Times New Roman"/>
+                              <w:sz w:val="14"/>
+                            </w:rPr>
+                            <w:t xml:space="preserve">execute the path; on a mismatch, record the failure and replan from the real state</w:t>
+                          </w:r>
+                        </w:p>
+                      </w:txbxContent>
+                    </wps:txbx>
+                    <wps:bodyPr rot="0" vert="horz" wrap="square" lIns="36000" tIns="18000" rIns="36000" bIns="18000" anchor="ctr" anchorCtr="0">
+                      <a:noAutofit/>
+                    </wps:bodyPr>
+                  </wps:wsp>
+                  <wps:wsp>
+                    <wps:cNvPr id="210" name="Arrow 210"/>
+                    <wps:cNvCnPr/>
+                    <wps:spPr>
+                      <a:xfrm>
+                        <a:off x="1371600" y="2542540"/>
+                        <a:ext cx="0" cy="190500"/>
+                      </a:xfrm>
+                      <a:prstGeom prst="line">
+                        <a:avLst/>
+                      </a:prstGeom>
+                      <a:ln w="9525">
+                        <a:solidFill>
+                          <a:srgbClr val="000000"/>
+                        </a:solidFill>
+                        <a:tailEnd type="triangle" w="med" len="med"/>
+                      </a:ln>
+                    </wps:spPr>
+                    <wps:bodyPr/>
+                  </wps:wsp>
+                  <wps:wsp>
+                    <wps:cNvPr id="211" name="Arrow 211"/>
+                    <wps:cNvCnPr/>
+                    <wps:spPr>
+                      <a:xfrm>
+                        <a:off x="2501900" y="2943860"/>
+                        <a:ext cx="495300" cy="0"/>
+                      </a:xfrm>
+                      <a:prstGeom prst="line">
+                        <a:avLst/>
+                      </a:prstGeom>
+                      <a:ln w="9525">
+                        <a:solidFill>
+                          <a:srgbClr val="000000"/>
+                        </a:solidFill>
+                      </a:ln>
+                    </wps:spPr>
+                    <wps:bodyPr/>
+                  </wps:wsp>
+                  <wps:wsp>
+                    <wps:cNvPr id="212" name="Arrow 212"/>
+                    <wps:cNvCnPr/>
+                    <wps:spPr>
+                      <a:xfrm flipV="1">
+                        <a:off x="2997200" y="659130"/>
+                        <a:ext cx="0" cy="2284729"/>
+                      </a:xfrm>
+                      <a:prstGeom prst="line">
+                        <a:avLst/>
+                      </a:prstGeom>
+                      <a:ln w="9525">
+                        <a:solidFill>
+                          <a:srgbClr val="000000"/>
+                        </a:solidFill>
+                      </a:ln>
+                    </wps:spPr>
+                    <wps:bodyPr/>
+                  </wps:wsp>
+                  <wps:wsp>
+                    <wps:cNvPr id="213" name="Arrow 213"/>
+                    <wps:cNvCnPr/>
+                    <wps:spPr>
+                      <a:xfrm flipH="1">
+                        <a:off x="2578100" y="659130"/>
+                        <a:ext cx="419100" cy="0"/>
+                      </a:xfrm>
+                      <a:prstGeom prst="line">
+                        <a:avLst/>
+                      </a:prstGeom>
+                      <a:ln w="9525">
+                        <a:solidFill>
+                          <a:srgbClr val="000000"/>
+                        </a:solidFill>
+                        <a:tailEnd type="triangle" w="med" len="med"/>
+                      </a:ln>
+                    </wps:spPr>
+                    <wps:bodyPr/>
+                  </wps:wsp>
+                  <wps:wsp>
+                    <wps:cNvPr id="214" name="Label 214"/>
+                    <wps:cNvSpPr txBox="1"/>
+                    <wps:spPr>
+                      <a:xfrm>
+                        <a:off x="2844800" y="1522095"/>
+                        <a:ext cx="127000" cy="558800"/>
+                      </a:xfrm>
+                      <a:prstGeom prst="rect">
+                        <a:avLst/>
+                      </a:prstGeom>
+                      <a:noFill/>
+                      <a:ln>
+                        <a:noFill/>
+                      </a:ln>
+                    </wps:spPr>
+                    <wps:txbx>
+                      <w:txbxContent>
+                        <w:p>
+                          <w:pPr>
+                            <w:jc w:val="center"/>
+                            <w:spacing w:before="0" w:after="0" w:line="240" w:lineRule="auto"/>
+                          </w:pPr>
+                          <w:r>
+                            <w:rPr>
+                              <w:rFonts w:ascii="Times New Roman" w:hAnsi="Times New Roman" w:cs="Times New Roman"/>
+                              <w:sz w:val="13"/>
+                            </w:rPr>
+                            <w:t xml:space="preserve">replan</w:t>
+                          </w:r>
+                        </w:p>
+                      </w:txbxContent>
+                    </wps:txbx>
+                    <wps:bodyPr rot="0" vert="vert270" wrap="square" lIns="0" tIns="0" rIns="0" bIns="0" anchor="ctr">
+                      <a:noAutofit/>
+                    </wps:bodyPr>
+                  </wps:wsp>
+                </wpc:wpc>
               </a:graphicData>
             </a:graphic>
           </wp:inline>
@@ -723,7 +1238,7 @@
           <w:rFonts w:ascii="Times New Roman" w:hAnsi="Times New Roman"/>
           <w:sz w:val="16"/>
         </w:rPr>
-        <w:t>Fig. 1. One planning round. Checking and choosing are the additions to TAPE; a mismatch while running sends control back to proposing.</w:t>
+        <w:t>Fig. 1. One planning round. The shaded stages are our additions to TAPE. A move that does not land where predicted sends control back to the proposer, starting from the real state.</w:t>
       </w:r>
     </w:p>
     <w:p>
@@ -738,7 +1253,7 @@
           <w:i/>
           <w:sz w:val="20"/>
         </w:rPr>
-        <w:t>B. Move Validation</w:t>
+        <w:t>B. Move validation</w:t>
       </w:r>
     </w:p>
     <w:p>
@@ -752,7 +1267,7 @@
         <w:rPr>
           <w:rFonts w:ascii="Times New Roman" w:hAnsi="Times New Roman"/>
         </w:rPr>
-        <w:t>For a move from state s to state s', a validator either rejects it or accepts it with a confidence between 0 and 1. A rejected move never becomes an edge, so any plan that contains it dies at that point. There is one validator per game.</w:t>
+        <w:t>For a move from state s to state s', a validator either rejects it or accepts it with a confidence between 0 and 1. A rejected move never becomes an edge, so any plan containing it ends there. Each game has its own validator.</w:t>
       </w:r>
     </w:p>
     <w:p>
@@ -766,7 +1281,7 @@
         <w:rPr>
           <w:rFonts w:ascii="Times New Roman" w:hAnsi="Times New Roman"/>
         </w:rPr>
-        <w:t>In Sokoban we reject a push that leaves a box in a non-goal corner, because that box can never move again, and we accept a box against a wall away from a goal at confidence 0.5. In River Crossing we reject a bank with more cannibals than missionaries while at least one missionary is still there. The step function does not enforce this on purpose, so the validator is the only place the rule lives. In Rush Hour we reject a row completely filled by horizontal vehicles that blocks the target, and accept a blocker that is itself stuck at confidence 0.5.</w:t>
+        <w:t>In Sokoban a push that leaves a box in a non-goal corner is rejected, since that box can never move again. A box against a wall away from any goal is accepted at confidence 0.5. In River Crossing a bank with more cannibals than missionaries, while a missionary is still there, is rejected. The step function allows such states on purpose, so the validator is the only place the rule lives. In Rush Hour a row completely filled by horizontal vehicles that blocks the target is rejected, and a blocker that is itself stuck is accepted at 0.5.</w:t>
       </w:r>
     </w:p>
     <w:p>
@@ -780,7 +1295,7 @@
         <w:rPr>
           <w:rFonts w:ascii="Times New Roman" w:hAnsi="Times New Roman"/>
         </w:rPr>
-        <w:t>Peg Solitaire needed more thought. A pagoda function gives each hole a weight w(p) &gt;= 0 such that w(a) + w(b) &gt;= w(c) for every jump from a over b into c. A jump takes pegs off a and b and puts one on c, so the total weight of the board never rises. If a position already weighs less than the goal (one peg in the middle), the goal cannot be reached. A small linear program yields twelve pagodas, and we recheck every inequality after solving. For the 24-puzzle a move is rejected when its result is unsolvable under the inversion-parity rule. For the cube we reject a state that breaks any of four cubie invariants: every slot holds a real cubie exactly once, corner twists sum to 0 mod 3, edge flips sum to 0 mod 2, and corner and edge permutations share parity. Legal moves never break the last two, so on these games the checker matters only when the starting position itself is unsolvable.</w:t>
+        <w:t>Peg Solitaire needed a proof tool. A pagoda function gives each hole a weight w(p) &gt;= 0 such that w(a) + w(b) &gt;= w(c) for every jump from a over b into c. A jump removes the pegs on a and b and adds one on c, so the total weight of the board cannot rise. A position already lighter than the goal, a single peg in the centre, can never reach it. A small linear program gives twelve pagodas, and we recheck every inequality after solving. For the 24-puzzle a move is rejected if its result is unsolvable by the inversion-parity rule. For the cube we reject a state that breaks one of four cubie invariants: each slot holds a real cubie once, corner twists sum to 0 mod 3, edge flips sum to 0 mod 2, and corner and edge permutations have equal parity. Legal moves never break the last two, so on these two games the checker only matters when the start itself is unsolvable.</w:t>
       </w:r>
     </w:p>
     <w:p>
@@ -795,7 +1310,7 @@
           <w:i/>
           <w:sz w:val="20"/>
         </w:rPr>
-        <w:t>C. Experience Store</w:t>
+        <w:t>C. Experience store</w:t>
       </w:r>
     </w:p>
     <w:p>
@@ -809,7 +1324,7 @@
         <w:rPr>
           <w:rFonts w:ascii="Times New Roman" w:hAnsi="Times New Roman"/>
         </w:rPr>
-        <w:t>A SQLite table counts successes s and failures f for each level, state and move. Confidence is Laplace-smoothed so that one early failure does not drop trust to zero:</w:t>
+        <w:t>A SQLite table counts successes s and failures f for each level, state and move. The count is Laplace-smoothed, so one early failure does not drive trust to zero:</w:t>
       </w:r>
     </w:p>
     <w:p>
@@ -850,7 +1365,7 @@
         <w:rPr>
           <w:rFonts w:ascii="Times New Roman" w:hAnsi="Times New Roman"/>
         </w:rPr>
-        <w:t>A move with no history starts at 1, and a single recorded failure takes it to 0.33. The result is multiplied by the validator's confidence.</w:t>
+        <w:t>A move with no history has confidence 1, and one recorded failure lowers it to 0.33. The value is multiplied by the validator's confidence.</w:t>
       </w:r>
     </w:p>
     <w:p>
@@ -865,7 +1380,7 @@
           <w:i/>
           <w:sz w:val="20"/>
         </w:rPr>
-        <w:t>D. Move Score</w:t>
+        <w:t>D. Move score</w:t>
       </w:r>
     </w:p>
     <w:p>
@@ -879,7 +1394,7 @@
         <w:rPr>
           <w:rFonts w:ascii="Times New Roman" w:hAnsi="Times New Roman"/>
         </w:rPr>
-        <w:t>CP-SAT wants integer coefficients, so every accepted move gets an integer cost scaled by ten:</w:t>
+        <w:t>CP-SAT needs integer coefficients, so each accepted move gets an integer cost scaled by ten:</w:t>
       </w:r>
     </w:p>
     <w:p>
@@ -920,7 +1435,7 @@
         <w:rPr>
           <w:rFonts w:ascii="Times New Roman" w:hAnsi="Times New Roman"/>
         </w:rPr>
-        <w:t>Here r = max(0, h(s') - h(s)) is how much the move worsens the heuristic distance, c is the confidence, and t / T is the share of the step budget already spent. The weights 1.5, 4.0 and 2.0 are our first guesses. Section V-C reports what happened when we tried to improve them.</w:t>
+        <w:t>Here r = max(0, h(s') - h(s)) is how much the move worsens the heuristic distance, c is the confidence, and t / T is the share of the step budget already used. The weights 1.5, 4.0 and 2.0 were our first guess. Section V-C describes the attempt to improve them.</w:t>
       </w:r>
     </w:p>
     <w:p>
@@ -935,7 +1450,7 @@
           <w:i/>
           <w:sz w:val="20"/>
         </w:rPr>
-        <w:t>E. Path Selection and Replanning</w:t>
+        <w:t>E. Path selection and replanning</w:t>
       </w:r>
     </w:p>
     <w:p>
@@ -949,7 +1464,7 @@
         <w:rPr>
           <w:rFonts w:ascii="Times New Roman" w:hAnsi="Times New Roman"/>
         </w:rPr>
-        <w:t>The selection rule reads the piece count. With one independent piece (one Sokoban box, or the River Crossing boat) the problem is an ordinary shortest path, so we run A* on the cost above. With several pieces whose routes can interfere we write the path as a one-unit flow and give it to CP-SAT. The chosen path is executed move by move. After a mismatch the failure goes into the store and we plan again from the real state, up to a fixed number of replans.</w:t>
+        <w:t>With one independent piece, such as one Sokoban box or the River Crossing boat, the problem is a plain shortest path and we run A* on the cost above. With several pieces whose routes can interfere, we write the path as a one-unit flow and solve it with CP-SAT. The path is executed move by move. After a mismatch the failure goes into the store and we plan again from the real state, up to a fixed number of replans.</w:t>
       </w:r>
     </w:p>
     <w:p>
@@ -985,7 +1500,7 @@
         <w:rPr>
           <w:rFonts w:ascii="Times New Roman" w:hAnsi="Times New Roman"/>
         </w:rPr>
-        <w:t>Every experiment changes one component and leaves the rest alone.</w:t>
+        <w:t>Each experiment changes one component and keeps the others fixed.</w:t>
       </w:r>
     </w:p>
     <w:p>
@@ -1014,7 +1529,7 @@
         <w:rPr>
           <w:rFonts w:ascii="Times New Roman" w:hAnsi="Times New Roman"/>
         </w:rPr>
-        <w:t>Sokoban has four hand-made levels with one to three boxes; the hardest has a 29-move optimum. River Crossing has three missionary and cannibal pairs and a two-seat boat, with an 11-move optimum. Rush Hour is a six-by-six board solved in six moves. From Boxoban [16] we take one file for each difficulty (unfiltered, medium, hard), which is 1,000 ten-by-ten levels with four boxes each. Peg Solitaire is the English board with about 3.6 million reachable positions. The 24-puzzle has about 7.8 x 10^24 states and the 3x3x3 cube about 4.3 x 10^19.</w:t>
+        <w:t>Sokoban has four hand-made levels with one to three boxes; the hardest has a 29-move optimum. River Crossing has three missionary and cannibal pairs and a two-seat boat, with an 11-move optimum. Rush Hour is a six-by-six board solved in six moves. From Boxoban [16] we take one file for each of its three difficulty sets (unfiltered, medium, hard), each holding 1,000 ten-by-ten levels with four boxes. Peg Solitaire is the English board with about 3.6 million reachable positions. The 24-puzzle has about 7.8 x 10^24 states and the 3x3x3 cube about 4.3 x 10^19.</w:t>
       </w:r>
     </w:p>
     <w:p>
@@ -1029,7 +1544,7 @@
           <w:i/>
           <w:sz w:val="20"/>
         </w:rPr>
-        <w:t>B. Plan Proposers</w:t>
+        <w:t>B. Plan proposers</w:t>
       </w:r>
     </w:p>
     <w:p>
@@ -1043,7 +1558,7 @@
         <w:rPr>
           <w:rFonts w:ascii="Times New Roman" w:hAnsi="Times New Roman"/>
         </w:rPr>
-        <w:t>Our first proposer hid one shortest plan, found by BFS, among noisy walks. On River Crossing that plan has nine moves and passes through unsafe states, because the step function allows them. We therefore let the hidden plan consult the validator, and it becomes the textbook 11-move answer. An adversarial proposer returns uniformly random moves. A quality proposer either mixes guided and random walks, or takes an optimal plan and randomizes each step with a set probability. For Boxoban, Peg Solitaire and the 24-puzzle we use weighted A* under a node budget. For the cube we use a search that grows from the start and from the solved cube until the two meet. Section V-G adds plain BFS and DFS.</w:t>
+        <w:t>Our first proposer hid a BFS shortest plan among noisy walks. On River Crossing that plan has nine moves and passes through unsafe states, because the step function allows them, so we made the hidden plan consult the validator. It then becomes the textbook 11-move answer. The adversarial proposer returns uniformly random moves. A quality proposer either mixes guided and random walks, or takes an optimal plan and randomizes each step with a set probability. Boxoban, Peg Solitaire and the 24-puzzle use weighted A* under a node budget, and the cube uses a search that grows from both the start and the solved cube until the two meet. Section V-G adds plain BFS and DFS.</w:t>
       </w:r>
     </w:p>
     <w:p>
@@ -1058,7 +1573,7 @@
           <w:i/>
           <w:sz w:val="20"/>
         </w:rPr>
-        <w:t>C. Metrics and Statistics</w:t>
+        <w:t>C. Metrics and statistics</w:t>
       </w:r>
     </w:p>
     <w:p>
@@ -1072,7 +1587,7 @@
         <w:rPr>
           <w:rFonts w:ascii="Times New Roman" w:hAnsi="Times New Roman"/>
         </w:rPr>
-        <w:t>An episode is a safe success if it reaches the goal and an independent auditor, which applies the game's rules whatever the tested configuration did, rejects none of the executed moves. Plain success would give River Crossing's baseline 100% while it breaks the rule in every episode. We also report replans per episode, planning time and, for Boxoban, the share of levels solved within a node budget. Proportions carry 95% Wilson intervals. Paired comparisons use identical hazards and seeds in both arms and report the mean difference with its standard error. The weight search was fitted on training seeds and then checked on seeds it had never seen.</w:t>
+        <w:t>An episode counts as a safe success when it reaches the goal and an independent auditor rejects none of the executed moves. The auditor applies the game's rules whatever configuration is being tested. Plain success would give River Crossing's baseline 100% although it breaks the rule in every episode. We also record replans per episode, planning time and, for Boxoban, the share of levels solved within a node budget. Proportions carry 95% Wilson intervals. Paired comparisons use identical hazards and seeds in both arms and give the mean difference with its standard error. The weight search was fitted on training seeds and then judged on seeds it had not seen.</w:t>
       </w:r>
     </w:p>
     <w:p>
@@ -1095,20 +1610,6 @@
           <w:sz w:val="20"/>
         </w:rPr>
         <w:t>Results and Discussion</w:t>
-      </w:r>
-    </w:p>
-    <w:p>
-      <w:pPr>
-        <w:keepNext w:val="0"/>
-        <w:spacing w:before="0" w:after="0"/>
-        <w:ind w:firstLine="288"/>
-        <w:jc w:val="both"/>
-      </w:pPr>
-      <w:r>
-        <w:rPr>
-          <w:rFonts w:ascii="Times New Roman" w:hAnsi="Times New Roman"/>
-        </w:rPr>
-        <w:t>Table I gathers the headline numbers. The subsections give the experiment behind each row, and they include the places where an addition did nothing.</w:t>
       </w:r>
     </w:p>
     <w:p>
@@ -1717,7 +2218,7 @@
           <w:i/>
           <w:sz w:val="20"/>
         </w:rPr>
-        <w:t>A. Safety and Speed</w:t>
+        <w:t>A. Safety and speed</w:t>
       </w:r>
     </w:p>
     <w:p>
@@ -1731,7 +2232,7 @@
         <w:rPr>
           <w:rFonts w:ascii="Times New Roman" w:hAnsi="Times New Roman"/>
         </w:rPr>
-        <w:t>Five configurations ran on six benchmarks, 30 episodes per cell, with a 15% slip probability and the goal-biased proposer: baseline, validator only, validator plus store, adaptive selection only, and everything together. The baseline reaches the River Crossing goal in every episode and never does so safely. With the validator the safe rate is 100% and the raw rate does not move. Adaptive selection saves time where one piece moves and does nothing elsewhere (Table II), with identical success and action counts. Hard Sokoban sat at about 53% in all five configurations.</w:t>
+        <w:t>Table I lists the headline numbers. The first experiment ran five configurations on six benchmarks, 30 episodes per cell, with a 15% slip probability and the goal-biased proposer. The configurations were the baseline, validator only, validator plus store, adaptive selection only, and everything together. The baseline reaches the River Crossing goal every time and never does so safely. With the validator, safe success is 100% and raw success is unchanged. Adaptive selection saves time only where one piece moves (Table II), and leaves success and action counts identical. Hard Sokoban stayed near 53% in all five configurations.</w:t>
       </w:r>
     </w:p>
     <w:p>
@@ -2186,7 +2687,7 @@
           <w:i/>
           <w:sz w:val="20"/>
         </w:rPr>
-        <w:t>B. Experience Store Under State-Dependent Failure</w:t>
+        <w:t>B. Experience store under state-dependent failure</w:t>
       </w:r>
     </w:p>
     <w:p>
@@ -2200,7 +2701,7 @@
         <w:rPr>
           <w:rFonts w:ascii="Times New Roman" w:hAnsi="Times New Roman"/>
         </w:rPr>
-        <w:t>With uniform random slips the store has nothing to learn, and it changed nothing. So we made 25% of state and move pairs slip with probability 0.7 and compared validator only against validator plus store, paired over 20 hazard seeds of 30 episodes each (Table III). Late-episode replans fell by about 14% on one-box Sokoban and River Crossing. Rush Hour did not separate from zero, and two-box Sokoban showed no difference. We did not test why. Our guess is that two-box levels offer many routes while the 30 candidate plans rarely include a detour around a learned hazard, and the store can only reweight edges that already exist.</w:t>
+        <w:t>Under uniform random slips the store has nothing to learn, and it changed nothing. We then made 25% of the state and move pairs slip with probability 0.7, and compared validator only with validator plus store over 20 hazard seeds of 30 episodes each (Table III). Late-episode replans fell by about 14% on one-box Sokoban and River Crossing. Rush Hour did not separate from zero and two-box Sokoban did not change. We did not investigate why. Two-box levels have many routes and the 30 candidate plans may rarely contain a detour around a learned hazard, but we have not checked that. The store can only reweight edges already in the graph.</w:t>
       </w:r>
     </w:p>
     <w:p>
@@ -2655,7 +3156,7 @@
           <w:i/>
           <w:sz w:val="20"/>
         </w:rPr>
-        <w:t>C. Tuning the Score Weights</w:t>
+        <w:t>C. Tuning the score weights</w:t>
       </w:r>
     </w:p>
     <w:p>
@@ -2669,7 +3170,7 @@
         <w:rPr>
           <w:rFonts w:ascii="Times New Roman" w:hAnsi="Times New Roman"/>
         </w:rPr>
-        <w:t>This was the experiment we expected to win. We searched 80 combinations of the three penalty weights on 8 training seeds, then reran the top three and our defaults on 16 unseen seeds. The objective was replans plus three times the failure rate, averaged over four benchmarks. The best training point scored 3.906 against 4.219 for the defaults, which had ranked 23rd of 80. On the unseen seeds that same point was worse than the defaults by 0.122 +/- 0.111. Nothing beat the defaults by more than one standard error, so we kept them. All this tells us is that the search found nothing better; it does not make the defaults optimal.</w:t>
+        <w:t>We expected this to help. A search over 80 combinations of the three penalty weights on 8 training seeds found a best point scoring 3.906, against 4.219 for our defaults, which ranked 23rd. The objective was replans plus three times the failure rate, averaged over four benchmarks. We reran the top three and the defaults on 16 unseen seeds. The best training point came out worse than the defaults by 0.122 +/- 0.111, and nothing beat them by more than one standard error. We kept the defaults. This says the search found nothing better, and does not make them optimal.</w:t>
       </w:r>
     </w:p>
     <w:p>
@@ -2684,7 +3185,7 @@
           <w:i/>
           <w:sz w:val="20"/>
         </w:rPr>
-        <w:t>D. Proposer Quality</w:t>
+        <w:t>D. Proposer quality</w:t>
       </w:r>
     </w:p>
     <w:p>
@@ -2698,7 +3199,7 @@
         <w:rPr>
           <w:rFonts w:ascii="Times New Roman" w:hAnsi="Times New Roman"/>
         </w:rPr>
-        <w:t>Next we varied the proposer. One built only from random and guided walks barely solved the easiest non-trivial level (17% at best), so it told us little. With a proposer that corrupts an optimal plan, the full layer and the baseline differed by less than two standard errors on nearly every Sokoban and Rush Hour comparison. River Crossing stayed at 0% safe success in both arms, because this proposer never learns the safety rule and its best plan is the unsafe one, which the validator rightly rejects. What the validator did buy was 2.7 to 3.4 fewer replans per episode at quality 0.7 and above. It can remove bad plans. It cannot invent a good one the proposer never made.</w:t>
+        <w:t>The proposer built only from random and guided walks barely solved the easiest non-trivial level, 17% at best, so it taught us little. A proposer that corrupts an optimal plan was more useful. With it, the full layer and the baseline differed by less than two standard errors on almost every Sokoban and Rush Hour comparison. River Crossing stayed at 0% safe success in both arms, because this proposer never learns the safety rule and its best plan is the unsafe one, which the validator correctly rejects. The validator did remove 2.7 to 3.4 replans per episode at quality 0.7 and above. It discards bad plans but cannot supply a good one the proposer never produced.</w:t>
       </w:r>
     </w:p>
     <w:p>
@@ -2727,7 +3228,7 @@
         <w:rPr>
           <w:rFonts w:ascii="Times New Roman" w:hAnsi="Times New Roman"/>
         </w:rPr>
-        <w:t>A level counts as solved if any of four searches finds a plan inside the node budget. Without pruning the search knows nothing about dead corners; with the checker it skips them (Fig. 2, Table IV). The checker came out ahead in all 15 combinations of set and budget with non-overlapping 95% intervals, and it never missed a level that the unpruned search solved. The gap widens with difficulty. At 10,000 nodes it is 8, 19 and 22 points on the three sets, and at 30,000 nodes 3, 17 and 28. At the full budget the checker also expands 20%, 25% and 23% fewer nodes per level. Merging plans did not shorten paths in practice: out of 2,680 solved levels it beat the best single plan on one and lost to it on 33, because the solver minimizes the cost in Eq. (2) and not the number of moves.</w:t>
+        <w:t>A level counts as solved if any of four searches finds a plan within the node budget. Without pruning the search knows nothing about dead corners. With the checker it skips them (Fig. 2, Table IV). The checker was ahead in all 15 combinations of set and budget, with non-overlapping 95% intervals, and never lost a level the unpruned search solved. The gap grows with difficulty. At 10,000 nodes it is 8, 19 and 22 points on the three sets, and at 30,000 nodes it is 3, 17 and 28. At the full budget the checker expands 20%, 25% and 23% fewer nodes per level. Merging plans did not shorten paths. Of 2,680 solved levels the merged path beat the best single plan on one and lost to it on 33, since the solver minimizes the cost in Eq. (2) and not the number of moves.</w:t>
       </w:r>
     </w:p>
     <w:p>
@@ -2740,7 +3241,7 @@
         <w:drawing>
           <wp:inline xmlns:a="http://schemas.openxmlformats.org/drawingml/2006/main" xmlns:pic="http://schemas.openxmlformats.org/drawingml/2006/picture">
             <wp:extent cx="3048000" cy="2320119"/>
-            <wp:docPr id="2" name="Picture 2"/>
+            <wp:docPr id="215" name="Picture 215"/>
             <wp:cNvGraphicFramePr>
               <a:graphicFrameLocks noChangeAspect="1"/>
             </wp:cNvGraphicFramePr>
@@ -2752,7 +3253,7 @@
                     <pic:cNvPicPr/>
                   </pic:nvPicPr>
                   <pic:blipFill>
-                    <a:blip r:embed="rId14"/>
+                    <a:blip r:embed="rId13"/>
                     <a:stretch>
                       <a:fillRect/>
                     </a:stretch>
@@ -2782,7 +3283,7 @@
           <w:rFonts w:ascii="Times New Roman" w:hAnsi="Times New Roman"/>
           <w:sz w:val="16"/>
         </w:rPr>
-        <w:t>Fig. 2. Boxoban levels solved out of 1,000 against the node budget, with the corner checker (solid) and without pruning (dashed).</w:t>
+        <w:t>Fig. 2. Boxoban levels solved out of 1,000 against the node budget, with the corner checker (solid lines) and without pruning (dashed).</w:t>
       </w:r>
     </w:p>
     <w:p>
@@ -3466,7 +3967,7 @@
           <w:i/>
           <w:sz w:val="20"/>
         </w:rPr>
-        <w:t>F. Harder Games</w:t>
+        <w:t>F. Harder games</w:t>
       </w:r>
     </w:p>
     <w:p>
@@ -3480,7 +3981,7 @@
         <w:rPr>
           <w:rFonts w:ascii="Times New Roman" w:hAnsi="Times New Roman"/>
         </w:rPr>
-        <w:t>Peg Solitaire is the one game where the checker helps during play. To test soundness we sampled positions that the pagoda checker rejects and tried to prove each unsolvable by exhaustive search; none turned out solvable. From the real start the checker cuts the search from 139,048 to 82,009 nodes, a 41% saving. Our first benchmark used positions reached by random play. Most were out of reach within the budget, the search could not say whether they were lost, and nothing separated. We rebuilt it by playing jumps backwards from the goal, which guarantees that each position is solvable. Within 60,000 nodes the checker solves 98% of positions 22 jumps out against 93% without it, and 75% against 58% at 26 jumps, using 19 to 31% fewer nodes. It never lost a position that the plain search solved (Fig. 3, Table V).</w:t>
+        <w:t>Peg Solitaire is the one game where the checker helps during play. To test soundness we took positions the pagoda checker rejects and tried to prove each one unsolvable by exhaustive search. None was solvable. From the real start position the checker cut the search from 139,048 to 82,009 nodes, 41% fewer. Our first benchmark used positions reached by random play, and it failed. Most positions were out of reach inside the budget, the search could not say whether they were lost, and the two arms looked identical. We rebuilt the set by playing jumps backwards from the goal, which guarantees every position is solvable. Within 60,000 nodes the checker then solved 98% of positions 22 jumps out against 93% without it, and 75% against 58% at 26 jumps, with 19 to 31% fewer nodes (Fig. 3, Table V). It never lost a position the plain search solved.</w:t>
       </w:r>
     </w:p>
     <w:p>
@@ -3493,7 +3994,7 @@
         <w:drawing>
           <wp:inline xmlns:a="http://schemas.openxmlformats.org/drawingml/2006/main" xmlns:pic="http://schemas.openxmlformats.org/drawingml/2006/picture">
             <wp:extent cx="3048000" cy="2729552"/>
-            <wp:docPr id="3" name="Picture 3"/>
+            <wp:docPr id="216" name="Picture 216"/>
             <wp:cNvGraphicFramePr>
               <a:graphicFrameLocks noChangeAspect="1"/>
             </wp:cNvGraphicFramePr>
@@ -3505,7 +4006,7 @@
                     <pic:cNvPicPr/>
                   </pic:nvPicPr>
                   <pic:blipFill>
-                    <a:blip r:embed="rId15"/>
+                    <a:blip r:embed="rId14"/>
                     <a:stretch>
                       <a:fillRect/>
                     </a:stretch>
@@ -3535,7 +4036,7 @@
           <w:rFonts w:ascii="Times New Roman" w:hAnsi="Times New Roman"/>
           <w:sz w:val="16"/>
         </w:rPr>
-        <w:t>Fig. 3. Peg Solitaire on positions built backwards from the goal: share solved (top) and mean nodes per search on a log scale (bottom).</w:t>
+        <w:t>Fig. 3. Peg Solitaire on positions built backwards from the goal. Top, share solved. Bottom, mean nodes per search on a log scale.</w:t>
       </w:r>
     </w:p>
     <w:p>
@@ -4116,7 +4617,7 @@
         <w:rPr>
           <w:rFonts w:ascii="Times New Roman" w:hAnsi="Times New Roman"/>
         </w:rPr>
-        <w:t>The 24-puzzle and the cube behave differently. Legal moves never break the parity rule or the cubie invariants, and we confirmed that the checks change no result on a solvable start. They matter when the input itself is unsolvable. With two tiles swapped, or one cube corner twisted, the plain search burned its whole budget (60,000 and 400,000 nodes) and the check stopped it after at most one. Weighted A* solved random-walk scrambles of the 24-puzzle at 100%, 95%, 73% and 57% for 20, 40, 60 and 80 moves, and meet in the middle solved every cube scramble of 4 to 8 moves.</w:t>
+        <w:t>The 24-puzzle and the cube behave differently. Legal moves never break the parity rule or the cubie invariants, and the checks changed no result on a solvable start. They matter only when the input itself is unsolvable. With two tiles swapped, or one cube corner twisted, the plain search spent its entire budget (60,000 and 400,000 nodes) and the check stopped it after at most one. Weighted A* solved random-walk scrambles of the 24-puzzle at 100%, 95%, 73% and 57% for 20, 40, 60 and 80 moves, and meet in the middle solved every cube scramble of 4 to 8 moves.</w:t>
       </w:r>
     </w:p>
     <w:p>
@@ -4131,7 +4632,7 @@
           <w:i/>
           <w:sz w:val="20"/>
         </w:rPr>
-        <w:t>G. Search Methods</w:t>
+        <w:t>G. Search methods</w:t>
       </w:r>
     </w:p>
     <w:p>
@@ -4145,7 +4646,7 @@
         <w:rPr>
           <w:rFonts w:ascii="Times New Roman" w:hAnsi="Times New Roman"/>
         </w:rPr>
-        <w:t>BFS, DFS, weighted A* and meet in the middle ran on every game each can handle, without checkers, at 100,000 nodes. The small games have one instance each and the rest have 20 (Table VI, Fig. 4).</w:t>
+        <w:t>We ran BFS, DFS, weighted A* and meet in the middle on every game each can handle, without checkers, at 100,000 nodes. The small games have one instance each and the others have 20 (Table VI, Fig. 4).</w:t>
       </w:r>
     </w:p>
     <w:p>
@@ -5614,7 +6115,7 @@
         <w:drawing>
           <wp:inline xmlns:a="http://schemas.openxmlformats.org/drawingml/2006/main" xmlns:pic="http://schemas.openxmlformats.org/drawingml/2006/picture">
             <wp:extent cx="3048000" cy="3366448"/>
-            <wp:docPr id="4" name="Picture 4"/>
+            <wp:docPr id="217" name="Picture 217"/>
             <wp:cNvGraphicFramePr>
               <a:graphicFrameLocks noChangeAspect="1"/>
             </wp:cNvGraphicFramePr>
@@ -5626,7 +6127,7 @@
                     <pic:cNvPicPr/>
                   </pic:nvPicPr>
                   <pic:blipFill>
-                    <a:blip r:embed="rId16"/>
+                    <a:blip r:embed="rId15"/>
                     <a:stretch>
                       <a:fillRect/>
                     </a:stretch>
@@ -5670,7 +6171,7 @@
         <w:rPr>
           <w:rFonts w:ascii="Times New Roman" w:hAnsi="Times New Roman"/>
         </w:rPr>
-        <w:t>DFS won one game, and by a wide margin. Every Peg Solitaire solution has exactly 31 jumps, so a depth-first search that never revisits a state gives up nothing. From the real start it needed 10,845 nodes, or 6,455 with the pagoda checker. Weighted A* needed 139,048 and BFS found no plan in 400,000. On a position that weighted A* could not solve in 20,000 nodes, DFS needed about 10,800. On positions 22 jumps from the goal the order flipped slightly, with weighted A* at 95% and DFS at 85%. BFS was enough only for River Crossing and Rush Hour, where it also returns the shortest plan. Weighted A* is the best all-round choice, although DFS plans on Boxoban ran about 2.5 times longer than its plans. Meet in the middle guarantees a shortest plan, yet on short cube scrambles it used more nodes than A* with our sticker-count heuristic, and it ran out of budget on the 40-move 24-puzzle.</w:t>
+        <w:t>DFS won one game by a wide margin. Every Peg Solitaire solution has exactly 31 jumps, so a depth-first search that never revisits a state loses nothing. From the real start it needed 10,845 nodes, or 6,455 with the pagoda checker. Weighted A* needed 139,048, and BFS found no plan in 400,000. On one position that weighted A* could not solve in 20,000 nodes, DFS needed about 10,800. The order reversed on positions 22 jumps from the goal, where weighted A* solved 95% and DFS 85%. BFS was enough only for River Crossing and Rush Hour, where it also returns the shortest plan. Weighted A* was the best general choice, though DFS plans on Boxoban came out about 2.5 times longer. Meet in the middle guarantees a shortest plan, but on short cube scrambles it used more nodes than A* with our sticker-count heuristic, and on the 40-move 24-puzzle it ran out of budget.</w:t>
       </w:r>
     </w:p>
     <w:p>
@@ -5684,7 +6185,7 @@
         <w:rPr>
           <w:rFonts w:ascii="Times New Roman" w:hAnsi="Times New Roman"/>
         </w:rPr>
-        <w:t>We did not implement AO*. It plans over graphs where an action has several possible outcomes, and all our games are deterministic, so there are no AND nodes and it collapses into A*. It could matter for the slip model, where a move sometimes leaves the state unchanged. That outcome loops back to the same state, which is the case LAO* [24] was built for. One caution on the table: node counts mean expansions for BFS, DFS and A*, but generated states for meet in the middle, so the last column is only roughly comparable.</w:t>
+        <w:t>We did not implement AO*. It plans over actions with several outcomes, our games are deterministic, and without AND nodes it reduces to A*. It could matter for the slip model, where a move sometimes leaves the state unchanged. That outcome loops back to the same state, which is what LAO* [24] was designed for. One caution on the table: node counts are expansions for BFS, DFS and A*, but generated states for meet in the middle, so that column compares only roughly.</w:t>
       </w:r>
     </w:p>
     <w:p>
@@ -5699,7 +6200,7 @@
           <w:i/>
           <w:sz w:val="20"/>
         </w:rPr>
-        <w:t>H. Reading the Results Together</w:t>
+        <w:t>H. Limitations</w:t>
       </w:r>
     </w:p>
     <w:p>
@@ -5713,36 +6214,7 @@
         <w:rPr>
           <w:rFonts w:ascii="Times New Roman" w:hAnsi="Times New Roman"/>
         </w:rPr>
-        <w:t>The checker earns its place in two situations. One is when the environment accepts moves that the rules forbid, as in River Crossing. The other is when pruning saves a search from dead branches, as in Boxoban and Peg Solitaire. It does little when the proposer already finds good plans, and it cannot make a plan the proposer lacks. Adaptive selection is a small saving that depends only on piece count. The store pays off when failures depend on the state and the candidates include a detour. For search, depth-first is the pick when every solution has the same length, meet in the middle when only the shortest plan will do and moves can be undone, and weighted A* the rest of the time.</w:t>
-      </w:r>
-    </w:p>
-    <w:p>
-      <w:pPr>
-        <w:keepNext/>
-        <w:spacing w:before="160" w:after="80"/>
-        <w:jc w:val="left"/>
-      </w:pPr>
-      <w:r>
-        <w:rPr>
-          <w:rFonts w:ascii="Times New Roman" w:hAnsi="Times New Roman"/>
-          <w:i/>
-          <w:sz w:val="20"/>
-        </w:rPr>
-        <w:t>I. Limitations</w:t>
-      </w:r>
-    </w:p>
-    <w:p>
-      <w:pPr>
-        <w:keepNext w:val="0"/>
-        <w:spacing w:before="0" w:after="0"/>
-        <w:ind w:firstLine="288"/>
-        <w:jc w:val="both"/>
-      </w:pPr>
-      <w:r>
-        <w:rPr>
-          <w:rFonts w:ascii="Times New Roman" w:hAnsi="Times New Roman"/>
-        </w:rPr>
-        <w:t>Our proposers are programs, and we never tried a language model, so we say nothing about how real model errors would behave. The goal-biased proposer hides a BFS plan, which makes the absolute success rates in Sections V-A and V-B higher than a real proposer would give; the paired differences suffer less. Dead-corner pruning is standard in Sokoban solvers, so Section V-E shows only that our validator works as that pruner on outside levels. Boxoban coverage is one file per set and one rule. The scrambles for the harder games are random walks, which are easier than uniformly random instances, and we tested the cube only up to 8 moves. We cannot compare against TAPE's own numbers because its benchmarks need a language model. The weight search used 8 training seeds, so its ranking is noisy. The small games in the search comparison have a single instance. And weighted A* returns plans that are not optimal, so a lower node count can come with a longer plan.</w:t>
+        <w:t>We never tried a language model, so we say nothing about how real model errors behave. The goal-biased proposer hides a BFS plan, which pushes the absolute success rates in Sections V-A and V-B above what a real proposer would reach; the paired differences are less affected. Dead-corner pruning is standard in Sokoban solvers, so Section V-E shows only that our validator works as that pruner on levels we did not write. Boxoban coverage is one file per set and one rule. Our harder-game scrambles are random walks, which are easier than uniformly random instances, and we tested the cube only up to 8 moves. TAPE's own numbers cannot be reproduced without a language model, so we make no direct comparison with it. The weight search used 8 training seeds, which makes its ranking noisy, and the small games in the search comparison have one instance. Weighted A* does not return optimal plans, so a lower node count may come with a longer plan.</w:t>
       </w:r>
     </w:p>
     <w:p>
@@ -5778,7 +6250,7 @@
         <w:rPr>
           <w:rFonts w:ascii="Times New Roman" w:hAnsi="Times New Roman"/>
         </w:rPr>
-        <w:t>The experiment we most want is a learned proposer. We would train a policy by imitation on the Boxoban solutions we already have and check whether checker pruning still saves nodes when the proposals contain realistic mistakes. A second Sokoban rule, such as frozen boxes, would show whether the Boxoban gain grows as rules are added; the measure would be levels solved at 10,000 nodes. The slip model could be planned for in advance with LAO*, compared on expected replans against our replan-on-mismatch scheme. We would also write a soundness argument for every validator, as we did informally for the pagoda bound, and add a standard classical planner as a harder baseline than plain A*.</w:t>
+        <w:t>The test we most want is a learned proposer. We would train a policy by imitation on the Boxoban solutions we already have, then see whether checker pruning still saves nodes when the proposals contain realistic mistakes. A second Sokoban rule such as frozen boxes would show whether the Boxoban gain keeps growing as rules are added, measured as levels solved at 10,000 nodes. The slip model could be handled with LAO* and compared with replan-on-mismatch on expected replans. Each validator also needs a soundness argument like the one we gave informally for the pagoda bound.</w:t>
       </w:r>
     </w:p>
     <w:p>
@@ -5814,7 +6286,7 @@
         <w:rPr>
           <w:rFonts w:ascii="Times New Roman" w:hAnsi="Times New Roman"/>
         </w:rPr>
-        <w:t>On these seven games the layer mostly pays by preventing things. It stops rule-breaking plans in River Crossing, wastes less search on dead branches in Boxoban and Peg Solitaire, and spends less solver time on single-piece problems. It did not raise the goal-reach rate of a proposer that already finds good plans, and two ideas we expected to help, weight tuning and plan merging, did nothing we could measure. For Peg Solitaire the better move was to change the search itself: depth-first search with the pagoda checker solved the real start in 6,455 nodes, where plain weighted A* needed 139,048.</w:t>
+        <w:t>The checker paid off where the environment permitted illegal moves, or where pruning stopped a search from exploring dead branches: River Crossing, Boxoban and Peg Solitaire. It made no difference on proposers that already produced good plans. Choosing the solver by piece count saved time only on single-piece problems. Weight tuning and plan merging, both of which we expected to help, did not. The largest single gain on Peg Solitaire came from changing the search, not the checker: depth-first search with the pagoda checker solved the real start in 6,455 nodes, where weighted A* needed 139,048. The next step is to test all of this with a proposer that makes realistic mistakes.</w:t>
       </w:r>
     </w:p>
     <w:p>

</xml_diff>